<commit_message>
add all Diagram in report
</commit_message>
<xml_diff>
--- a/Report/Final Report.docx
+++ b/Report/Final Report.docx
@@ -171,12 +171,6 @@
             <w:insideH w:val="single" w:color="000000" w:sz="4" w:space="0"/>
             <w:insideV w:val="single" w:color="000000" w:sz="4" w:space="0"/>
           </w:tblBorders>
-          <w:tblCellMar>
-            <w:top w:w="0" w:type="dxa"/>
-            <w:left w:w="108" w:type="dxa"/>
-            <w:bottom w:w="0" w:type="dxa"/>
-            <w:right w:w="108" w:type="dxa"/>
-          </w:tblCellMar>
         </w:tblPrEx>
         <w:trPr>
           <w:trHeight w:val="32" w:hRule="atLeast"/>
@@ -328,12 +322,6 @@
             <w:insideH w:val="single" w:color="000000" w:sz="4" w:space="0"/>
             <w:insideV w:val="single" w:color="000000" w:sz="4" w:space="0"/>
           </w:tblBorders>
-          <w:tblCellMar>
-            <w:top w:w="0" w:type="dxa"/>
-            <w:left w:w="108" w:type="dxa"/>
-            <w:bottom w:w="0" w:type="dxa"/>
-            <w:right w:w="108" w:type="dxa"/>
-          </w:tblCellMar>
         </w:tblPrEx>
         <w:trPr>
           <w:trHeight w:val="32" w:hRule="atLeast"/>
@@ -1536,7 +1524,7 @@
     </w:p>
     <w:p>
       <w:pPr>
-        <w:pStyle w:val="189"/>
+        <w:pStyle w:val="190"/>
         <w:numPr>
           <w:ilvl w:val="0"/>
           <w:numId w:val="1"/>
@@ -1572,7 +1560,7 @@
     </w:p>
     <w:p>
       <w:pPr>
-        <w:pStyle w:val="189"/>
+        <w:pStyle w:val="190"/>
         <w:numPr>
           <w:ilvl w:val="0"/>
           <w:numId w:val="1"/>
@@ -1610,7 +1598,7 @@
     </w:p>
     <w:p>
       <w:pPr>
-        <w:pStyle w:val="189"/>
+        <w:pStyle w:val="190"/>
         <w:numPr>
           <w:ilvl w:val="0"/>
           <w:numId w:val="1"/>
@@ -1639,7 +1627,7 @@
     </w:p>
     <w:p>
       <w:pPr>
-        <w:pStyle w:val="189"/>
+        <w:pStyle w:val="190"/>
         <w:numPr>
           <w:ilvl w:val="0"/>
           <w:numId w:val="1"/>
@@ -1668,7 +1656,7 @@
     </w:p>
     <w:p>
       <w:pPr>
-        <w:pStyle w:val="189"/>
+        <w:pStyle w:val="190"/>
         <w:numPr>
           <w:ilvl w:val="0"/>
           <w:numId w:val="1"/>
@@ -1770,7 +1758,7 @@
     </w:p>
     <w:p>
       <w:pPr>
-        <w:pStyle w:val="189"/>
+        <w:pStyle w:val="190"/>
         <w:numPr>
           <w:ilvl w:val="0"/>
           <w:numId w:val="2"/>
@@ -1798,7 +1786,7 @@
     </w:p>
     <w:p>
       <w:pPr>
-        <w:pStyle w:val="189"/>
+        <w:pStyle w:val="190"/>
         <w:numPr>
           <w:ilvl w:val="0"/>
           <w:numId w:val="2"/>
@@ -1826,7 +1814,7 @@
     </w:p>
     <w:p>
       <w:pPr>
-        <w:pStyle w:val="189"/>
+        <w:pStyle w:val="190"/>
         <w:numPr>
           <w:ilvl w:val="0"/>
           <w:numId w:val="2"/>
@@ -1880,7 +1868,7 @@
     </w:p>
     <w:tbl>
       <w:tblPr>
-        <w:tblStyle w:val="25"/>
+        <w:tblStyle w:val="26"/>
         <w:tblW w:w="0" w:type="auto"/>
         <w:tblInd w:w="686" w:type="dxa"/>
         <w:tblBorders>
@@ -1916,12 +1904,6 @@
             <w:insideV w:val="none" w:color="000000" w:sz="4" w:space="0"/>
           </w:tblBorders>
           <w:shd w:val="clear" w:color="FFFFFF" w:fill="FFFFFF"/>
-          <w:tblCellMar>
-            <w:top w:w="0" w:type="dxa"/>
-            <w:left w:w="108" w:type="dxa"/>
-            <w:bottom w:w="0" w:type="dxa"/>
-            <w:right w:w="108" w:type="dxa"/>
-          </w:tblCellMar>
         </w:tblPrEx>
         <w:tc>
           <w:tcPr>
@@ -2189,12 +2171,6 @@
             <w:insideH w:val="none" w:color="000000" w:sz="4" w:space="0"/>
             <w:insideV w:val="none" w:color="000000" w:sz="4" w:space="0"/>
           </w:tblBorders>
-          <w:tblCellMar>
-            <w:top w:w="0" w:type="dxa"/>
-            <w:left w:w="108" w:type="dxa"/>
-            <w:bottom w:w="0" w:type="dxa"/>
-            <w:right w:w="108" w:type="dxa"/>
-          </w:tblCellMar>
         </w:tblPrEx>
         <w:tc>
           <w:tcPr>
@@ -2327,12 +2303,6 @@
             <w:insideH w:val="none" w:color="000000" w:sz="4" w:space="0"/>
             <w:insideV w:val="none" w:color="000000" w:sz="4" w:space="0"/>
           </w:tblBorders>
-          <w:tblCellMar>
-            <w:top w:w="0" w:type="dxa"/>
-            <w:left w:w="108" w:type="dxa"/>
-            <w:bottom w:w="0" w:type="dxa"/>
-            <w:right w:w="108" w:type="dxa"/>
-          </w:tblCellMar>
         </w:tblPrEx>
         <w:tc>
           <w:tcPr>
@@ -2465,12 +2435,6 @@
             <w:insideH w:val="none" w:color="000000" w:sz="4" w:space="0"/>
             <w:insideV w:val="none" w:color="000000" w:sz="4" w:space="0"/>
           </w:tblBorders>
-          <w:tblCellMar>
-            <w:top w:w="0" w:type="dxa"/>
-            <w:left w:w="108" w:type="dxa"/>
-            <w:bottom w:w="0" w:type="dxa"/>
-            <w:right w:w="108" w:type="dxa"/>
-          </w:tblCellMar>
         </w:tblPrEx>
         <w:tc>
           <w:tcPr>
@@ -2727,7 +2691,7 @@
     </w:p>
     <w:p>
       <w:pPr>
-        <w:pStyle w:val="189"/>
+        <w:pStyle w:val="190"/>
         <w:numPr>
           <w:ilvl w:val="0"/>
           <w:numId w:val="3"/>
@@ -2756,7 +2720,7 @@
     </w:p>
     <w:p>
       <w:pPr>
-        <w:pStyle w:val="189"/>
+        <w:pStyle w:val="190"/>
         <w:numPr>
           <w:ilvl w:val="0"/>
           <w:numId w:val="4"/>
@@ -2785,7 +2749,7 @@
     </w:p>
     <w:p>
       <w:pPr>
-        <w:pStyle w:val="189"/>
+        <w:pStyle w:val="190"/>
         <w:numPr>
           <w:ilvl w:val="0"/>
           <w:numId w:val="4"/>
@@ -2814,7 +2778,7 @@
     </w:p>
     <w:p>
       <w:pPr>
-        <w:pStyle w:val="189"/>
+        <w:pStyle w:val="190"/>
         <w:numPr>
           <w:ilvl w:val="0"/>
           <w:numId w:val="4"/>
@@ -2867,7 +2831,7 @@
     </w:p>
     <w:p>
       <w:pPr>
-        <w:pStyle w:val="189"/>
+        <w:pStyle w:val="190"/>
         <w:numPr>
           <w:ilvl w:val="0"/>
           <w:numId w:val="5"/>
@@ -2896,7 +2860,7 @@
     </w:p>
     <w:p>
       <w:pPr>
-        <w:pStyle w:val="189"/>
+        <w:pStyle w:val="190"/>
         <w:numPr>
           <w:ilvl w:val="0"/>
           <w:numId w:val="5"/>
@@ -2925,7 +2889,7 @@
     </w:p>
     <w:p>
       <w:pPr>
-        <w:pStyle w:val="189"/>
+        <w:pStyle w:val="190"/>
         <w:numPr>
           <w:ilvl w:val="0"/>
           <w:numId w:val="5"/>
@@ -2954,7 +2918,7 @@
     </w:p>
     <w:p>
       <w:pPr>
-        <w:pStyle w:val="189"/>
+        <w:pStyle w:val="190"/>
         <w:numPr>
           <w:ilvl w:val="0"/>
           <w:numId w:val="5"/>
@@ -3026,7 +2990,7 @@
     </w:p>
     <w:p>
       <w:pPr>
-        <w:pStyle w:val="189"/>
+        <w:pStyle w:val="190"/>
         <w:numPr>
           <w:ilvl w:val="0"/>
           <w:numId w:val="6"/>
@@ -3055,7 +3019,7 @@
     </w:p>
     <w:p>
       <w:pPr>
-        <w:pStyle w:val="189"/>
+        <w:pStyle w:val="190"/>
         <w:numPr>
           <w:ilvl w:val="0"/>
           <w:numId w:val="6"/>
@@ -3084,7 +3048,7 @@
     </w:p>
     <w:p>
       <w:pPr>
-        <w:pStyle w:val="189"/>
+        <w:pStyle w:val="190"/>
         <w:numPr>
           <w:ilvl w:val="0"/>
           <w:numId w:val="6"/>
@@ -3204,7 +3168,7 @@
     </w:p>
     <w:p>
       <w:pPr>
-        <w:pStyle w:val="189"/>
+        <w:pStyle w:val="190"/>
         <w:numPr>
           <w:ilvl w:val="0"/>
           <w:numId w:val="7"/>
@@ -3233,7 +3197,7 @@
     </w:p>
     <w:p>
       <w:pPr>
-        <w:pStyle w:val="189"/>
+        <w:pStyle w:val="190"/>
         <w:numPr>
           <w:ilvl w:val="0"/>
           <w:numId w:val="7"/>
@@ -3262,7 +3226,7 @@
     </w:p>
     <w:p>
       <w:pPr>
-        <w:pStyle w:val="189"/>
+        <w:pStyle w:val="190"/>
         <w:numPr>
           <w:ilvl w:val="0"/>
           <w:numId w:val="7"/>
@@ -3372,7 +3336,7 @@
     </w:p>
     <w:p>
       <w:pPr>
-        <w:pStyle w:val="189"/>
+        <w:pStyle w:val="190"/>
         <w:numPr>
           <w:ilvl w:val="0"/>
           <w:numId w:val="8"/>
@@ -3411,7 +3375,7 @@
     </w:p>
     <w:p>
       <w:pPr>
-        <w:pStyle w:val="189"/>
+        <w:pStyle w:val="190"/>
         <w:numPr>
           <w:ilvl w:val="0"/>
           <w:numId w:val="8"/>
@@ -3450,7 +3414,7 @@
     </w:p>
     <w:p>
       <w:pPr>
-        <w:pStyle w:val="189"/>
+        <w:pStyle w:val="190"/>
         <w:numPr>
           <w:ilvl w:val="0"/>
           <w:numId w:val="8"/>
@@ -3503,7 +3467,7 @@
     </w:p>
     <w:p>
       <w:pPr>
-        <w:pStyle w:val="189"/>
+        <w:pStyle w:val="190"/>
         <w:numPr>
           <w:ilvl w:val="0"/>
           <w:numId w:val="8"/>
@@ -3614,7 +3578,7 @@
     </w:p>
     <w:p>
       <w:pPr>
-        <w:pStyle w:val="189"/>
+        <w:pStyle w:val="190"/>
         <w:numPr>
           <w:ilvl w:val="0"/>
           <w:numId w:val="9"/>
@@ -3642,7 +3606,7 @@
     </w:p>
     <w:p>
       <w:pPr>
-        <w:pStyle w:val="189"/>
+        <w:pStyle w:val="190"/>
         <w:numPr>
           <w:ilvl w:val="0"/>
           <w:numId w:val="9"/>
@@ -3670,7 +3634,7 @@
     </w:p>
     <w:p>
       <w:pPr>
-        <w:pStyle w:val="189"/>
+        <w:pStyle w:val="190"/>
         <w:numPr>
           <w:ilvl w:val="0"/>
           <w:numId w:val="9"/>
@@ -3698,7 +3662,7 @@
     </w:p>
     <w:p>
       <w:pPr>
-        <w:pStyle w:val="189"/>
+        <w:pStyle w:val="190"/>
         <w:numPr>
           <w:ilvl w:val="0"/>
           <w:numId w:val="9"/>
@@ -3726,7 +3690,7 @@
     </w:p>
     <w:p>
       <w:pPr>
-        <w:pStyle w:val="189"/>
+        <w:pStyle w:val="190"/>
         <w:numPr>
           <w:ilvl w:val="0"/>
           <w:numId w:val="9"/>
@@ -3831,7 +3795,7 @@
     </w:p>
     <w:p>
       <w:pPr>
-        <w:pStyle w:val="189"/>
+        <w:pStyle w:val="190"/>
         <w:numPr>
           <w:ilvl w:val="0"/>
           <w:numId w:val="10"/>
@@ -3872,7 +3836,7 @@
     </w:p>
     <w:p>
       <w:pPr>
-        <w:pStyle w:val="189"/>
+        <w:pStyle w:val="190"/>
         <w:numPr>
           <w:ilvl w:val="0"/>
           <w:numId w:val="10"/>
@@ -4644,7 +4608,7 @@
     </w:p>
     <w:p>
       <w:pPr>
-        <w:pStyle w:val="189"/>
+        <w:pStyle w:val="190"/>
         <w:numPr>
           <w:ilvl w:val="0"/>
           <w:numId w:val="11"/>
@@ -4682,7 +4646,7 @@
     </w:p>
     <w:p>
       <w:pPr>
-        <w:pStyle w:val="189"/>
+        <w:pStyle w:val="190"/>
         <w:numPr>
           <w:ilvl w:val="0"/>
           <w:numId w:val="11"/>
@@ -4720,7 +4684,7 @@
     </w:p>
     <w:p>
       <w:pPr>
-        <w:pStyle w:val="189"/>
+        <w:pStyle w:val="190"/>
         <w:numPr>
           <w:ilvl w:val="0"/>
           <w:numId w:val="11"/>
@@ -4832,7 +4796,7 @@
                   <pic:spPr>
                     <a:xfrm>
                       <a:off x="0" y="0"/>
-                      <a:ext cx="4994512" cy="2507123"/>
+                      <a:ext cx="4994511" cy="2507123"/>
                     </a:xfrm>
                     <a:prstGeom prst="rect">
                       <a:avLst/>
@@ -4959,12 +4923,10 @@
         </w:rPr>
         <w:t>Architecture Overview</w:t>
       </w:r>
-      <w:bookmarkStart w:id="2" w:name="_GoBack"/>
-      <w:bookmarkEnd w:id="2"/>
     </w:p>
     <w:p>
       <w:pPr>
-        <w:pStyle w:val="189"/>
+        <w:pStyle w:val="190"/>
         <w:numPr>
           <w:ilvl w:val="0"/>
           <w:numId w:val="12"/>
@@ -5005,7 +4967,7 @@
     </w:p>
     <w:p>
       <w:pPr>
-        <w:pStyle w:val="189"/>
+        <w:pStyle w:val="190"/>
         <w:numPr>
           <w:ilvl w:val="0"/>
           <w:numId w:val="12"/>
@@ -5046,7 +5008,7 @@
     </w:p>
     <w:p>
       <w:pPr>
-        <w:pStyle w:val="189"/>
+        <w:pStyle w:val="190"/>
         <w:numPr>
           <w:ilvl w:val="1"/>
           <w:numId w:val="13"/>
@@ -5087,7 +5049,7 @@
     </w:p>
     <w:p>
       <w:pPr>
-        <w:pStyle w:val="189"/>
+        <w:pStyle w:val="190"/>
         <w:numPr>
           <w:ilvl w:val="1"/>
           <w:numId w:val="13"/>
@@ -5128,7 +5090,7 @@
     </w:p>
     <w:p>
       <w:pPr>
-        <w:pStyle w:val="189"/>
+        <w:pStyle w:val="190"/>
         <w:numPr>
           <w:ilvl w:val="1"/>
           <w:numId w:val="13"/>
@@ -5169,7 +5131,7 @@
     </w:p>
     <w:p>
       <w:pPr>
-        <w:pStyle w:val="189"/>
+        <w:pStyle w:val="190"/>
         <w:numPr>
           <w:ilvl w:val="1"/>
           <w:numId w:val="13"/>
@@ -5210,7 +5172,7 @@
     </w:p>
     <w:p>
       <w:pPr>
-        <w:pStyle w:val="189"/>
+        <w:pStyle w:val="190"/>
         <w:numPr>
           <w:ilvl w:val="0"/>
           <w:numId w:val="14"/>
@@ -5299,7 +5261,7 @@
     </w:p>
     <w:p>
       <w:pPr>
-        <w:pStyle w:val="189"/>
+        <w:pStyle w:val="190"/>
         <w:numPr>
           <w:ilvl w:val="0"/>
           <w:numId w:val="15"/>
@@ -5340,7 +5302,7 @@
     </w:p>
     <w:p>
       <w:pPr>
-        <w:pStyle w:val="189"/>
+        <w:pStyle w:val="190"/>
         <w:numPr>
           <w:ilvl w:val="0"/>
           <w:numId w:val="15"/>
@@ -5381,7 +5343,7 @@
     </w:p>
     <w:p>
       <w:pPr>
-        <w:pStyle w:val="189"/>
+        <w:pStyle w:val="190"/>
         <w:numPr>
           <w:ilvl w:val="0"/>
           <w:numId w:val="15"/>
@@ -5422,7 +5384,7 @@
     </w:p>
     <w:p>
       <w:pPr>
-        <w:pStyle w:val="189"/>
+        <w:pStyle w:val="190"/>
         <w:numPr>
           <w:ilvl w:val="0"/>
           <w:numId w:val="15"/>
@@ -5492,7 +5454,7 @@
     </w:p>
     <w:p>
       <w:pPr>
-        <w:pStyle w:val="189"/>
+        <w:pStyle w:val="190"/>
         <w:numPr>
           <w:ilvl w:val="0"/>
           <w:numId w:val="16"/>
@@ -5533,7 +5495,7 @@
     </w:p>
     <w:p>
       <w:pPr>
-        <w:pStyle w:val="189"/>
+        <w:pStyle w:val="190"/>
         <w:numPr>
           <w:ilvl w:val="0"/>
           <w:numId w:val="16"/>
@@ -5574,7 +5536,7 @@
     </w:p>
     <w:p>
       <w:pPr>
-        <w:pStyle w:val="189"/>
+        <w:pStyle w:val="190"/>
         <w:numPr>
           <w:ilvl w:val="0"/>
           <w:numId w:val="16"/>
@@ -5615,7 +5577,7 @@
     </w:p>
     <w:p>
       <w:pPr>
-        <w:pStyle w:val="189"/>
+        <w:pStyle w:val="190"/>
         <w:numPr>
           <w:ilvl w:val="0"/>
           <w:numId w:val="16"/>
@@ -5878,6 +5840,253 @@
     </w:p>
     <w:p>
       <w:pPr>
+        <w:pStyle w:val="2"/>
+        <w:keepNext/>
+        <w:keepLines/>
+        <w:widowControl/>
+        <w:suppressLineNumbers w:val="0"/>
+        <w:pBdr>
+          <w:top w:val="none" w:color="auto" w:sz="0" w:space="0"/>
+          <w:left w:val="none" w:color="auto" w:sz="0" w:space="0"/>
+          <w:bottom w:val="none" w:color="auto" w:sz="0" w:space="0"/>
+          <w:right w:val="none" w:color="auto" w:sz="0" w:space="0"/>
+          <w:between w:val="none" w:color="auto" w:sz="0" w:space="0"/>
+        </w:pBdr>
+        <w:spacing w:before="360" w:beforeAutospacing="0" w:after="80" w:afterAutospacing="0"/>
+      </w:pPr>
+      <w:r>
+        <w:rPr>
+          <w:rFonts w:hint="default" w:ascii="Times New Roman" w:hAnsi="Times New Roman" w:cs="Times New Roman"/>
+          <w:b/>
+          <w:bCs/>
+          <w:color w:val="000000"/>
+          <w:sz w:val="32"/>
+          <w:szCs w:val="32"/>
+        </w:rPr>
+        <w:t>4. Implementation</w:t>
+      </w:r>
+    </w:p>
+    <w:p>
+      <w:pPr>
+        <w:pStyle w:val="3"/>
+        <w:keepNext/>
+        <w:keepLines/>
+        <w:widowControl/>
+        <w:suppressLineNumbers w:val="0"/>
+        <w:pBdr>
+          <w:top w:val="none" w:color="auto" w:sz="0" w:space="0"/>
+          <w:left w:val="none" w:color="auto" w:sz="0" w:space="0"/>
+          <w:bottom w:val="none" w:color="auto" w:sz="0" w:space="0"/>
+          <w:right w:val="none" w:color="auto" w:sz="0" w:space="0"/>
+          <w:between w:val="none" w:color="auto" w:sz="0" w:space="0"/>
+        </w:pBdr>
+        <w:spacing w:before="160" w:beforeAutospacing="0" w:after="80" w:afterAutospacing="0"/>
+      </w:pPr>
+      <w:r>
+        <w:rPr>
+          <w:rFonts w:hint="default" w:ascii="Times New Roman" w:hAnsi="Times New Roman" w:cs="Times New Roman"/>
+          <w:b/>
+          <w:bCs/>
+          <w:color w:val="000000"/>
+          <w:sz w:val="28"/>
+          <w:szCs w:val="28"/>
+        </w:rPr>
+        <w:t>4.1 Dataset Processing</w:t>
+      </w:r>
+    </w:p>
+    <w:p>
+      <w:pPr>
+        <w:pStyle w:val="23"/>
+        <w:keepNext w:val="0"/>
+        <w:keepLines w:val="0"/>
+        <w:widowControl/>
+        <w:suppressLineNumbers w:val="0"/>
+        <w:pBdr>
+          <w:top w:val="none" w:color="auto" w:sz="0" w:space="0"/>
+          <w:left w:val="none" w:color="auto" w:sz="0" w:space="0"/>
+          <w:bottom w:val="none" w:color="auto" w:sz="0" w:space="0"/>
+          <w:right w:val="none" w:color="auto" w:sz="0" w:space="0"/>
+          <w:between w:val="none" w:color="auto" w:sz="0" w:space="0"/>
+        </w:pBdr>
+        <w:spacing w:before="0" w:beforeAutospacing="0" w:after="200" w:afterAutospacing="0"/>
+      </w:pPr>
+      <w:r>
+        <w:rPr>
+          <w:rFonts w:hint="default" w:ascii="Times New Roman" w:hAnsi="Times New Roman" w:cs="Times New Roman"/>
+          <w:color w:val="000000"/>
+          <w:sz w:val="24"/>
+          <w:szCs w:val="24"/>
+        </w:rPr>
+        <w:t>Although the project does not rely on a single fixed dataset (each model is pre-trained), a unified preprocessing module was implemented to ensure consistent handling of all text input from users.</w:t>
+      </w:r>
+    </w:p>
+    <w:p>
+      <w:pPr>
+        <w:pStyle w:val="4"/>
+        <w:keepNext/>
+        <w:keepLines/>
+        <w:widowControl/>
+        <w:suppressLineNumbers w:val="0"/>
+        <w:pBdr>
+          <w:top w:val="none" w:color="auto" w:sz="0" w:space="0"/>
+          <w:left w:val="none" w:color="auto" w:sz="0" w:space="0"/>
+          <w:bottom w:val="none" w:color="auto" w:sz="0" w:space="0"/>
+          <w:right w:val="none" w:color="auto" w:sz="0" w:space="0"/>
+          <w:between w:val="none" w:color="auto" w:sz="0" w:space="0"/>
+        </w:pBdr>
+        <w:spacing w:before="160" w:beforeAutospacing="0" w:after="80" w:afterAutospacing="0" w:line="240" w:lineRule="auto"/>
+      </w:pPr>
+      <w:r>
+        <w:rPr>
+          <w:rFonts w:hint="default" w:ascii="Times New Roman" w:hAnsi="Times New Roman" w:cs="Times New Roman"/>
+          <w:b/>
+          <w:bCs/>
+          <w:color w:val="000000"/>
+          <w:sz w:val="24"/>
+          <w:szCs w:val="24"/>
+        </w:rPr>
+        <w:t>4.1.1 Text Cleaning Pipeline</w:t>
+      </w:r>
+    </w:p>
+    <w:p>
+      <w:pPr>
+        <w:pStyle w:val="23"/>
+        <w:keepNext w:val="0"/>
+        <w:keepLines w:val="0"/>
+        <w:widowControl/>
+        <w:suppressLineNumbers w:val="0"/>
+        <w:pBdr>
+          <w:top w:val="none" w:color="auto" w:sz="0" w:space="0"/>
+          <w:left w:val="none" w:color="auto" w:sz="0" w:space="0"/>
+          <w:bottom w:val="none" w:color="auto" w:sz="0" w:space="0"/>
+          <w:right w:val="none" w:color="auto" w:sz="0" w:space="0"/>
+          <w:between w:val="none" w:color="auto" w:sz="0" w:space="0"/>
+        </w:pBdr>
+        <w:spacing w:before="0" w:beforeAutospacing="0" w:after="200" w:afterAutospacing="0" w:line="240" w:lineRule="auto"/>
+      </w:pPr>
+      <w:r>
+        <w:rPr>
+          <w:rFonts w:hint="default" w:ascii="Times New Roman" w:hAnsi="Times New Roman" w:cs="Times New Roman"/>
+          <w:color w:val="000000"/>
+          <w:sz w:val="24"/>
+          <w:szCs w:val="24"/>
+        </w:rPr>
+        <w:t>All text received by the backend is processed through:</w:t>
+      </w:r>
+    </w:p>
+    <w:p>
+      <w:pPr>
+        <w:pStyle w:val="23"/>
+        <w:keepNext w:val="0"/>
+        <w:keepLines w:val="0"/>
+        <w:widowControl/>
+        <w:numPr>
+          <w:ilvl w:val="0"/>
+          <w:numId w:val="17"/>
+        </w:numPr>
+        <w:suppressLineNumbers w:val="0"/>
+        <w:pBdr>
+          <w:top w:val="none" w:color="auto" w:sz="0" w:space="0"/>
+          <w:left w:val="none" w:color="auto" w:sz="0" w:space="0"/>
+          <w:bottom w:val="none" w:color="auto" w:sz="0" w:space="0"/>
+          <w:right w:val="none" w:color="auto" w:sz="0" w:space="0"/>
+          <w:between w:val="none" w:color="auto" w:sz="0" w:space="0"/>
+        </w:pBdr>
+        <w:spacing w:before="0" w:beforeAutospacing="0" w:after="200" w:afterAutospacing="0" w:line="240" w:lineRule="auto"/>
+        <w:ind w:left="840" w:leftChars="0" w:hanging="420" w:firstLineChars="0"/>
+      </w:pPr>
+      <w:r>
+        <w:rPr>
+          <w:rFonts w:hint="default" w:ascii="Times New Roman" w:hAnsi="Times New Roman" w:cs="Times New Roman"/>
+          <w:color w:val="000000"/>
+          <w:sz w:val="24"/>
+          <w:szCs w:val="24"/>
+        </w:rPr>
+        <w:t>Lowercasing</w:t>
+      </w:r>
+    </w:p>
+    <w:p>
+      <w:pPr>
+        <w:pStyle w:val="23"/>
+        <w:keepNext w:val="0"/>
+        <w:keepLines w:val="0"/>
+        <w:widowControl/>
+        <w:numPr>
+          <w:ilvl w:val="0"/>
+          <w:numId w:val="17"/>
+        </w:numPr>
+        <w:suppressLineNumbers w:val="0"/>
+        <w:pBdr>
+          <w:top w:val="none" w:color="auto" w:sz="0" w:space="0"/>
+          <w:left w:val="none" w:color="auto" w:sz="0" w:space="0"/>
+          <w:bottom w:val="none" w:color="auto" w:sz="0" w:space="0"/>
+          <w:right w:val="none" w:color="auto" w:sz="0" w:space="0"/>
+          <w:between w:val="none" w:color="auto" w:sz="0" w:space="0"/>
+        </w:pBdr>
+        <w:spacing w:before="0" w:beforeAutospacing="0" w:after="200" w:afterAutospacing="0" w:line="240" w:lineRule="auto"/>
+        <w:ind w:left="840" w:leftChars="0" w:hanging="420" w:firstLineChars="0"/>
+      </w:pPr>
+      <w:r>
+        <w:rPr>
+          <w:rFonts w:hint="default" w:ascii="Times New Roman" w:hAnsi="Times New Roman" w:cs="Times New Roman"/>
+          <w:color w:val="000000"/>
+          <w:sz w:val="24"/>
+          <w:szCs w:val="24"/>
+        </w:rPr>
+        <w:t>Removal of URLs</w:t>
+      </w:r>
+    </w:p>
+    <w:p>
+      <w:pPr>
+        <w:pStyle w:val="23"/>
+        <w:keepNext w:val="0"/>
+        <w:keepLines w:val="0"/>
+        <w:widowControl/>
+        <w:numPr>
+          <w:ilvl w:val="0"/>
+          <w:numId w:val="17"/>
+        </w:numPr>
+        <w:suppressLineNumbers w:val="0"/>
+        <w:pBdr>
+          <w:top w:val="none" w:color="auto" w:sz="0" w:space="0"/>
+          <w:left w:val="none" w:color="auto" w:sz="0" w:space="0"/>
+          <w:bottom w:val="none" w:color="auto" w:sz="0" w:space="0"/>
+          <w:right w:val="none" w:color="auto" w:sz="0" w:space="0"/>
+          <w:between w:val="none" w:color="auto" w:sz="0" w:space="0"/>
+        </w:pBdr>
+        <w:spacing w:before="0" w:beforeAutospacing="0" w:after="200" w:afterAutospacing="0" w:line="240" w:lineRule="auto"/>
+        <w:ind w:left="840" w:leftChars="0" w:hanging="420" w:firstLineChars="0"/>
+      </w:pPr>
+      <w:r>
+        <w:rPr>
+          <w:rFonts w:hint="default" w:ascii="Times New Roman" w:hAnsi="Times New Roman" w:cs="Times New Roman"/>
+          <w:color w:val="000000"/>
+          <w:sz w:val="24"/>
+          <w:szCs w:val="24"/>
+        </w:rPr>
+        <w:t>Removal of HTML tags</w:t>
+      </w:r>
+    </w:p>
+    <w:p>
+      <w:pPr>
+        <w:pStyle w:val="23"/>
+        <w:keepNext w:val="0"/>
+        <w:keepLines w:val="0"/>
+        <w:widowControl/>
+        <w:numPr>
+          <w:ilvl w:val="0"/>
+          <w:numId w:val="17"/>
+        </w:numPr>
+        <w:suppressLineNumbers w:val="0"/>
+        <w:pBdr>
+          <w:top w:val="none" w:color="auto" w:sz="0" w:space="0"/>
+          <w:left w:val="none" w:color="auto" w:sz="0" w:space="0"/>
+          <w:bottom w:val="none" w:color="auto" w:sz="0" w:space="0"/>
+          <w:right w:val="none" w:color="auto" w:sz="0" w:space="0"/>
+          <w:between w:val="none" w:color="auto" w:sz="0" w:space="0"/>
+        </w:pBdr>
+        <w:spacing w:before="0" w:beforeAutospacing="0" w:after="200" w:afterAutospacing="0" w:line="240" w:lineRule="auto"/>
+        <w:ind w:left="840" w:leftChars="0" w:hanging="420" w:firstLineChars="0"/>
         <w:rPr>
           <w:rFonts w:ascii="Times New Roman" w:hAnsi="Times New Roman" w:cs="Times New Roman"/>
           <w:b w:val="0"/>
@@ -5886,6 +6095,55 @@
           <w:szCs w:val="28"/>
         </w:rPr>
       </w:pPr>
+      <w:r>
+        <w:rPr>
+          <w:rFonts w:hint="default" w:ascii="Times New Roman" w:hAnsi="Times New Roman" w:cs="Times New Roman"/>
+          <w:color w:val="000000"/>
+          <w:sz w:val="24"/>
+          <w:szCs w:val="24"/>
+        </w:rPr>
+        <w:t>Special character filtering</w:t>
+      </w:r>
+    </w:p>
+    <w:p>
+      <w:pPr>
+        <w:pStyle w:val="23"/>
+        <w:keepNext w:val="0"/>
+        <w:keepLines w:val="0"/>
+        <w:widowControl/>
+        <w:numPr>
+          <w:ilvl w:val="0"/>
+          <w:numId w:val="17"/>
+        </w:numPr>
+        <w:suppressLineNumbers w:val="0"/>
+        <w:pBdr>
+          <w:top w:val="none" w:color="auto" w:sz="0" w:space="0"/>
+          <w:left w:val="none" w:color="auto" w:sz="0" w:space="0"/>
+          <w:bottom w:val="none" w:color="auto" w:sz="0" w:space="0"/>
+          <w:right w:val="none" w:color="auto" w:sz="0" w:space="0"/>
+          <w:between w:val="none" w:color="auto" w:sz="0" w:space="0"/>
+        </w:pBdr>
+        <w:spacing w:before="0" w:beforeAutospacing="0" w:after="200" w:afterAutospacing="0" w:line="240" w:lineRule="auto"/>
+        <w:ind w:left="840" w:leftChars="0" w:hanging="420" w:firstLineChars="0"/>
+        <w:rPr>
+          <w:rFonts w:ascii="Times New Roman" w:hAnsi="Times New Roman" w:cs="Times New Roman"/>
+          <w:b w:val="0"/>
+          <w:bCs w:val="0"/>
+          <w:sz w:val="28"/>
+          <w:szCs w:val="28"/>
+        </w:rPr>
+      </w:pPr>
+      <w:bookmarkStart w:id="2" w:name="_GoBack"/>
+      <w:bookmarkEnd w:id="2"/>
+      <w:r>
+        <w:rPr>
+          <w:rFonts w:hint="default" w:ascii="Times New Roman" w:hAnsi="Times New Roman" w:cs="Times New Roman"/>
+          <w:color w:val="000000"/>
+          <w:sz w:val="24"/>
+          <w:szCs w:val="24"/>
+        </w:rPr>
+        <w:t>Whitespace normalization</w:t>
+      </w:r>
     </w:p>
     <w:sectPr>
       <w:pgSz w:w="12240" w:h="15840"/>
@@ -5949,6 +6207,28 @@
 <file path=word/numbering.xml><?xml version="1.0" encoding="utf-8"?>
 <w:numbering xmlns:wpc="http://schemas.microsoft.com/office/word/2010/wordprocessingCanvas" xmlns:mc="http://schemas.openxmlformats.org/markup-compatibility/2006" xmlns:o="urn:schemas-microsoft-com:office:office" xmlns:r="http://schemas.openxmlformats.org/officeDocument/2006/relationships" xmlns:m="http://schemas.openxmlformats.org/officeDocument/2006/math" xmlns:v="urn:schemas-microsoft-com:vml" xmlns:wp14="http://schemas.microsoft.com/office/word/2010/wordprocessingDrawing" xmlns:wp="http://schemas.openxmlformats.org/drawingml/2006/wordprocessingDrawing" xmlns:w10="urn:schemas-microsoft-com:office:word" xmlns:w="http://schemas.openxmlformats.org/wordprocessingml/2006/main" xmlns:w14="http://schemas.microsoft.com/office/word/2010/wordml" xmlns:wpg="http://schemas.microsoft.com/office/word/2010/wordprocessingGroup" xmlns:wpi="http://schemas.microsoft.com/office/word/2010/wordprocessingInk" xmlns:wne="http://schemas.microsoft.com/office/word/2006/wordml" xmlns:wps="http://schemas.microsoft.com/office/word/2010/wordprocessingShape" xmlns:wpsCustomData="http://www.wps.cn/officeDocument/2013/wpsCustomData" mc:Ignorable="w14 wp14">
   <w:abstractNum w:abstractNumId="0">
+    <w:nsid w:val="FDB6B980"/>
+    <w:multiLevelType w:val="singleLevel"/>
+    <w:tmpl w:val="FDB6B980"/>
+    <w:lvl w:ilvl="0" w:tentative="0">
+      <w:start w:val="1"/>
+      <w:numFmt w:val="bullet"/>
+      <w:lvlText w:val=""/>
+      <w:lvlJc w:val="left"/>
+      <w:pPr>
+        <w:tabs>
+          <w:tab w:val="left" w:pos="840"/>
+        </w:tabs>
+        <w:ind w:left="840" w:leftChars="0" w:hanging="420" w:firstLineChars="0"/>
+      </w:pPr>
+      <w:rPr>
+        <w:rFonts w:hint="default" w:ascii="Wingdings" w:hAnsi="Wingdings"/>
+        <w:sz w:val="16"/>
+        <w:szCs w:val="16"/>
+      </w:rPr>
+    </w:lvl>
+  </w:abstractNum>
+  <w:abstractNum w:abstractNumId="1">
     <w:nsid w:val="062C3181"/>
     <w:multiLevelType w:val="multilevel"/>
     <w:tmpl w:val="062C3181"/>
@@ -6061,7 +6341,7 @@
       </w:rPr>
     </w:lvl>
   </w:abstractNum>
-  <w:abstractNum w:abstractNumId="1">
+  <w:abstractNum w:abstractNumId="2">
     <w:nsid w:val="0EF3EE69"/>
     <w:multiLevelType w:val="multilevel"/>
     <w:tmpl w:val="0EF3EE69"/>
@@ -6174,7 +6454,7 @@
       </w:rPr>
     </w:lvl>
   </w:abstractNum>
-  <w:abstractNum w:abstractNumId="2">
+  <w:abstractNum w:abstractNumId="3">
     <w:nsid w:val="1BAFC686"/>
     <w:multiLevelType w:val="multilevel"/>
     <w:tmpl w:val="1BAFC686"/>
@@ -6287,7 +6567,7 @@
       </w:rPr>
     </w:lvl>
   </w:abstractNum>
-  <w:abstractNum w:abstractNumId="3">
+  <w:abstractNum w:abstractNumId="4">
     <w:nsid w:val="1FE2A93F"/>
     <w:multiLevelType w:val="multilevel"/>
     <w:tmpl w:val="1FE2A93F"/>
@@ -6377,7 +6657,7 @@
       </w:pPr>
     </w:lvl>
   </w:abstractNum>
-  <w:abstractNum w:abstractNumId="4">
+  <w:abstractNum w:abstractNumId="5">
     <w:nsid w:val="249DFE27"/>
     <w:multiLevelType w:val="multilevel"/>
     <w:tmpl w:val="249DFE27"/>
@@ -6490,7 +6770,7 @@
       </w:rPr>
     </w:lvl>
   </w:abstractNum>
-  <w:abstractNum w:abstractNumId="5">
+  <w:abstractNum w:abstractNumId="6">
     <w:nsid w:val="2A273996"/>
     <w:multiLevelType w:val="multilevel"/>
     <w:tmpl w:val="2A273996"/>
@@ -6603,7 +6883,7 @@
       </w:rPr>
     </w:lvl>
   </w:abstractNum>
-  <w:abstractNum w:abstractNumId="6">
+  <w:abstractNum w:abstractNumId="7">
     <w:nsid w:val="3135EEEC"/>
     <w:multiLevelType w:val="multilevel"/>
     <w:tmpl w:val="3135EEEC"/>
@@ -6716,7 +6996,7 @@
       </w:rPr>
     </w:lvl>
   </w:abstractNum>
-  <w:abstractNum w:abstractNumId="7">
+  <w:abstractNum w:abstractNumId="8">
     <w:nsid w:val="33936E4A"/>
     <w:multiLevelType w:val="multilevel"/>
     <w:tmpl w:val="33936E4A"/>
@@ -6829,7 +7109,7 @@
       </w:rPr>
     </w:lvl>
   </w:abstractNum>
-  <w:abstractNum w:abstractNumId="8">
+  <w:abstractNum w:abstractNumId="9">
     <w:nsid w:val="3F241041"/>
     <w:multiLevelType w:val="multilevel"/>
     <w:tmpl w:val="3F241041"/>
@@ -6942,7 +7222,7 @@
       </w:rPr>
     </w:lvl>
   </w:abstractNum>
-  <w:abstractNum w:abstractNumId="9">
+  <w:abstractNum w:abstractNumId="10">
     <w:nsid w:val="4C1D9FFB"/>
     <w:multiLevelType w:val="multilevel"/>
     <w:tmpl w:val="4C1D9FFB"/>
@@ -7055,7 +7335,7 @@
       </w:rPr>
     </w:lvl>
   </w:abstractNum>
-  <w:abstractNum w:abstractNumId="10">
+  <w:abstractNum w:abstractNumId="11">
     <w:nsid w:val="607D041E"/>
     <w:multiLevelType w:val="multilevel"/>
     <w:tmpl w:val="607D041E"/>
@@ -7168,7 +7448,7 @@
       </w:rPr>
     </w:lvl>
   </w:abstractNum>
-  <w:abstractNum w:abstractNumId="11">
+  <w:abstractNum w:abstractNumId="12">
     <w:nsid w:val="61CADB69"/>
     <w:multiLevelType w:val="multilevel"/>
     <w:tmpl w:val="61CADB69"/>
@@ -7281,7 +7561,7 @@
       </w:rPr>
     </w:lvl>
   </w:abstractNum>
-  <w:abstractNum w:abstractNumId="12">
+  <w:abstractNum w:abstractNumId="13">
     <w:nsid w:val="636A7642"/>
     <w:multiLevelType w:val="multilevel"/>
     <w:tmpl w:val="636A7642"/>
@@ -7367,7 +7647,7 @@
       </w:pPr>
     </w:lvl>
   </w:abstractNum>
-  <w:abstractNum w:abstractNumId="13">
+  <w:abstractNum w:abstractNumId="14">
     <w:nsid w:val="6F37835E"/>
     <w:multiLevelType w:val="multilevel"/>
     <w:tmpl w:val="6F37835E"/>
@@ -7480,7 +7760,7 @@
       </w:rPr>
     </w:lvl>
   </w:abstractNum>
-  <w:abstractNum w:abstractNumId="14">
+  <w:abstractNum w:abstractNumId="15">
     <w:nsid w:val="73FEF6E3"/>
     <w:multiLevelType w:val="multilevel"/>
     <w:tmpl w:val="73FEF6E3"/>
@@ -7571,7 +7851,7 @@
       </w:pPr>
     </w:lvl>
   </w:abstractNum>
-  <w:abstractNum w:abstractNumId="15">
+  <w:abstractNum w:abstractNumId="16">
     <w:nsid w:val="7BA7EF9E"/>
     <w:multiLevelType w:val="multilevel"/>
     <w:tmpl w:val="7BA7EF9E"/>
@@ -7685,52 +7965,55 @@
     </w:lvl>
   </w:abstractNum>
   <w:num w:numId="1">
+    <w:abstractNumId w:val="11"/>
+  </w:num>
+  <w:num w:numId="2">
+    <w:abstractNumId w:val="5"/>
+  </w:num>
+  <w:num w:numId="3">
+    <w:abstractNumId w:val="4"/>
+  </w:num>
+  <w:num w:numId="4">
+    <w:abstractNumId w:val="12"/>
+  </w:num>
+  <w:num w:numId="5">
     <w:abstractNumId w:val="10"/>
   </w:num>
-  <w:num w:numId="2">
-    <w:abstractNumId w:val="4"/>
-  </w:num>
-  <w:num w:numId="3">
+  <w:num w:numId="6">
     <w:abstractNumId w:val="3"/>
   </w:num>
-  <w:num w:numId="4">
-    <w:abstractNumId w:val="11"/>
+  <w:num w:numId="7">
+    <w:abstractNumId w:val="14"/>
   </w:num>
-  <w:num w:numId="5">
+  <w:num w:numId="8">
+    <w:abstractNumId w:val="7"/>
+  </w:num>
+  <w:num w:numId="9">
+    <w:abstractNumId w:val="2"/>
+  </w:num>
+  <w:num w:numId="10">
+    <w:abstractNumId w:val="1"/>
+  </w:num>
+  <w:num w:numId="11">
     <w:abstractNumId w:val="9"/>
   </w:num>
-  <w:num w:numId="6">
-    <w:abstractNumId w:val="2"/>
-  </w:num>
-  <w:num w:numId="7">
+  <w:num w:numId="12">
     <w:abstractNumId w:val="13"/>
   </w:num>
-  <w:num w:numId="8">
+  <w:num w:numId="13">
     <w:abstractNumId w:val="6"/>
   </w:num>
-  <w:num w:numId="9">
-    <w:abstractNumId w:val="1"/>
+  <w:num w:numId="14">
+    <w:abstractNumId w:val="15"/>
   </w:num>
-  <w:num w:numId="10">
-    <w:abstractNumId w:val="0"/>
+  <w:num w:numId="15">
+    <w:abstractNumId w:val="16"/>
   </w:num>
-  <w:num w:numId="11">
+  <w:num w:numId="16">
     <w:abstractNumId w:val="8"/>
   </w:num>
-  <w:num w:numId="12">
-    <w:abstractNumId w:val="12"/>
-  </w:num>
-  <w:num w:numId="13">
-    <w:abstractNumId w:val="5"/>
-  </w:num>
-  <w:num w:numId="14">
-    <w:abstractNumId w:val="14"/>
-  </w:num>
-  <w:num w:numId="15">
-    <w:abstractNumId w:val="15"/>
-  </w:num>
-  <w:num w:numId="16">
-    <w:abstractNumId w:val="7"/>
+  <w:num w:numId="17">
+    <w:abstractNumId w:val="0"/>
   </w:num>
 </w:numbering>
 </file>
@@ -7740,7 +8023,7 @@
   <w:docDefaults>
     <w:rPrDefault>
       <w:rPr>
-        <w:rFonts w:asciiTheme="minorHAnsi" w:hAnsiTheme="minorHAnsi" w:eastAsiaTheme="minorHAnsi" w:cstheme="minorBidi"/>
+        <w:rFonts w:ascii="Times New Roman" w:hAnsi="Times New Roman" w:eastAsia="SimSun" w:cs="Times New Roman"/>
       </w:rPr>
     </w:rPrDefault>
     <w:pPrDefault/>
@@ -8018,7 +8301,7 @@
     <w:name w:val="heading 1"/>
     <w:basedOn w:val="1"/>
     <w:next w:val="1"/>
-    <w:link w:val="162"/>
+    <w:link w:val="163"/>
     <w:qFormat/>
     <w:uiPriority w:val="9"/>
     <w:pPr>
@@ -8038,7 +8321,7 @@
     <w:name w:val="heading 2"/>
     <w:basedOn w:val="1"/>
     <w:next w:val="1"/>
-    <w:link w:val="163"/>
+    <w:link w:val="164"/>
     <w:unhideWhenUsed/>
     <w:qFormat/>
     <w:uiPriority w:val="9"/>
@@ -8059,7 +8342,7 @@
     <w:name w:val="heading 3"/>
     <w:basedOn w:val="1"/>
     <w:next w:val="1"/>
-    <w:link w:val="164"/>
+    <w:link w:val="165"/>
     <w:unhideWhenUsed/>
     <w:qFormat/>
     <w:uiPriority w:val="9"/>
@@ -8080,7 +8363,7 @@
     <w:name w:val="heading 4"/>
     <w:basedOn w:val="1"/>
     <w:next w:val="1"/>
-    <w:link w:val="165"/>
+    <w:link w:val="166"/>
     <w:unhideWhenUsed/>
     <w:qFormat/>
     <w:uiPriority w:val="9"/>
@@ -8101,7 +8384,7 @@
     <w:name w:val="heading 5"/>
     <w:basedOn w:val="1"/>
     <w:next w:val="1"/>
-    <w:link w:val="166"/>
+    <w:link w:val="167"/>
     <w:unhideWhenUsed/>
     <w:qFormat/>
     <w:uiPriority w:val="9"/>
@@ -8120,7 +8403,7 @@
     <w:name w:val="heading 6"/>
     <w:basedOn w:val="1"/>
     <w:next w:val="1"/>
-    <w:link w:val="167"/>
+    <w:link w:val="168"/>
     <w:unhideWhenUsed/>
     <w:qFormat/>
     <w:uiPriority w:val="9"/>
@@ -8149,7 +8432,7 @@
     <w:name w:val="heading 7"/>
     <w:basedOn w:val="1"/>
     <w:next w:val="1"/>
-    <w:link w:val="168"/>
+    <w:link w:val="169"/>
     <w:unhideWhenUsed/>
     <w:qFormat/>
     <w:uiPriority w:val="9"/>
@@ -8176,7 +8459,7 @@
     <w:name w:val="heading 8"/>
     <w:basedOn w:val="1"/>
     <w:next w:val="1"/>
-    <w:link w:val="169"/>
+    <w:link w:val="170"/>
     <w:unhideWhenUsed/>
     <w:qFormat/>
     <w:uiPriority w:val="9"/>
@@ -8205,7 +8488,7 @@
     <w:name w:val="heading 9"/>
     <w:basedOn w:val="1"/>
     <w:next w:val="1"/>
-    <w:link w:val="170"/>
+    <w:link w:val="171"/>
     <w:unhideWhenUsed/>
     <w:qFormat/>
     <w:uiPriority w:val="9"/>
@@ -8332,7 +8615,7 @@
   <w:style w:type="paragraph" w:styleId="16">
     <w:name w:val="endnote text"/>
     <w:basedOn w:val="1"/>
-    <w:link w:val="185"/>
+    <w:link w:val="186"/>
     <w:semiHidden/>
     <w:unhideWhenUsed/>
     <w:uiPriority w:val="99"/>
@@ -8363,7 +8646,7 @@
   <w:style w:type="paragraph" w:styleId="18">
     <w:name w:val="footer"/>
     <w:basedOn w:val="1"/>
-    <w:link w:val="183"/>
+    <w:link w:val="184"/>
     <w:unhideWhenUsed/>
     <w:uiPriority w:val="99"/>
     <w:pPr>
@@ -8387,7 +8670,7 @@
   <w:style w:type="paragraph" w:styleId="20">
     <w:name w:val="footnote text"/>
     <w:basedOn w:val="1"/>
-    <w:link w:val="184"/>
+    <w:link w:val="185"/>
     <w:semiHidden/>
     <w:unhideWhenUsed/>
     <w:uiPriority w:val="99"/>
@@ -8402,7 +8685,7 @@
   <w:style w:type="paragraph" w:styleId="21">
     <w:name w:val="header"/>
     <w:basedOn w:val="1"/>
-    <w:link w:val="182"/>
+    <w:link w:val="183"/>
     <w:unhideWhenUsed/>
     <w:uiPriority w:val="99"/>
     <w:pPr>
@@ -8428,7 +8711,24 @@
       </w14:textFill>
     </w:rPr>
   </w:style>
-  <w:style w:type="character" w:styleId="23">
+  <w:style w:type="paragraph" w:styleId="23">
+    <w:name w:val="Normal (Web)"/>
+    <w:semiHidden/>
+    <w:unhideWhenUsed/>
+    <w:uiPriority w:val="99"/>
+    <w:pPr>
+      <w:spacing w:before="0" w:beforeAutospacing="1" w:after="0" w:afterAutospacing="1"/>
+      <w:ind w:left="0" w:right="0"/>
+      <w:jc w:val="left"/>
+    </w:pPr>
+    <w:rPr>
+      <w:kern w:val="0"/>
+      <w:sz w:val="24"/>
+      <w:szCs w:val="24"/>
+      <w:lang w:val="en-US" w:eastAsia="zh-CN" w:bidi="ar"/>
+    </w:rPr>
+  </w:style>
+  <w:style w:type="character" w:styleId="24">
     <w:name w:val="Strong"/>
     <w:basedOn w:val="11"/>
     <w:qFormat/>
@@ -8438,11 +8738,11 @@
       <w:bCs/>
     </w:rPr>
   </w:style>
-  <w:style w:type="paragraph" w:styleId="24">
+  <w:style w:type="paragraph" w:styleId="25">
     <w:name w:val="Subtitle"/>
     <w:basedOn w:val="1"/>
     <w:next w:val="1"/>
-    <w:link w:val="172"/>
+    <w:link w:val="173"/>
     <w:qFormat/>
     <w:uiPriority w:val="11"/>
     <w:rPr>
@@ -8460,7 +8760,7 @@
       </w14:textFill>
     </w:rPr>
   </w:style>
-  <w:style w:type="table" w:styleId="25">
+  <w:style w:type="table" w:styleId="26">
     <w:name w:val="Table Grid"/>
     <w:basedOn w:val="12"/>
     <w:qFormat/>
@@ -8521,7 +8821,7 @@
       <w:tblPr/>
     </w:tblStylePr>
   </w:style>
-  <w:style w:type="paragraph" w:styleId="26">
+  <w:style w:type="paragraph" w:styleId="27">
     <w:name w:val="table of figures"/>
     <w:basedOn w:val="1"/>
     <w:next w:val="1"/>
@@ -8531,11 +8831,11 @@
       <w:spacing w:after="0" w:afterAutospacing="0"/>
     </w:pPr>
   </w:style>
-  <w:style w:type="paragraph" w:styleId="27">
+  <w:style w:type="paragraph" w:styleId="28">
     <w:name w:val="Title"/>
     <w:basedOn w:val="1"/>
     <w:next w:val="1"/>
-    <w:link w:val="171"/>
+    <w:link w:val="172"/>
     <w:qFormat/>
     <w:uiPriority w:val="10"/>
     <w:pPr>
@@ -8549,7 +8849,7 @@
       <w:szCs w:val="56"/>
     </w:rPr>
   </w:style>
-  <w:style w:type="paragraph" w:styleId="28">
+  <w:style w:type="paragraph" w:styleId="29">
     <w:name w:val="toc 1"/>
     <w:basedOn w:val="1"/>
     <w:next w:val="1"/>
@@ -8559,7 +8859,7 @@
       <w:spacing w:after="100"/>
     </w:pPr>
   </w:style>
-  <w:style w:type="paragraph" w:styleId="29">
+  <w:style w:type="paragraph" w:styleId="30">
     <w:name w:val="toc 2"/>
     <w:basedOn w:val="1"/>
     <w:next w:val="1"/>
@@ -8570,7 +8870,7 @@
       <w:ind w:left="220"/>
     </w:pPr>
   </w:style>
-  <w:style w:type="paragraph" w:styleId="30">
+  <w:style w:type="paragraph" w:styleId="31">
     <w:name w:val="toc 3"/>
     <w:basedOn w:val="1"/>
     <w:next w:val="1"/>
@@ -8581,7 +8881,7 @@
       <w:ind w:left="440"/>
     </w:pPr>
   </w:style>
-  <w:style w:type="paragraph" w:styleId="31">
+  <w:style w:type="paragraph" w:styleId="32">
     <w:name w:val="toc 4"/>
     <w:basedOn w:val="1"/>
     <w:next w:val="1"/>
@@ -8592,7 +8892,7 @@
       <w:ind w:left="660"/>
     </w:pPr>
   </w:style>
-  <w:style w:type="paragraph" w:styleId="32">
+  <w:style w:type="paragraph" w:styleId="33">
     <w:name w:val="toc 5"/>
     <w:basedOn w:val="1"/>
     <w:next w:val="1"/>
@@ -8603,7 +8903,7 @@
       <w:ind w:left="880"/>
     </w:pPr>
   </w:style>
-  <w:style w:type="paragraph" w:styleId="33">
+  <w:style w:type="paragraph" w:styleId="34">
     <w:name w:val="toc 6"/>
     <w:basedOn w:val="1"/>
     <w:next w:val="1"/>
@@ -8614,7 +8914,7 @@
       <w:ind w:left="1100"/>
     </w:pPr>
   </w:style>
-  <w:style w:type="paragraph" w:styleId="34">
+  <w:style w:type="paragraph" w:styleId="35">
     <w:name w:val="toc 7"/>
     <w:basedOn w:val="1"/>
     <w:next w:val="1"/>
@@ -8625,7 +8925,7 @@
       <w:ind w:left="1320"/>
     </w:pPr>
   </w:style>
-  <w:style w:type="paragraph" w:styleId="35">
+  <w:style w:type="paragraph" w:styleId="36">
     <w:name w:val="toc 8"/>
     <w:basedOn w:val="1"/>
     <w:next w:val="1"/>
@@ -8636,7 +8936,7 @@
       <w:ind w:left="1540"/>
     </w:pPr>
   </w:style>
-  <w:style w:type="paragraph" w:styleId="36">
+  <w:style w:type="paragraph" w:styleId="37">
     <w:name w:val="toc 9"/>
     <w:basedOn w:val="1"/>
     <w:next w:val="1"/>
@@ -8647,7 +8947,7 @@
       <w:ind w:left="1760"/>
     </w:pPr>
   </w:style>
-  <w:style w:type="table" w:customStyle="1" w:styleId="37">
+  <w:style w:type="table" w:customStyle="1" w:styleId="38">
     <w:name w:val="Table Grid Light"/>
     <w:basedOn w:val="12"/>
     <w:uiPriority w:val="59"/>
@@ -8707,7 +9007,7 @@
       <w:tblPr/>
     </w:tblStylePr>
   </w:style>
-  <w:style w:type="table" w:customStyle="1" w:styleId="38">
+  <w:style w:type="table" w:customStyle="1" w:styleId="39">
     <w:name w:val="Plain Table 1"/>
     <w:basedOn w:val="12"/>
     <w:uiPriority w:val="59"/>
@@ -8797,7 +9097,7 @@
       <w:tblPr/>
     </w:tblStylePr>
   </w:style>
-  <w:style w:type="table" w:customStyle="1" w:styleId="39">
+  <w:style w:type="table" w:customStyle="1" w:styleId="40">
     <w:name w:val="Plain Table 2"/>
     <w:basedOn w:val="12"/>
     <w:uiPriority w:val="59"/>
@@ -8903,7 +9203,7 @@
       <w:tblPr/>
     </w:tblStylePr>
   </w:style>
-  <w:style w:type="table" w:customStyle="1" w:styleId="40">
+  <w:style w:type="table" w:customStyle="1" w:styleId="41">
     <w:name w:val="Plain Table 3"/>
     <w:basedOn w:val="12"/>
     <w:uiPriority w:val="99"/>
@@ -9000,7 +9300,7 @@
       <w:tblPr/>
     </w:tblStylePr>
   </w:style>
-  <w:style w:type="table" w:customStyle="1" w:styleId="41">
+  <w:style w:type="table" w:customStyle="1" w:styleId="42">
     <w:name w:val="Plain Table 4"/>
     <w:basedOn w:val="12"/>
     <w:uiPriority w:val="99"/>
@@ -9077,7 +9377,7 @@
       <w:tblPr/>
     </w:tblStylePr>
   </w:style>
-  <w:style w:type="table" w:customStyle="1" w:styleId="42">
+  <w:style w:type="table" w:customStyle="1" w:styleId="43">
     <w:name w:val="Plain Table 5"/>
     <w:basedOn w:val="12"/>
     <w:uiPriority w:val="99"/>
@@ -9185,7 +9485,7 @@
       <w:tblPr/>
     </w:tblStylePr>
   </w:style>
-  <w:style w:type="table" w:customStyle="1" w:styleId="43">
+  <w:style w:type="table" w:customStyle="1" w:styleId="44">
     <w:name w:val="Grid Table 1 Light"/>
     <w:basedOn w:val="12"/>
     <w:uiPriority w:val="99"/>
@@ -9273,7 +9573,7 @@
       <w:tblPr/>
     </w:tblStylePr>
   </w:style>
-  <w:style w:type="table" w:customStyle="1" w:styleId="44">
+  <w:style w:type="table" w:customStyle="1" w:styleId="45">
     <w:name w:val="Grid Table 1 Light - Accent 1"/>
     <w:basedOn w:val="12"/>
     <w:uiPriority w:val="99"/>
@@ -9361,7 +9661,7 @@
       <w:tblPr/>
     </w:tblStylePr>
   </w:style>
-  <w:style w:type="table" w:customStyle="1" w:styleId="45">
+  <w:style w:type="table" w:customStyle="1" w:styleId="46">
     <w:name w:val="Grid Table 1 Light - Accent 2"/>
     <w:basedOn w:val="12"/>
     <w:uiPriority w:val="99"/>
@@ -9449,7 +9749,7 @@
       <w:tblPr/>
     </w:tblStylePr>
   </w:style>
-  <w:style w:type="table" w:customStyle="1" w:styleId="46">
+  <w:style w:type="table" w:customStyle="1" w:styleId="47">
     <w:name w:val="Grid Table 1 Light - Accent 3"/>
     <w:basedOn w:val="12"/>
     <w:uiPriority w:val="99"/>
@@ -9537,7 +9837,7 @@
       <w:tblPr/>
     </w:tblStylePr>
   </w:style>
-  <w:style w:type="table" w:customStyle="1" w:styleId="47">
+  <w:style w:type="table" w:customStyle="1" w:styleId="48">
     <w:name w:val="Grid Table 1 Light - Accent 4"/>
     <w:basedOn w:val="12"/>
     <w:uiPriority w:val="99"/>
@@ -9625,7 +9925,7 @@
       <w:tblPr/>
     </w:tblStylePr>
   </w:style>
-  <w:style w:type="table" w:customStyle="1" w:styleId="48">
+  <w:style w:type="table" w:customStyle="1" w:styleId="49">
     <w:name w:val="Grid Table 1 Light - Accent 5"/>
     <w:basedOn w:val="12"/>
     <w:uiPriority w:val="99"/>
@@ -9713,7 +10013,7 @@
       <w:tblPr/>
     </w:tblStylePr>
   </w:style>
-  <w:style w:type="table" w:customStyle="1" w:styleId="49">
+  <w:style w:type="table" w:customStyle="1" w:styleId="50">
     <w:name w:val="Grid Table 1 Light - Accent 6"/>
     <w:basedOn w:val="12"/>
     <w:uiPriority w:val="99"/>
@@ -9801,7 +10101,7 @@
       <w:tblPr/>
     </w:tblStylePr>
   </w:style>
-  <w:style w:type="table" w:customStyle="1" w:styleId="50">
+  <w:style w:type="table" w:customStyle="1" w:styleId="51">
     <w:name w:val="Grid Table 2"/>
     <w:basedOn w:val="12"/>
     <w:uiPriority w:val="99"/>
@@ -9902,7 +10202,7 @@
       <w:tblPr/>
     </w:tblStylePr>
   </w:style>
-  <w:style w:type="table" w:customStyle="1" w:styleId="51">
+  <w:style w:type="table" w:customStyle="1" w:styleId="52">
     <w:name w:val="Grid Table 2 - Accent 1"/>
     <w:basedOn w:val="12"/>
     <w:uiPriority w:val="99"/>
@@ -10003,7 +10303,7 @@
       <w:tblPr/>
     </w:tblStylePr>
   </w:style>
-  <w:style w:type="table" w:customStyle="1" w:styleId="52">
+  <w:style w:type="table" w:customStyle="1" w:styleId="53">
     <w:name w:val="Grid Table 2 - Accent 2"/>
     <w:basedOn w:val="12"/>
     <w:uiPriority w:val="99"/>
@@ -10104,7 +10404,7 @@
       <w:tblPr/>
     </w:tblStylePr>
   </w:style>
-  <w:style w:type="table" w:customStyle="1" w:styleId="53">
+  <w:style w:type="table" w:customStyle="1" w:styleId="54">
     <w:name w:val="Grid Table 2 - Accent 3"/>
     <w:basedOn w:val="12"/>
     <w:uiPriority w:val="99"/>
@@ -10205,7 +10505,7 @@
       <w:tblPr/>
     </w:tblStylePr>
   </w:style>
-  <w:style w:type="table" w:customStyle="1" w:styleId="54">
+  <w:style w:type="table" w:customStyle="1" w:styleId="55">
     <w:name w:val="Grid Table 2 - Accent 4"/>
     <w:basedOn w:val="12"/>
     <w:uiPriority w:val="99"/>
@@ -10306,7 +10606,7 @@
       <w:tblPr/>
     </w:tblStylePr>
   </w:style>
-  <w:style w:type="table" w:customStyle="1" w:styleId="55">
+  <w:style w:type="table" w:customStyle="1" w:styleId="56">
     <w:name w:val="Grid Table 2 - Accent 5"/>
     <w:basedOn w:val="12"/>
     <w:uiPriority w:val="99"/>
@@ -10407,7 +10707,7 @@
       <w:tblPr/>
     </w:tblStylePr>
   </w:style>
-  <w:style w:type="table" w:customStyle="1" w:styleId="56">
+  <w:style w:type="table" w:customStyle="1" w:styleId="57">
     <w:name w:val="Grid Table 2 - Accent 6"/>
     <w:basedOn w:val="12"/>
     <w:uiPriority w:val="99"/>
@@ -10508,7 +10808,7 @@
       <w:tblPr/>
     </w:tblStylePr>
   </w:style>
-  <w:style w:type="table" w:customStyle="1" w:styleId="57">
+  <w:style w:type="table" w:customStyle="1" w:styleId="58">
     <w:name w:val="Grid Table 3"/>
     <w:basedOn w:val="12"/>
     <w:uiPriority w:val="99"/>
@@ -10630,7 +10930,7 @@
       <w:tblPr/>
     </w:tblStylePr>
   </w:style>
-  <w:style w:type="table" w:customStyle="1" w:styleId="58">
+  <w:style w:type="table" w:customStyle="1" w:styleId="59">
     <w:name w:val="Grid Table 3 - Accent 1"/>
     <w:basedOn w:val="12"/>
     <w:uiPriority w:val="99"/>
@@ -10752,7 +11052,7 @@
       <w:tblPr/>
     </w:tblStylePr>
   </w:style>
-  <w:style w:type="table" w:customStyle="1" w:styleId="59">
+  <w:style w:type="table" w:customStyle="1" w:styleId="60">
     <w:name w:val="Grid Table 3 - Accent 2"/>
     <w:basedOn w:val="12"/>
     <w:uiPriority w:val="99"/>
@@ -10874,7 +11174,7 @@
       <w:tblPr/>
     </w:tblStylePr>
   </w:style>
-  <w:style w:type="table" w:customStyle="1" w:styleId="60">
+  <w:style w:type="table" w:customStyle="1" w:styleId="61">
     <w:name w:val="Grid Table 3 - Accent 3"/>
     <w:basedOn w:val="12"/>
     <w:uiPriority w:val="99"/>
@@ -10996,7 +11296,7 @@
       <w:tblPr/>
     </w:tblStylePr>
   </w:style>
-  <w:style w:type="table" w:customStyle="1" w:styleId="61">
+  <w:style w:type="table" w:customStyle="1" w:styleId="62">
     <w:name w:val="Grid Table 3 - Accent 4"/>
     <w:basedOn w:val="12"/>
     <w:uiPriority w:val="99"/>
@@ -11118,7 +11418,7 @@
       <w:tblPr/>
     </w:tblStylePr>
   </w:style>
-  <w:style w:type="table" w:customStyle="1" w:styleId="62">
+  <w:style w:type="table" w:customStyle="1" w:styleId="63">
     <w:name w:val="Grid Table 3 - Accent 5"/>
     <w:basedOn w:val="12"/>
     <w:uiPriority w:val="99"/>
@@ -11240,7 +11540,7 @@
       <w:tblPr/>
     </w:tblStylePr>
   </w:style>
-  <w:style w:type="table" w:customStyle="1" w:styleId="63">
+  <w:style w:type="table" w:customStyle="1" w:styleId="64">
     <w:name w:val="Grid Table 3 - Accent 6"/>
     <w:basedOn w:val="12"/>
     <w:uiPriority w:val="99"/>
@@ -11362,7 +11662,7 @@
       <w:tblPr/>
     </w:tblStylePr>
   </w:style>
-  <w:style w:type="table" w:customStyle="1" w:styleId="64">
+  <w:style w:type="table" w:customStyle="1" w:styleId="65">
     <w:name w:val="Grid Table 4"/>
     <w:basedOn w:val="12"/>
     <w:uiPriority w:val="59"/>
@@ -11464,7 +11764,7 @@
       <w:tblPr/>
     </w:tblStylePr>
   </w:style>
-  <w:style w:type="table" w:customStyle="1" w:styleId="65">
+  <w:style w:type="table" w:customStyle="1" w:styleId="66">
     <w:name w:val="Grid Table 4 - Accent 1"/>
     <w:basedOn w:val="12"/>
     <w:uiPriority w:val="59"/>
@@ -11566,7 +11866,7 @@
       <w:tblPr/>
     </w:tblStylePr>
   </w:style>
-  <w:style w:type="table" w:customStyle="1" w:styleId="66">
+  <w:style w:type="table" w:customStyle="1" w:styleId="67">
     <w:name w:val="Grid Table 4 - Accent 2"/>
     <w:basedOn w:val="12"/>
     <w:uiPriority w:val="59"/>
@@ -11668,7 +11968,7 @@
       <w:tblPr/>
     </w:tblStylePr>
   </w:style>
-  <w:style w:type="table" w:customStyle="1" w:styleId="67">
+  <w:style w:type="table" w:customStyle="1" w:styleId="68">
     <w:name w:val="Grid Table 4 - Accent 3"/>
     <w:basedOn w:val="12"/>
     <w:uiPriority w:val="59"/>
@@ -11770,7 +12070,7 @@
       <w:tblPr/>
     </w:tblStylePr>
   </w:style>
-  <w:style w:type="table" w:customStyle="1" w:styleId="68">
+  <w:style w:type="table" w:customStyle="1" w:styleId="69">
     <w:name w:val="Grid Table 4 - Accent 4"/>
     <w:basedOn w:val="12"/>
     <w:uiPriority w:val="59"/>
@@ -11872,7 +12172,7 @@
       <w:tblPr/>
     </w:tblStylePr>
   </w:style>
-  <w:style w:type="table" w:customStyle="1" w:styleId="69">
+  <w:style w:type="table" w:customStyle="1" w:styleId="70">
     <w:name w:val="Grid Table 4 - Accent 5"/>
     <w:basedOn w:val="12"/>
     <w:uiPriority w:val="59"/>
@@ -11974,7 +12274,7 @@
       <w:tblPr/>
     </w:tblStylePr>
   </w:style>
-  <w:style w:type="table" w:customStyle="1" w:styleId="70">
+  <w:style w:type="table" w:customStyle="1" w:styleId="71">
     <w:name w:val="Grid Table 4 - Accent 6"/>
     <w:basedOn w:val="12"/>
     <w:uiPriority w:val="59"/>
@@ -12076,7 +12376,7 @@
       <w:tblPr/>
     </w:tblStylePr>
   </w:style>
-  <w:style w:type="table" w:customStyle="1" w:styleId="71">
+  <w:style w:type="table" w:customStyle="1" w:styleId="72">
     <w:name w:val="Grid Table 5 Dark"/>
     <w:basedOn w:val="12"/>
     <w:uiPriority w:val="99"/>
@@ -12175,7 +12475,7 @@
       <w:tblPr/>
     </w:tblStylePr>
   </w:style>
-  <w:style w:type="table" w:customStyle="1" w:styleId="72">
+  <w:style w:type="table" w:customStyle="1" w:styleId="73">
     <w:name w:val="Grid Table 5 Dark- Accent 1"/>
     <w:basedOn w:val="12"/>
     <w:uiPriority w:val="99"/>
@@ -12274,7 +12574,7 @@
       <w:tblPr/>
     </w:tblStylePr>
   </w:style>
-  <w:style w:type="table" w:customStyle="1" w:styleId="73">
+  <w:style w:type="table" w:customStyle="1" w:styleId="74">
     <w:name w:val="Grid Table 5 Dark - Accent 2"/>
     <w:basedOn w:val="12"/>
     <w:uiPriority w:val="99"/>
@@ -12373,7 +12673,7 @@
       <w:tblPr/>
     </w:tblStylePr>
   </w:style>
-  <w:style w:type="table" w:customStyle="1" w:styleId="74">
+  <w:style w:type="table" w:customStyle="1" w:styleId="75">
     <w:name w:val="Grid Table 5 Dark - Accent 3"/>
     <w:basedOn w:val="12"/>
     <w:uiPriority w:val="99"/>
@@ -12472,7 +12772,7 @@
       <w:tblPr/>
     </w:tblStylePr>
   </w:style>
-  <w:style w:type="table" w:customStyle="1" w:styleId="75">
+  <w:style w:type="table" w:customStyle="1" w:styleId="76">
     <w:name w:val="Grid Table 5 Dark- Accent 4"/>
     <w:basedOn w:val="12"/>
     <w:uiPriority w:val="99"/>
@@ -12571,7 +12871,7 @@
       <w:tblPr/>
     </w:tblStylePr>
   </w:style>
-  <w:style w:type="table" w:customStyle="1" w:styleId="76">
+  <w:style w:type="table" w:customStyle="1" w:styleId="77">
     <w:name w:val="Grid Table 5 Dark - Accent 5"/>
     <w:basedOn w:val="12"/>
     <w:uiPriority w:val="99"/>
@@ -12670,7 +12970,7 @@
       <w:tblPr/>
     </w:tblStylePr>
   </w:style>
-  <w:style w:type="table" w:customStyle="1" w:styleId="77">
+  <w:style w:type="table" w:customStyle="1" w:styleId="78">
     <w:name w:val="Grid Table 5 Dark - Accent 6"/>
     <w:basedOn w:val="12"/>
     <w:uiPriority w:val="99"/>
@@ -12769,7 +13069,7 @@
       <w:tblPr/>
     </w:tblStylePr>
   </w:style>
-  <w:style w:type="table" w:customStyle="1" w:styleId="78">
+  <w:style w:type="table" w:customStyle="1" w:styleId="79">
     <w:name w:val="Grid Table 6 Colorful"/>
     <w:basedOn w:val="12"/>
     <w:uiPriority w:val="99"/>
@@ -12908,7 +13208,7 @@
       <w:tblPr/>
     </w:tblStylePr>
   </w:style>
-  <w:style w:type="table" w:customStyle="1" w:styleId="79">
+  <w:style w:type="table" w:customStyle="1" w:styleId="80">
     <w:name w:val="Grid Table 6 Colorful - Accent 1"/>
     <w:basedOn w:val="12"/>
     <w:uiPriority w:val="99"/>
@@ -13047,7 +13347,7 @@
       <w:tblPr/>
     </w:tblStylePr>
   </w:style>
-  <w:style w:type="table" w:customStyle="1" w:styleId="80">
+  <w:style w:type="table" w:customStyle="1" w:styleId="81">
     <w:name w:val="Grid Table 6 Colorful - Accent 2"/>
     <w:basedOn w:val="12"/>
     <w:uiPriority w:val="99"/>
@@ -13186,7 +13486,7 @@
       <w:tblPr/>
     </w:tblStylePr>
   </w:style>
-  <w:style w:type="table" w:customStyle="1" w:styleId="81">
+  <w:style w:type="table" w:customStyle="1" w:styleId="82">
     <w:name w:val="Grid Table 6 Colorful - Accent 3"/>
     <w:basedOn w:val="12"/>
     <w:uiPriority w:val="99"/>
@@ -13325,7 +13625,7 @@
       <w:tblPr/>
     </w:tblStylePr>
   </w:style>
-  <w:style w:type="table" w:customStyle="1" w:styleId="82">
+  <w:style w:type="table" w:customStyle="1" w:styleId="83">
     <w:name w:val="Grid Table 6 Colorful - Accent 4"/>
     <w:basedOn w:val="12"/>
     <w:uiPriority w:val="99"/>
@@ -13464,7 +13764,7 @@
       <w:tblPr/>
     </w:tblStylePr>
   </w:style>
-  <w:style w:type="table" w:customStyle="1" w:styleId="83">
+  <w:style w:type="table" w:customStyle="1" w:styleId="84">
     <w:name w:val="Grid Table 6 Colorful - Accent 5"/>
     <w:basedOn w:val="12"/>
     <w:uiPriority w:val="99"/>
@@ -13555,7 +13855,7 @@
       <w:tblPr/>
     </w:tblStylePr>
   </w:style>
-  <w:style w:type="table" w:customStyle="1" w:styleId="84">
+  <w:style w:type="table" w:customStyle="1" w:styleId="85">
     <w:name w:val="Grid Table 6 Colorful - Accent 6"/>
     <w:basedOn w:val="12"/>
     <w:uiPriority w:val="99"/>
@@ -13646,7 +13946,7 @@
       <w:tblPr/>
     </w:tblStylePr>
   </w:style>
-  <w:style w:type="table" w:customStyle="1" w:styleId="85">
+  <w:style w:type="table" w:customStyle="1" w:styleId="86">
     <w:name w:val="Grid Table 7 Colorful"/>
     <w:basedOn w:val="12"/>
     <w:uiPriority w:val="99"/>
@@ -13825,7 +14125,7 @@
       <w:tblPr/>
     </w:tblStylePr>
   </w:style>
-  <w:style w:type="table" w:customStyle="1" w:styleId="86">
+  <w:style w:type="table" w:customStyle="1" w:styleId="87">
     <w:name w:val="Grid Table 7 Colorful - Accent 1"/>
     <w:basedOn w:val="12"/>
     <w:uiPriority w:val="99"/>
@@ -14004,7 +14304,7 @@
       <w:tblPr/>
     </w:tblStylePr>
   </w:style>
-  <w:style w:type="table" w:customStyle="1" w:styleId="87">
+  <w:style w:type="table" w:customStyle="1" w:styleId="88">
     <w:name w:val="Grid Table 7 Colorful - Accent 2"/>
     <w:basedOn w:val="12"/>
     <w:uiPriority w:val="99"/>
@@ -14183,7 +14483,7 @@
       <w:tblPr/>
     </w:tblStylePr>
   </w:style>
-  <w:style w:type="table" w:customStyle="1" w:styleId="88">
+  <w:style w:type="table" w:customStyle="1" w:styleId="89">
     <w:name w:val="Grid Table 7 Colorful - Accent 3"/>
     <w:basedOn w:val="12"/>
     <w:uiPriority w:val="99"/>
@@ -14362,7 +14662,7 @@
       <w:tblPr/>
     </w:tblStylePr>
   </w:style>
-  <w:style w:type="table" w:customStyle="1" w:styleId="89">
+  <w:style w:type="table" w:customStyle="1" w:styleId="90">
     <w:name w:val="Grid Table 7 Colorful - Accent 4"/>
     <w:basedOn w:val="12"/>
     <w:uiPriority w:val="99"/>
@@ -14541,7 +14841,7 @@
       <w:tblPr/>
     </w:tblStylePr>
   </w:style>
-  <w:style w:type="table" w:customStyle="1" w:styleId="90">
+  <w:style w:type="table" w:customStyle="1" w:styleId="91">
     <w:name w:val="Grid Table 7 Colorful - Accent 5"/>
     <w:basedOn w:val="12"/>
     <w:uiPriority w:val="99"/>
@@ -14672,7 +14972,7 @@
       <w:tblPr/>
     </w:tblStylePr>
   </w:style>
-  <w:style w:type="table" w:customStyle="1" w:styleId="91">
+  <w:style w:type="table" w:customStyle="1" w:styleId="92">
     <w:name w:val="Grid Table 7 Colorful - Accent 6"/>
     <w:basedOn w:val="12"/>
     <w:uiPriority w:val="99"/>
@@ -14803,7 +15103,7 @@
       <w:tblPr/>
     </w:tblStylePr>
   </w:style>
-  <w:style w:type="table" w:customStyle="1" w:styleId="92">
+  <w:style w:type="table" w:customStyle="1" w:styleId="93">
     <w:name w:val="List Table 1 Light"/>
     <w:basedOn w:val="12"/>
     <w:uiPriority w:val="99"/>
@@ -14886,7 +15186,7 @@
       <w:tblPr/>
     </w:tblStylePr>
   </w:style>
-  <w:style w:type="table" w:customStyle="1" w:styleId="93">
+  <w:style w:type="table" w:customStyle="1" w:styleId="94">
     <w:name w:val="List Table 1 Light - Accent 1"/>
     <w:basedOn w:val="12"/>
     <w:uiPriority w:val="99"/>
@@ -14969,7 +15269,7 @@
       <w:tblPr/>
     </w:tblStylePr>
   </w:style>
-  <w:style w:type="table" w:customStyle="1" w:styleId="94">
+  <w:style w:type="table" w:customStyle="1" w:styleId="95">
     <w:name w:val="List Table 1 Light - Accent 2"/>
     <w:basedOn w:val="12"/>
     <w:uiPriority w:val="99"/>
@@ -15052,7 +15352,7 @@
       <w:tblPr/>
     </w:tblStylePr>
   </w:style>
-  <w:style w:type="table" w:customStyle="1" w:styleId="95">
+  <w:style w:type="table" w:customStyle="1" w:styleId="96">
     <w:name w:val="List Table 1 Light - Accent 3"/>
     <w:basedOn w:val="12"/>
     <w:uiPriority w:val="99"/>
@@ -15135,7 +15435,7 @@
       <w:tblPr/>
     </w:tblStylePr>
   </w:style>
-  <w:style w:type="table" w:customStyle="1" w:styleId="96">
+  <w:style w:type="table" w:customStyle="1" w:styleId="97">
     <w:name w:val="List Table 1 Light - Accent 4"/>
     <w:basedOn w:val="12"/>
     <w:uiPriority w:val="99"/>
@@ -15218,7 +15518,7 @@
       <w:tblPr/>
     </w:tblStylePr>
   </w:style>
-  <w:style w:type="table" w:customStyle="1" w:styleId="97">
+  <w:style w:type="table" w:customStyle="1" w:styleId="98">
     <w:name w:val="List Table 1 Light - Accent 5"/>
     <w:basedOn w:val="12"/>
     <w:uiPriority w:val="99"/>
@@ -15301,7 +15601,7 @@
       <w:tblPr/>
     </w:tblStylePr>
   </w:style>
-  <w:style w:type="table" w:customStyle="1" w:styleId="98">
+  <w:style w:type="table" w:customStyle="1" w:styleId="99">
     <w:name w:val="List Table 1 Light - Accent 6"/>
     <w:basedOn w:val="12"/>
     <w:uiPriority w:val="99"/>
@@ -15384,7 +15684,7 @@
       <w:tblPr/>
     </w:tblStylePr>
   </w:style>
-  <w:style w:type="table" w:customStyle="1" w:styleId="99">
+  <w:style w:type="table" w:customStyle="1" w:styleId="100">
     <w:name w:val="List Table 2"/>
     <w:basedOn w:val="12"/>
     <w:uiPriority w:val="99"/>
@@ -15491,7 +15791,7 @@
       <w:tblPr/>
     </w:tblStylePr>
   </w:style>
-  <w:style w:type="table" w:customStyle="1" w:styleId="100">
+  <w:style w:type="table" w:customStyle="1" w:styleId="101">
     <w:name w:val="List Table 2 - Accent 1"/>
     <w:basedOn w:val="12"/>
     <w:uiPriority w:val="99"/>
@@ -15598,7 +15898,7 @@
       <w:tblPr/>
     </w:tblStylePr>
   </w:style>
-  <w:style w:type="table" w:customStyle="1" w:styleId="101">
+  <w:style w:type="table" w:customStyle="1" w:styleId="102">
     <w:name w:val="List Table 2 - Accent 2"/>
     <w:basedOn w:val="12"/>
     <w:uiPriority w:val="99"/>
@@ -15705,7 +16005,7 @@
       <w:tblPr/>
     </w:tblStylePr>
   </w:style>
-  <w:style w:type="table" w:customStyle="1" w:styleId="102">
+  <w:style w:type="table" w:customStyle="1" w:styleId="103">
     <w:name w:val="List Table 2 - Accent 3"/>
     <w:basedOn w:val="12"/>
     <w:uiPriority w:val="99"/>
@@ -15812,7 +16112,7 @@
       <w:tblPr/>
     </w:tblStylePr>
   </w:style>
-  <w:style w:type="table" w:customStyle="1" w:styleId="103">
+  <w:style w:type="table" w:customStyle="1" w:styleId="104">
     <w:name w:val="List Table 2 - Accent 4"/>
     <w:basedOn w:val="12"/>
     <w:uiPriority w:val="99"/>
@@ -15919,7 +16219,7 @@
       <w:tblPr/>
     </w:tblStylePr>
   </w:style>
-  <w:style w:type="table" w:customStyle="1" w:styleId="104">
+  <w:style w:type="table" w:customStyle="1" w:styleId="105">
     <w:name w:val="List Table 2 - Accent 5"/>
     <w:basedOn w:val="12"/>
     <w:uiPriority w:val="99"/>
@@ -16026,7 +16326,7 @@
       <w:tblPr/>
     </w:tblStylePr>
   </w:style>
-  <w:style w:type="table" w:customStyle="1" w:styleId="105">
+  <w:style w:type="table" w:customStyle="1" w:styleId="106">
     <w:name w:val="List Table 2 - Accent 6"/>
     <w:basedOn w:val="12"/>
     <w:uiPriority w:val="99"/>
@@ -16133,7 +16433,7 @@
       <w:tblPr/>
     </w:tblStylePr>
   </w:style>
-  <w:style w:type="table" w:customStyle="1" w:styleId="106">
+  <w:style w:type="table" w:customStyle="1" w:styleId="107">
     <w:name w:val="List Table 3"/>
     <w:basedOn w:val="12"/>
     <w:uiPriority w:val="99"/>
@@ -16228,7 +16528,7 @@
       <w:tblPr/>
     </w:tblStylePr>
   </w:style>
-  <w:style w:type="table" w:customStyle="1" w:styleId="107">
+  <w:style w:type="table" w:customStyle="1" w:styleId="108">
     <w:name w:val="List Table 3 - Accent 1"/>
     <w:basedOn w:val="12"/>
     <w:uiPriority w:val="99"/>
@@ -16323,7 +16623,7 @@
       <w:tblPr/>
     </w:tblStylePr>
   </w:style>
-  <w:style w:type="table" w:customStyle="1" w:styleId="108">
+  <w:style w:type="table" w:customStyle="1" w:styleId="109">
     <w:name w:val="List Table 3 - Accent 2"/>
     <w:basedOn w:val="12"/>
     <w:uiPriority w:val="99"/>
@@ -16418,7 +16718,7 @@
       <w:tblPr/>
     </w:tblStylePr>
   </w:style>
-  <w:style w:type="table" w:customStyle="1" w:styleId="109">
+  <w:style w:type="table" w:customStyle="1" w:styleId="110">
     <w:name w:val="List Table 3 - Accent 3"/>
     <w:basedOn w:val="12"/>
     <w:uiPriority w:val="99"/>
@@ -16513,7 +16813,7 @@
       <w:tblPr/>
     </w:tblStylePr>
   </w:style>
-  <w:style w:type="table" w:customStyle="1" w:styleId="110">
+  <w:style w:type="table" w:customStyle="1" w:styleId="111">
     <w:name w:val="List Table 3 - Accent 4"/>
     <w:basedOn w:val="12"/>
     <w:uiPriority w:val="99"/>
@@ -16608,7 +16908,7 @@
       <w:tblPr/>
     </w:tblStylePr>
   </w:style>
-  <w:style w:type="table" w:customStyle="1" w:styleId="111">
+  <w:style w:type="table" w:customStyle="1" w:styleId="112">
     <w:name w:val="List Table 3 - Accent 5"/>
     <w:basedOn w:val="12"/>
     <w:uiPriority w:val="99"/>
@@ -16703,7 +17003,7 @@
       <w:tblPr/>
     </w:tblStylePr>
   </w:style>
-  <w:style w:type="table" w:customStyle="1" w:styleId="112">
+  <w:style w:type="table" w:customStyle="1" w:styleId="113">
     <w:name w:val="List Table 3 - Accent 6"/>
     <w:basedOn w:val="12"/>
     <w:uiPriority w:val="99"/>
@@ -16798,7 +17098,7 @@
       <w:tblPr/>
     </w:tblStylePr>
   </w:style>
-  <w:style w:type="table" w:customStyle="1" w:styleId="113">
+  <w:style w:type="table" w:customStyle="1" w:styleId="114">
     <w:name w:val="List Table 4"/>
     <w:basedOn w:val="12"/>
     <w:uiPriority w:val="99"/>
@@ -16888,7 +17188,7 @@
       <w:tblPr/>
     </w:tblStylePr>
   </w:style>
-  <w:style w:type="table" w:customStyle="1" w:styleId="114">
+  <w:style w:type="table" w:customStyle="1" w:styleId="115">
     <w:name w:val="List Table 4 - Accent 1"/>
     <w:basedOn w:val="12"/>
     <w:uiPriority w:val="99"/>
@@ -16978,7 +17278,7 @@
       <w:tblPr/>
     </w:tblStylePr>
   </w:style>
-  <w:style w:type="table" w:customStyle="1" w:styleId="115">
+  <w:style w:type="table" w:customStyle="1" w:styleId="116">
     <w:name w:val="List Table 4 - Accent 2"/>
     <w:basedOn w:val="12"/>
     <w:uiPriority w:val="99"/>
@@ -17068,7 +17368,7 @@
       <w:tblPr/>
     </w:tblStylePr>
   </w:style>
-  <w:style w:type="table" w:customStyle="1" w:styleId="116">
+  <w:style w:type="table" w:customStyle="1" w:styleId="117">
     <w:name w:val="List Table 4 - Accent 3"/>
     <w:basedOn w:val="12"/>
     <w:uiPriority w:val="99"/>
@@ -17158,7 +17458,7 @@
       <w:tblPr/>
     </w:tblStylePr>
   </w:style>
-  <w:style w:type="table" w:customStyle="1" w:styleId="117">
+  <w:style w:type="table" w:customStyle="1" w:styleId="118">
     <w:name w:val="List Table 4 - Accent 4"/>
     <w:basedOn w:val="12"/>
     <w:uiPriority w:val="99"/>
@@ -17248,7 +17548,7 @@
       <w:tblPr/>
     </w:tblStylePr>
   </w:style>
-  <w:style w:type="table" w:customStyle="1" w:styleId="118">
+  <w:style w:type="table" w:customStyle="1" w:styleId="119">
     <w:name w:val="List Table 4 - Accent 5"/>
     <w:basedOn w:val="12"/>
     <w:uiPriority w:val="99"/>
@@ -17338,7 +17638,7 @@
       <w:tblPr/>
     </w:tblStylePr>
   </w:style>
-  <w:style w:type="table" w:customStyle="1" w:styleId="119">
+  <w:style w:type="table" w:customStyle="1" w:styleId="120">
     <w:name w:val="List Table 4 - Accent 6"/>
     <w:basedOn w:val="12"/>
     <w:uiPriority w:val="99"/>
@@ -17428,7 +17728,7 @@
       <w:tblPr/>
     </w:tblStylePr>
   </w:style>
-  <w:style w:type="table" w:customStyle="1" w:styleId="120">
+  <w:style w:type="table" w:customStyle="1" w:styleId="121">
     <w:name w:val="List Table 5 Dark"/>
     <w:basedOn w:val="12"/>
     <w:uiPriority w:val="99"/>
@@ -17559,7 +17859,7 @@
       <w:tblPr/>
     </w:tblStylePr>
   </w:style>
-  <w:style w:type="table" w:customStyle="1" w:styleId="121">
+  <w:style w:type="table" w:customStyle="1" w:styleId="122">
     <w:name w:val="List Table 5 Dark - Accent 1"/>
     <w:basedOn w:val="12"/>
     <w:uiPriority w:val="99"/>
@@ -17690,7 +17990,7 @@
       <w:tblPr/>
     </w:tblStylePr>
   </w:style>
-  <w:style w:type="table" w:customStyle="1" w:styleId="122">
+  <w:style w:type="table" w:customStyle="1" w:styleId="123">
     <w:name w:val="List Table 5 Dark - Accent 2"/>
     <w:basedOn w:val="12"/>
     <w:uiPriority w:val="99"/>
@@ -17821,7 +18121,7 @@
       <w:tblPr/>
     </w:tblStylePr>
   </w:style>
-  <w:style w:type="table" w:customStyle="1" w:styleId="123">
+  <w:style w:type="table" w:customStyle="1" w:styleId="124">
     <w:name w:val="List Table 5 Dark - Accent 3"/>
     <w:basedOn w:val="12"/>
     <w:uiPriority w:val="99"/>
@@ -17952,7 +18252,7 @@
       <w:tblPr/>
     </w:tblStylePr>
   </w:style>
-  <w:style w:type="table" w:customStyle="1" w:styleId="124">
+  <w:style w:type="table" w:customStyle="1" w:styleId="125">
     <w:name w:val="List Table 5 Dark - Accent 4"/>
     <w:basedOn w:val="12"/>
     <w:uiPriority w:val="99"/>
@@ -18083,7 +18383,7 @@
       <w:tblPr/>
     </w:tblStylePr>
   </w:style>
-  <w:style w:type="table" w:customStyle="1" w:styleId="125">
+  <w:style w:type="table" w:customStyle="1" w:styleId="126">
     <w:name w:val="List Table 5 Dark - Accent 5"/>
     <w:basedOn w:val="12"/>
     <w:uiPriority w:val="99"/>
@@ -18214,7 +18514,7 @@
       <w:tblPr/>
     </w:tblStylePr>
   </w:style>
-  <w:style w:type="table" w:customStyle="1" w:styleId="126">
+  <w:style w:type="table" w:customStyle="1" w:styleId="127">
     <w:name w:val="List Table 5 Dark - Accent 6"/>
     <w:basedOn w:val="12"/>
     <w:uiPriority w:val="99"/>
@@ -18345,7 +18645,7 @@
       <w:tblPr/>
     </w:tblStylePr>
   </w:style>
-  <w:style w:type="table" w:customStyle="1" w:styleId="127">
+  <w:style w:type="table" w:customStyle="1" w:styleId="128">
     <w:name w:val="List Table 6 Colorful"/>
     <w:basedOn w:val="12"/>
     <w:uiPriority w:val="99"/>
@@ -18467,7 +18767,7 @@
       <w:tblPr/>
     </w:tblStylePr>
   </w:style>
-  <w:style w:type="table" w:customStyle="1" w:styleId="128">
+  <w:style w:type="table" w:customStyle="1" w:styleId="129">
     <w:name w:val="List Table 6 Colorful - Accent 1"/>
     <w:basedOn w:val="12"/>
     <w:uiPriority w:val="99"/>
@@ -18559,7 +18859,7 @@
       <w:tblPr/>
     </w:tblStylePr>
   </w:style>
-  <w:style w:type="table" w:customStyle="1" w:styleId="129">
+  <w:style w:type="table" w:customStyle="1" w:styleId="130">
     <w:name w:val="List Table 6 Colorful - Accent 2"/>
     <w:basedOn w:val="12"/>
     <w:uiPriority w:val="99"/>
@@ -18699,7 +18999,7 @@
       <w:tblPr/>
     </w:tblStylePr>
   </w:style>
-  <w:style w:type="table" w:customStyle="1" w:styleId="130">
+  <w:style w:type="table" w:customStyle="1" w:styleId="131">
     <w:name w:val="List Table 6 Colorful - Accent 3"/>
     <w:basedOn w:val="12"/>
     <w:uiPriority w:val="99"/>
@@ -18839,7 +19139,7 @@
       <w:tblPr/>
     </w:tblStylePr>
   </w:style>
-  <w:style w:type="table" w:customStyle="1" w:styleId="131">
+  <w:style w:type="table" w:customStyle="1" w:styleId="132">
     <w:name w:val="List Table 6 Colorful - Accent 4"/>
     <w:basedOn w:val="12"/>
     <w:uiPriority w:val="99"/>
@@ -18979,7 +19279,7 @@
       <w:tblPr/>
     </w:tblStylePr>
   </w:style>
-  <w:style w:type="table" w:customStyle="1" w:styleId="132">
+  <w:style w:type="table" w:customStyle="1" w:styleId="133">
     <w:name w:val="List Table 6 Colorful - Accent 5"/>
     <w:basedOn w:val="12"/>
     <w:uiPriority w:val="99"/>
@@ -19119,7 +19419,7 @@
       <w:tblPr/>
     </w:tblStylePr>
   </w:style>
-  <w:style w:type="table" w:customStyle="1" w:styleId="133">
+  <w:style w:type="table" w:customStyle="1" w:styleId="134">
     <w:name w:val="List Table 6 Colorful - Accent 6"/>
     <w:basedOn w:val="12"/>
     <w:uiPriority w:val="99"/>
@@ -19259,7 +19559,7 @@
       <w:tblPr/>
     </w:tblStylePr>
   </w:style>
-  <w:style w:type="table" w:customStyle="1" w:styleId="134">
+  <w:style w:type="table" w:customStyle="1" w:styleId="135">
     <w:name w:val="List Table 7 Colorful"/>
     <w:basedOn w:val="12"/>
     <w:uiPriority w:val="99"/>
@@ -19435,7 +19735,7 @@
       <w:tblPr/>
     </w:tblStylePr>
   </w:style>
-  <w:style w:type="table" w:customStyle="1" w:styleId="135">
+  <w:style w:type="table" w:customStyle="1" w:styleId="136">
     <w:name w:val="List Table 7 Colorful - Accent 1"/>
     <w:basedOn w:val="12"/>
     <w:uiPriority w:val="99"/>
@@ -19563,7 +19863,7 @@
       <w:tblPr/>
     </w:tblStylePr>
   </w:style>
-  <w:style w:type="table" w:customStyle="1" w:styleId="136">
+  <w:style w:type="table" w:customStyle="1" w:styleId="137">
     <w:name w:val="List Table 7 Colorful - Accent 2"/>
     <w:basedOn w:val="12"/>
     <w:uiPriority w:val="99"/>
@@ -19739,7 +20039,7 @@
       <w:tblPr/>
     </w:tblStylePr>
   </w:style>
-  <w:style w:type="table" w:customStyle="1" w:styleId="137">
+  <w:style w:type="table" w:customStyle="1" w:styleId="138">
     <w:name w:val="List Table 7 Colorful - Accent 3"/>
     <w:basedOn w:val="12"/>
     <w:uiPriority w:val="99"/>
@@ -19915,7 +20215,7 @@
       <w:tblPr/>
     </w:tblStylePr>
   </w:style>
-  <w:style w:type="table" w:customStyle="1" w:styleId="138">
+  <w:style w:type="table" w:customStyle="1" w:styleId="139">
     <w:name w:val="List Table 7 Colorful - Accent 4"/>
     <w:basedOn w:val="12"/>
     <w:uiPriority w:val="99"/>
@@ -20091,7 +20391,7 @@
       <w:tblPr/>
     </w:tblStylePr>
   </w:style>
-  <w:style w:type="table" w:customStyle="1" w:styleId="139">
+  <w:style w:type="table" w:customStyle="1" w:styleId="140">
     <w:name w:val="List Table 7 Colorful - Accent 5"/>
     <w:basedOn w:val="12"/>
     <w:uiPriority w:val="99"/>
@@ -20267,7 +20567,7 @@
       <w:tblPr/>
     </w:tblStylePr>
   </w:style>
-  <w:style w:type="table" w:customStyle="1" w:styleId="140">
+  <w:style w:type="table" w:customStyle="1" w:styleId="141">
     <w:name w:val="List Table 7 Colorful - Accent 6"/>
     <w:basedOn w:val="12"/>
     <w:uiPriority w:val="99"/>
@@ -20443,7 +20743,7 @@
       <w:tblPr/>
     </w:tblStylePr>
   </w:style>
-  <w:style w:type="table" w:customStyle="1" w:styleId="141">
+  <w:style w:type="table" w:customStyle="1" w:styleId="142">
     <w:name w:val="Lined - Accent"/>
     <w:basedOn w:val="12"/>
     <w:uiPriority w:val="99"/>
@@ -20549,7 +20849,7 @@
       <w:tblPr/>
     </w:tblStylePr>
   </w:style>
-  <w:style w:type="table" w:customStyle="1" w:styleId="142">
+  <w:style w:type="table" w:customStyle="1" w:styleId="143">
     <w:name w:val="Lined - Accent 1"/>
     <w:basedOn w:val="12"/>
     <w:uiPriority w:val="99"/>
@@ -20655,7 +20955,7 @@
       <w:tblPr/>
     </w:tblStylePr>
   </w:style>
-  <w:style w:type="table" w:customStyle="1" w:styleId="143">
+  <w:style w:type="table" w:customStyle="1" w:styleId="144">
     <w:name w:val="Lined - Accent 2"/>
     <w:basedOn w:val="12"/>
     <w:uiPriority w:val="99"/>
@@ -20761,7 +21061,7 @@
       <w:tblPr/>
     </w:tblStylePr>
   </w:style>
-  <w:style w:type="table" w:customStyle="1" w:styleId="144">
+  <w:style w:type="table" w:customStyle="1" w:styleId="145">
     <w:name w:val="Lined - Accent 3"/>
     <w:basedOn w:val="12"/>
     <w:uiPriority w:val="99"/>
@@ -20867,7 +21167,7 @@
       <w:tblPr/>
     </w:tblStylePr>
   </w:style>
-  <w:style w:type="table" w:customStyle="1" w:styleId="145">
+  <w:style w:type="table" w:customStyle="1" w:styleId="146">
     <w:name w:val="Lined - Accent 4"/>
     <w:basedOn w:val="12"/>
     <w:uiPriority w:val="99"/>
@@ -20973,7 +21273,7 @@
       <w:tblPr/>
     </w:tblStylePr>
   </w:style>
-  <w:style w:type="table" w:customStyle="1" w:styleId="146">
+  <w:style w:type="table" w:customStyle="1" w:styleId="147">
     <w:name w:val="Lined - Accent 5"/>
     <w:basedOn w:val="12"/>
     <w:uiPriority w:val="99"/>
@@ -21079,7 +21379,7 @@
       <w:tblPr/>
     </w:tblStylePr>
   </w:style>
-  <w:style w:type="table" w:customStyle="1" w:styleId="147">
+  <w:style w:type="table" w:customStyle="1" w:styleId="148">
     <w:name w:val="Lined - Accent 6"/>
     <w:basedOn w:val="12"/>
     <w:uiPriority w:val="99"/>
@@ -21185,7 +21485,7 @@
       <w:tblPr/>
     </w:tblStylePr>
   </w:style>
-  <w:style w:type="table" w:customStyle="1" w:styleId="148">
+  <w:style w:type="table" w:customStyle="1" w:styleId="149">
     <w:name w:val="Bordered &amp; Lined - Accent"/>
     <w:basedOn w:val="12"/>
     <w:uiPriority w:val="99"/>
@@ -21300,7 +21600,7 @@
       <w:tblPr/>
     </w:tblStylePr>
   </w:style>
-  <w:style w:type="table" w:customStyle="1" w:styleId="149">
+  <w:style w:type="table" w:customStyle="1" w:styleId="150">
     <w:name w:val="Bordered &amp; Lined - Accent 1"/>
     <w:basedOn w:val="12"/>
     <w:uiPriority w:val="99"/>
@@ -21415,7 +21715,7 @@
       <w:tblPr/>
     </w:tblStylePr>
   </w:style>
-  <w:style w:type="table" w:customStyle="1" w:styleId="150">
+  <w:style w:type="table" w:customStyle="1" w:styleId="151">
     <w:name w:val="Bordered &amp; Lined - Accent 2"/>
     <w:basedOn w:val="12"/>
     <w:uiPriority w:val="99"/>
@@ -21530,7 +21830,7 @@
       <w:tblPr/>
     </w:tblStylePr>
   </w:style>
-  <w:style w:type="table" w:customStyle="1" w:styleId="151">
+  <w:style w:type="table" w:customStyle="1" w:styleId="152">
     <w:name w:val="Bordered &amp; Lined - Accent 3"/>
     <w:basedOn w:val="12"/>
     <w:uiPriority w:val="99"/>
@@ -21645,7 +21945,7 @@
       <w:tblPr/>
     </w:tblStylePr>
   </w:style>
-  <w:style w:type="table" w:customStyle="1" w:styleId="152">
+  <w:style w:type="table" w:customStyle="1" w:styleId="153">
     <w:name w:val="Bordered &amp; Lined - Accent 4"/>
     <w:basedOn w:val="12"/>
     <w:uiPriority w:val="99"/>
@@ -21760,7 +22060,7 @@
       <w:tblPr/>
     </w:tblStylePr>
   </w:style>
-  <w:style w:type="table" w:customStyle="1" w:styleId="153">
+  <w:style w:type="table" w:customStyle="1" w:styleId="154">
     <w:name w:val="Bordered &amp; Lined - Accent 5"/>
     <w:basedOn w:val="12"/>
     <w:uiPriority w:val="99"/>
@@ -21875,7 +22175,7 @@
       <w:tblPr/>
     </w:tblStylePr>
   </w:style>
-  <w:style w:type="table" w:customStyle="1" w:styleId="154">
+  <w:style w:type="table" w:customStyle="1" w:styleId="155">
     <w:name w:val="Bordered &amp; Lined - Accent 6"/>
     <w:basedOn w:val="12"/>
     <w:uiPriority w:val="99"/>
@@ -21990,7 +22290,7 @@
       <w:tblPr/>
     </w:tblStylePr>
   </w:style>
-  <w:style w:type="table" w:customStyle="1" w:styleId="155">
+  <w:style w:type="table" w:customStyle="1" w:styleId="156">
     <w:name w:val="Bordered"/>
     <w:basedOn w:val="12"/>
     <w:uiPriority w:val="99"/>
@@ -22092,7 +22392,7 @@
       <w:tblPr/>
     </w:tblStylePr>
   </w:style>
-  <w:style w:type="table" w:customStyle="1" w:styleId="156">
+  <w:style w:type="table" w:customStyle="1" w:styleId="157">
     <w:name w:val="Bordered - Accent 1"/>
     <w:basedOn w:val="12"/>
     <w:uiPriority w:val="99"/>
@@ -22194,7 +22494,7 @@
       <w:tblPr/>
     </w:tblStylePr>
   </w:style>
-  <w:style w:type="table" w:customStyle="1" w:styleId="157">
+  <w:style w:type="table" w:customStyle="1" w:styleId="158">
     <w:name w:val="Bordered - Accent 2"/>
     <w:basedOn w:val="12"/>
     <w:uiPriority w:val="99"/>
@@ -22296,7 +22596,7 @@
       <w:tblPr/>
     </w:tblStylePr>
   </w:style>
-  <w:style w:type="table" w:customStyle="1" w:styleId="158">
+  <w:style w:type="table" w:customStyle="1" w:styleId="159">
     <w:name w:val="Bordered - Accent 3"/>
     <w:basedOn w:val="12"/>
     <w:uiPriority w:val="99"/>
@@ -22398,7 +22698,7 @@
       <w:tblPr/>
     </w:tblStylePr>
   </w:style>
-  <w:style w:type="table" w:customStyle="1" w:styleId="159">
+  <w:style w:type="table" w:customStyle="1" w:styleId="160">
     <w:name w:val="Bordered - Accent 4"/>
     <w:basedOn w:val="12"/>
     <w:uiPriority w:val="99"/>
@@ -22500,7 +22800,7 @@
       <w:tblPr/>
     </w:tblStylePr>
   </w:style>
-  <w:style w:type="table" w:customStyle="1" w:styleId="160">
+  <w:style w:type="table" w:customStyle="1" w:styleId="161">
     <w:name w:val="Bordered - Accent 5"/>
     <w:basedOn w:val="12"/>
     <w:uiPriority w:val="99"/>
@@ -22602,7 +22902,7 @@
       <w:tblPr/>
     </w:tblStylePr>
   </w:style>
-  <w:style w:type="table" w:customStyle="1" w:styleId="161">
+  <w:style w:type="table" w:customStyle="1" w:styleId="162">
     <w:name w:val="Bordered - Accent 6"/>
     <w:basedOn w:val="12"/>
     <w:uiPriority w:val="99"/>
@@ -22704,7 +23004,7 @@
       <w:tblPr/>
     </w:tblStylePr>
   </w:style>
-  <w:style w:type="character" w:customStyle="1" w:styleId="162">
+  <w:style w:type="character" w:customStyle="1" w:styleId="163">
     <w:name w:val="Heading 1 Char"/>
     <w:basedOn w:val="11"/>
     <w:link w:val="2"/>
@@ -22716,7 +23016,7 @@
       <w:szCs w:val="40"/>
     </w:rPr>
   </w:style>
-  <w:style w:type="character" w:customStyle="1" w:styleId="163">
+  <w:style w:type="character" w:customStyle="1" w:styleId="164">
     <w:name w:val="Heading 2 Char"/>
     <w:basedOn w:val="11"/>
     <w:link w:val="3"/>
@@ -22728,7 +23028,7 @@
       <w:szCs w:val="32"/>
     </w:rPr>
   </w:style>
-  <w:style w:type="character" w:customStyle="1" w:styleId="164">
+  <w:style w:type="character" w:customStyle="1" w:styleId="165">
     <w:name w:val="Heading 3 Char"/>
     <w:basedOn w:val="11"/>
     <w:link w:val="4"/>
@@ -22740,7 +23040,7 @@
       <w:szCs w:val="28"/>
     </w:rPr>
   </w:style>
-  <w:style w:type="character" w:customStyle="1" w:styleId="165">
+  <w:style w:type="character" w:customStyle="1" w:styleId="166">
     <w:name w:val="Heading 4 Char"/>
     <w:basedOn w:val="11"/>
     <w:link w:val="5"/>
@@ -22752,7 +23052,7 @@
       <w:color w:val="2E75B6" w:themeColor="accent1" w:themeShade="BF"/>
     </w:rPr>
   </w:style>
-  <w:style w:type="character" w:customStyle="1" w:styleId="166">
+  <w:style w:type="character" w:customStyle="1" w:styleId="167">
     <w:name w:val="Heading 5 Char"/>
     <w:basedOn w:val="11"/>
     <w:link w:val="6"/>
@@ -22762,7 +23062,7 @@
       <w:color w:val="2E75B6" w:themeColor="accent1" w:themeShade="BF"/>
     </w:rPr>
   </w:style>
-  <w:style w:type="character" w:customStyle="1" w:styleId="167">
+  <w:style w:type="character" w:customStyle="1" w:styleId="168">
     <w:name w:val="Heading 6 Char"/>
     <w:basedOn w:val="11"/>
     <w:link w:val="7"/>
@@ -22782,7 +23082,7 @@
       </w14:textFill>
     </w:rPr>
   </w:style>
-  <w:style w:type="character" w:customStyle="1" w:styleId="168">
+  <w:style w:type="character" w:customStyle="1" w:styleId="169">
     <w:name w:val="Heading 7 Char"/>
     <w:basedOn w:val="11"/>
     <w:link w:val="8"/>
@@ -22800,7 +23100,7 @@
       </w14:textFill>
     </w:rPr>
   </w:style>
-  <w:style w:type="character" w:customStyle="1" w:styleId="169">
+  <w:style w:type="character" w:customStyle="1" w:styleId="170">
     <w:name w:val="Heading 8 Char"/>
     <w:basedOn w:val="11"/>
     <w:link w:val="9"/>
@@ -22820,7 +23120,7 @@
       </w14:textFill>
     </w:rPr>
   </w:style>
-  <w:style w:type="character" w:customStyle="1" w:styleId="170">
+  <w:style w:type="character" w:customStyle="1" w:styleId="171">
     <w:name w:val="Heading 9 Char"/>
     <w:basedOn w:val="11"/>
     <w:link w:val="10"/>
@@ -22840,10 +23140,10 @@
       </w14:textFill>
     </w:rPr>
   </w:style>
-  <w:style w:type="character" w:customStyle="1" w:styleId="171">
+  <w:style w:type="character" w:customStyle="1" w:styleId="172">
     <w:name w:val="Title Char"/>
     <w:basedOn w:val="11"/>
-    <w:link w:val="27"/>
+    <w:link w:val="28"/>
     <w:uiPriority w:val="10"/>
     <w:rPr>
       <w:rFonts w:ascii="Arial" w:hAnsi="Arial" w:eastAsia="Arial" w:cs="Arial"/>
@@ -22852,10 +23152,10 @@
       <w:szCs w:val="56"/>
     </w:rPr>
   </w:style>
-  <w:style w:type="character" w:customStyle="1" w:styleId="172">
+  <w:style w:type="character" w:customStyle="1" w:styleId="173">
     <w:name w:val="Subtitle Char"/>
     <w:basedOn w:val="11"/>
-    <w:link w:val="24"/>
+    <w:link w:val="25"/>
     <w:uiPriority w:val="11"/>
     <w:rPr>
       <w:color w:val="595959" w:themeColor="text1" w:themeTint="A6"/>
@@ -22872,11 +23172,11 @@
       </w14:textFill>
     </w:rPr>
   </w:style>
-  <w:style w:type="paragraph" w:styleId="173">
+  <w:style w:type="paragraph" w:styleId="174">
     <w:name w:val="Quote"/>
     <w:basedOn w:val="1"/>
     <w:next w:val="1"/>
-    <w:link w:val="174"/>
+    <w:link w:val="175"/>
     <w:qFormat/>
     <w:uiPriority w:val="29"/>
     <w:pPr>
@@ -22897,10 +23197,10 @@
       </w14:textFill>
     </w:rPr>
   </w:style>
-  <w:style w:type="character" w:customStyle="1" w:styleId="174">
+  <w:style w:type="character" w:customStyle="1" w:styleId="175">
     <w:name w:val="Quote Char"/>
     <w:basedOn w:val="11"/>
-    <w:link w:val="173"/>
+    <w:link w:val="174"/>
     <w:uiPriority w:val="29"/>
     <w:rPr>
       <w:i/>
@@ -22916,7 +23216,7 @@
       </w14:textFill>
     </w:rPr>
   </w:style>
-  <w:style w:type="character" w:customStyle="1" w:styleId="175">
+  <w:style w:type="character" w:customStyle="1" w:styleId="176">
     <w:name w:val="Intense Emphasis"/>
     <w:basedOn w:val="11"/>
     <w:qFormat/>
@@ -22927,11 +23227,11 @@
       <w:color w:val="2E75B6" w:themeColor="accent1" w:themeShade="BF"/>
     </w:rPr>
   </w:style>
-  <w:style w:type="paragraph" w:styleId="176">
+  <w:style w:type="paragraph" w:styleId="177">
     <w:name w:val="Intense Quote"/>
     <w:basedOn w:val="1"/>
     <w:next w:val="1"/>
-    <w:link w:val="177"/>
+    <w:link w:val="178"/>
     <w:qFormat/>
     <w:uiPriority w:val="30"/>
     <w:pPr>
@@ -22949,10 +23249,10 @@
       <w:color w:val="2E75B6" w:themeColor="accent1" w:themeShade="BF"/>
     </w:rPr>
   </w:style>
-  <w:style w:type="character" w:customStyle="1" w:styleId="177">
+  <w:style w:type="character" w:customStyle="1" w:styleId="178">
     <w:name w:val="Intense Quote Char"/>
     <w:basedOn w:val="11"/>
-    <w:link w:val="176"/>
+    <w:link w:val="177"/>
     <w:uiPriority w:val="30"/>
     <w:rPr>
       <w:i/>
@@ -22960,7 +23260,7 @@
       <w:color w:val="2E75B6" w:themeColor="accent1" w:themeShade="BF"/>
     </w:rPr>
   </w:style>
-  <w:style w:type="character" w:customStyle="1" w:styleId="178">
+  <w:style w:type="character" w:customStyle="1" w:styleId="179">
     <w:name w:val="Intense Reference"/>
     <w:basedOn w:val="11"/>
     <w:qFormat/>
@@ -22973,7 +23273,7 @@
       <w:spacing w:val="5"/>
     </w:rPr>
   </w:style>
-  <w:style w:type="character" w:customStyle="1" w:styleId="179">
+  <w:style w:type="character" w:customStyle="1" w:styleId="180">
     <w:name w:val="Subtle Emphasis"/>
     <w:basedOn w:val="11"/>
     <w:qFormat/>
@@ -22992,7 +23292,7 @@
       </w14:textFill>
     </w:rPr>
   </w:style>
-  <w:style w:type="character" w:customStyle="1" w:styleId="180">
+  <w:style w:type="character" w:customStyle="1" w:styleId="181">
     <w:name w:val="Subtle Reference"/>
     <w:basedOn w:val="11"/>
     <w:qFormat/>
@@ -23010,7 +23310,7 @@
       </w14:textFill>
     </w:rPr>
   </w:style>
-  <w:style w:type="character" w:customStyle="1" w:styleId="181">
+  <w:style w:type="character" w:customStyle="1" w:styleId="182">
     <w:name w:val="Book Title"/>
     <w:basedOn w:val="11"/>
     <w:qFormat/>
@@ -23023,19 +23323,19 @@
       <w:spacing w:val="5"/>
     </w:rPr>
   </w:style>
-  <w:style w:type="character" w:customStyle="1" w:styleId="182">
+  <w:style w:type="character" w:customStyle="1" w:styleId="183">
     <w:name w:val="Header Char"/>
     <w:basedOn w:val="11"/>
     <w:link w:val="21"/>
     <w:uiPriority w:val="99"/>
   </w:style>
-  <w:style w:type="character" w:customStyle="1" w:styleId="183">
+  <w:style w:type="character" w:customStyle="1" w:styleId="184">
     <w:name w:val="Footer Char"/>
     <w:basedOn w:val="11"/>
     <w:link w:val="18"/>
     <w:uiPriority w:val="99"/>
   </w:style>
-  <w:style w:type="character" w:customStyle="1" w:styleId="184">
+  <w:style w:type="character" w:customStyle="1" w:styleId="185">
     <w:name w:val="Footnote Text Char"/>
     <w:basedOn w:val="11"/>
     <w:link w:val="20"/>
@@ -23046,7 +23346,7 @@
       <w:szCs w:val="20"/>
     </w:rPr>
   </w:style>
-  <w:style w:type="character" w:customStyle="1" w:styleId="185">
+  <w:style w:type="character" w:customStyle="1" w:styleId="186">
     <w:name w:val="Endnote Text Char"/>
     <w:basedOn w:val="11"/>
     <w:link w:val="16"/>
@@ -23057,7 +23357,7 @@
       <w:szCs w:val="20"/>
     </w:rPr>
   </w:style>
-  <w:style w:type="character" w:styleId="186">
+  <w:style w:type="character" w:styleId="187">
     <w:name w:val="Placeholder Text"/>
     <w:basedOn w:val="11"/>
     <w:semiHidden/>
@@ -23066,7 +23366,7 @@
       <w:color w:val="666666"/>
     </w:rPr>
   </w:style>
-  <w:style w:type="paragraph" w:customStyle="1" w:styleId="187">
+  <w:style w:type="paragraph" w:customStyle="1" w:styleId="188">
     <w:name w:val="TOC Heading"/>
     <w:unhideWhenUsed/>
     <w:uiPriority w:val="39"/>
@@ -23080,7 +23380,7 @@
       <w:lang w:val="en-US" w:eastAsia="en-US" w:bidi="ar-SA"/>
     </w:rPr>
   </w:style>
-  <w:style w:type="paragraph" w:styleId="188">
+  <w:style w:type="paragraph" w:styleId="189">
     <w:name w:val="No Spacing"/>
     <w:basedOn w:val="1"/>
     <w:qFormat/>
@@ -23089,7 +23389,7 @@
       <w:spacing w:after="0" w:line="240" w:lineRule="auto"/>
     </w:pPr>
   </w:style>
-  <w:style w:type="paragraph" w:styleId="189">
+  <w:style w:type="paragraph" w:styleId="190">
     <w:name w:val="List Paragraph"/>
     <w:basedOn w:val="1"/>
     <w:qFormat/>

</xml_diff>

<commit_message>
Added table of contents to the final report
</commit_message>
<xml_diff>
--- a/Report/Final Report.docx
+++ b/Report/Final Report.docx
@@ -328,12 +328,6 @@
             <w:insideH w:val="single" w:color="000000" w:sz="4" w:space="0"/>
             <w:insideV w:val="single" w:color="000000" w:sz="4" w:space="0"/>
           </w:tblBorders>
-          <w:tblCellMar>
-            <w:top w:w="0" w:type="dxa"/>
-            <w:left w:w="108" w:type="dxa"/>
-            <w:bottom w:w="0" w:type="dxa"/>
-            <w:right w:w="108" w:type="dxa"/>
-          </w:tblCellMar>
         </w:tblPrEx>
         <w:trPr>
           <w:trHeight w:val="32" w:hRule="atLeast"/>
@@ -969,6 +963,1891 @@
           <w:bottom w:val="none" w:color="000000" w:sz="0" w:space="0"/>
           <w:right w:val="none" w:color="000000" w:sz="0" w:space="0"/>
         </w:pBdr>
+        <w:spacing w:line="240" w:lineRule="auto"/>
+        <w:ind w:left="0" w:right="0" w:firstLine="0"/>
+        <w:rPr>
+          <w:rFonts w:hint="default" w:ascii="Times New Roman" w:hAnsi="Times New Roman" w:eastAsia="Times New Roman" w:cs="Times New Roman"/>
+          <w:b/>
+          <w:bCs/>
+          <w:i w:val="0"/>
+          <w:iCs w:val="0"/>
+          <w:sz w:val="32"/>
+          <w:szCs w:val="32"/>
+        </w:rPr>
+      </w:pPr>
+      <w:r>
+        <w:rPr>
+          <w:rFonts w:hint="default" w:ascii="Times New Roman" w:hAnsi="Times New Roman" w:eastAsia="Times New Roman" w:cs="Times New Roman"/>
+          <w:b/>
+          <w:bCs/>
+          <w:i w:val="0"/>
+          <w:iCs w:val="0"/>
+          <w:sz w:val="32"/>
+          <w:szCs w:val="32"/>
+        </w:rPr>
+        <w:t>Table of Contents</w:t>
+      </w:r>
+    </w:p>
+    <w:p>
+      <w:pPr>
+        <w:pBdr>
+          <w:top w:val="none" w:color="000000" w:sz="0" w:space="0"/>
+          <w:left w:val="none" w:color="000000" w:sz="0" w:space="0"/>
+          <w:bottom w:val="none" w:color="000000" w:sz="0" w:space="0"/>
+          <w:right w:val="none" w:color="000000" w:sz="0" w:space="0"/>
+        </w:pBdr>
+        <w:spacing w:line="240" w:lineRule="auto"/>
+        <w:ind w:left="0" w:right="0" w:firstLine="0"/>
+        <w:rPr>
+          <w:rFonts w:hint="default" w:ascii="Times New Roman" w:hAnsi="Times New Roman" w:eastAsia="Times New Roman" w:cs="Times New Roman"/>
+          <w:b w:val="0"/>
+          <w:bCs w:val="0"/>
+          <w:i w:val="0"/>
+          <w:iCs w:val="0"/>
+          <w:sz w:val="22"/>
+          <w:szCs w:val="22"/>
+        </w:rPr>
+      </w:pPr>
+      <w:r>
+        <w:rPr>
+          <w:rFonts w:hint="default" w:ascii="Times New Roman" w:hAnsi="Times New Roman" w:eastAsia="Times New Roman" w:cs="Times New Roman"/>
+          <w:b/>
+          <w:bCs/>
+          <w:i w:val="0"/>
+          <w:iCs w:val="0"/>
+          <w:sz w:val="22"/>
+          <w:szCs w:val="22"/>
+        </w:rPr>
+        <w:t>Abstract</w:t>
+      </w:r>
+      <w:r>
+        <w:rPr>
+          <w:rFonts w:hint="default" w:ascii="Times New Roman" w:hAnsi="Times New Roman" w:eastAsia="Times New Roman" w:cs="Times New Roman"/>
+          <w:b w:val="0"/>
+          <w:bCs w:val="0"/>
+          <w:i w:val="0"/>
+          <w:iCs w:val="0"/>
+          <w:sz w:val="22"/>
+          <w:szCs w:val="22"/>
+        </w:rPr>
+        <w:t xml:space="preserve"> .................................................................................................................................................... 04</w:t>
+      </w:r>
+    </w:p>
+    <w:p>
+      <w:pPr>
+        <w:pBdr>
+          <w:top w:val="none" w:color="000000" w:sz="0" w:space="0"/>
+          <w:left w:val="none" w:color="000000" w:sz="0" w:space="0"/>
+          <w:bottom w:val="none" w:color="000000" w:sz="0" w:space="0"/>
+          <w:right w:val="none" w:color="000000" w:sz="0" w:space="0"/>
+        </w:pBdr>
+        <w:spacing w:line="240" w:lineRule="auto"/>
+        <w:ind w:left="0" w:right="0" w:firstLine="0"/>
+        <w:rPr>
+          <w:rFonts w:hint="default" w:ascii="Times New Roman" w:hAnsi="Times New Roman" w:eastAsia="Times New Roman" w:cs="Times New Roman"/>
+          <w:b w:val="0"/>
+          <w:bCs w:val="0"/>
+          <w:i w:val="0"/>
+          <w:iCs w:val="0"/>
+          <w:sz w:val="22"/>
+          <w:szCs w:val="22"/>
+        </w:rPr>
+      </w:pPr>
+      <w:r>
+        <w:rPr>
+          <w:rFonts w:hint="default" w:ascii="Times New Roman" w:hAnsi="Times New Roman" w:eastAsia="Times New Roman" w:cs="Times New Roman"/>
+          <w:b/>
+          <w:bCs/>
+          <w:i w:val="0"/>
+          <w:iCs w:val="0"/>
+          <w:sz w:val="22"/>
+          <w:szCs w:val="22"/>
+        </w:rPr>
+        <w:t>Keywords</w:t>
+      </w:r>
+      <w:r>
+        <w:rPr>
+          <w:rFonts w:hint="default" w:ascii="Times New Roman" w:hAnsi="Times New Roman" w:eastAsia="Times New Roman" w:cs="Times New Roman"/>
+          <w:b w:val="0"/>
+          <w:bCs w:val="0"/>
+          <w:i w:val="0"/>
+          <w:iCs w:val="0"/>
+          <w:sz w:val="22"/>
+          <w:szCs w:val="22"/>
+        </w:rPr>
+        <w:t xml:space="preserve"> .................................................................................................................................................. 04</w:t>
+      </w:r>
+    </w:p>
+    <w:p>
+      <w:pPr>
+        <w:pBdr>
+          <w:top w:val="none" w:color="000000" w:sz="0" w:space="0"/>
+          <w:left w:val="none" w:color="000000" w:sz="0" w:space="0"/>
+          <w:bottom w:val="none" w:color="000000" w:sz="0" w:space="0"/>
+          <w:right w:val="none" w:color="000000" w:sz="0" w:space="0"/>
+        </w:pBdr>
+        <w:spacing w:line="240" w:lineRule="auto"/>
+        <w:ind w:left="0" w:right="0" w:firstLine="0"/>
+        <w:rPr>
+          <w:rFonts w:hint="default" w:ascii="Times New Roman" w:hAnsi="Times New Roman" w:eastAsia="Times New Roman" w:cs="Times New Roman"/>
+          <w:b w:val="0"/>
+          <w:bCs w:val="0"/>
+          <w:i w:val="0"/>
+          <w:iCs w:val="0"/>
+          <w:sz w:val="22"/>
+          <w:szCs w:val="22"/>
+        </w:rPr>
+      </w:pPr>
+      <w:r>
+        <w:rPr>
+          <w:rFonts w:hint="default" w:ascii="Times New Roman" w:hAnsi="Times New Roman" w:eastAsia="Times New Roman" w:cs="Times New Roman"/>
+          <w:b/>
+          <w:bCs/>
+          <w:i w:val="0"/>
+          <w:iCs w:val="0"/>
+          <w:sz w:val="22"/>
+          <w:szCs w:val="22"/>
+        </w:rPr>
+        <w:t>1. Introduction</w:t>
+      </w:r>
+      <w:r>
+        <w:rPr>
+          <w:rFonts w:hint="default" w:ascii="Times New Roman" w:hAnsi="Times New Roman" w:eastAsia="Times New Roman" w:cs="Times New Roman"/>
+          <w:b w:val="0"/>
+          <w:bCs w:val="0"/>
+          <w:i w:val="0"/>
+          <w:iCs w:val="0"/>
+          <w:sz w:val="22"/>
+          <w:szCs w:val="22"/>
+        </w:rPr>
+        <w:t xml:space="preserve"> ......................................................................................................................................... 04</w:t>
+      </w:r>
+    </w:p>
+    <w:p>
+      <w:pPr>
+        <w:pBdr>
+          <w:top w:val="none" w:color="000000" w:sz="0" w:space="0"/>
+          <w:left w:val="none" w:color="000000" w:sz="0" w:space="0"/>
+          <w:bottom w:val="none" w:color="000000" w:sz="0" w:space="0"/>
+          <w:right w:val="none" w:color="000000" w:sz="0" w:space="0"/>
+        </w:pBdr>
+        <w:spacing w:line="240" w:lineRule="auto"/>
+        <w:ind w:left="0" w:right="0" w:firstLine="708" w:firstLineChars="0"/>
+        <w:rPr>
+          <w:rFonts w:hint="default" w:ascii="Times New Roman" w:hAnsi="Times New Roman" w:eastAsia="Times New Roman" w:cs="Times New Roman"/>
+          <w:b w:val="0"/>
+          <w:bCs w:val="0"/>
+          <w:i w:val="0"/>
+          <w:iCs w:val="0"/>
+          <w:sz w:val="22"/>
+          <w:szCs w:val="22"/>
+        </w:rPr>
+      </w:pPr>
+      <w:r>
+        <w:rPr>
+          <w:rFonts w:hint="default" w:ascii="Times New Roman" w:hAnsi="Times New Roman" w:eastAsia="Times New Roman" w:cs="Times New Roman"/>
+          <w:b w:val="0"/>
+          <w:bCs w:val="0"/>
+          <w:i w:val="0"/>
+          <w:iCs w:val="0"/>
+          <w:sz w:val="22"/>
+          <w:szCs w:val="22"/>
+        </w:rPr>
+        <w:t>1.1 Motivation for the NLP Tasks ................................................................................................ 04</w:t>
+      </w:r>
+    </w:p>
+    <w:p>
+      <w:pPr>
+        <w:pBdr>
+          <w:top w:val="none" w:color="000000" w:sz="0" w:space="0"/>
+          <w:left w:val="none" w:color="000000" w:sz="0" w:space="0"/>
+          <w:bottom w:val="none" w:color="000000" w:sz="0" w:space="0"/>
+          <w:right w:val="none" w:color="000000" w:sz="0" w:space="0"/>
+        </w:pBdr>
+        <w:spacing w:line="240" w:lineRule="auto"/>
+        <w:ind w:left="0" w:right="0" w:firstLine="708" w:firstLineChars="0"/>
+        <w:rPr>
+          <w:rFonts w:hint="default" w:ascii="Times New Roman" w:hAnsi="Times New Roman" w:eastAsia="Times New Roman" w:cs="Times New Roman"/>
+          <w:b w:val="0"/>
+          <w:bCs w:val="0"/>
+          <w:i w:val="0"/>
+          <w:iCs w:val="0"/>
+          <w:sz w:val="22"/>
+          <w:szCs w:val="22"/>
+        </w:rPr>
+      </w:pPr>
+      <w:r>
+        <w:rPr>
+          <w:rFonts w:hint="default" w:ascii="Times New Roman" w:hAnsi="Times New Roman" w:eastAsia="Times New Roman" w:cs="Times New Roman"/>
+          <w:b w:val="0"/>
+          <w:bCs w:val="0"/>
+          <w:i w:val="0"/>
+          <w:iCs w:val="0"/>
+          <w:sz w:val="22"/>
+          <w:szCs w:val="22"/>
+        </w:rPr>
+        <w:t>1.2 ML and Deep Learning Background ...................................................................................... 05</w:t>
+      </w:r>
+    </w:p>
+    <w:p>
+      <w:pPr>
+        <w:pBdr>
+          <w:top w:val="none" w:color="000000" w:sz="0" w:space="0"/>
+          <w:left w:val="none" w:color="000000" w:sz="0" w:space="0"/>
+          <w:bottom w:val="none" w:color="000000" w:sz="0" w:space="0"/>
+          <w:right w:val="none" w:color="000000" w:sz="0" w:space="0"/>
+        </w:pBdr>
+        <w:spacing w:line="240" w:lineRule="auto"/>
+        <w:ind w:left="0" w:right="0" w:firstLine="708" w:firstLineChars="0"/>
+        <w:rPr>
+          <w:rFonts w:hint="default" w:ascii="Times New Roman" w:hAnsi="Times New Roman" w:eastAsia="Times New Roman" w:cs="Times New Roman"/>
+          <w:b w:val="0"/>
+          <w:bCs w:val="0"/>
+          <w:i w:val="0"/>
+          <w:iCs w:val="0"/>
+          <w:sz w:val="22"/>
+          <w:szCs w:val="22"/>
+        </w:rPr>
+      </w:pPr>
+      <w:r>
+        <w:rPr>
+          <w:rFonts w:hint="default" w:ascii="Times New Roman" w:hAnsi="Times New Roman" w:eastAsia="Times New Roman" w:cs="Times New Roman"/>
+          <w:b w:val="0"/>
+          <w:bCs w:val="0"/>
+          <w:i w:val="0"/>
+          <w:iCs w:val="0"/>
+          <w:sz w:val="22"/>
+          <w:szCs w:val="22"/>
+        </w:rPr>
+        <w:t>1.3 Why Transformers, LLMs, and Vector Search Matter ........................................................... 05</w:t>
+      </w:r>
+    </w:p>
+    <w:p>
+      <w:pPr>
+        <w:pBdr>
+          <w:top w:val="none" w:color="000000" w:sz="0" w:space="0"/>
+          <w:left w:val="none" w:color="000000" w:sz="0" w:space="0"/>
+          <w:bottom w:val="none" w:color="000000" w:sz="0" w:space="0"/>
+          <w:right w:val="none" w:color="000000" w:sz="0" w:space="0"/>
+        </w:pBdr>
+        <w:spacing w:line="240" w:lineRule="auto"/>
+        <w:ind w:left="0" w:right="0" w:firstLine="0"/>
+        <w:rPr>
+          <w:rFonts w:hint="default" w:ascii="Times New Roman" w:hAnsi="Times New Roman" w:eastAsia="Times New Roman" w:cs="Times New Roman"/>
+          <w:b w:val="0"/>
+          <w:bCs w:val="0"/>
+          <w:i w:val="0"/>
+          <w:iCs w:val="0"/>
+          <w:sz w:val="22"/>
+          <w:szCs w:val="22"/>
+        </w:rPr>
+      </w:pPr>
+      <w:r>
+        <w:rPr>
+          <w:rFonts w:hint="default" w:ascii="Times New Roman" w:hAnsi="Times New Roman" w:eastAsia="Times New Roman" w:cs="Times New Roman"/>
+          <w:b/>
+          <w:bCs/>
+          <w:i w:val="0"/>
+          <w:iCs w:val="0"/>
+          <w:sz w:val="22"/>
+          <w:szCs w:val="22"/>
+        </w:rPr>
+        <w:t>2. Literature Review</w:t>
+      </w:r>
+      <w:r>
+        <w:rPr>
+          <w:rFonts w:hint="default" w:ascii="Times New Roman" w:hAnsi="Times New Roman" w:eastAsia="Times New Roman" w:cs="Times New Roman"/>
+          <w:b w:val="0"/>
+          <w:bCs w:val="0"/>
+          <w:i w:val="0"/>
+          <w:iCs w:val="0"/>
+          <w:sz w:val="22"/>
+          <w:szCs w:val="22"/>
+        </w:rPr>
+        <w:t xml:space="preserve"> ................................................................................................................................ 06</w:t>
+      </w:r>
+    </w:p>
+    <w:p>
+      <w:pPr>
+        <w:pBdr>
+          <w:top w:val="none" w:color="000000" w:sz="0" w:space="0"/>
+          <w:left w:val="none" w:color="000000" w:sz="0" w:space="0"/>
+          <w:bottom w:val="none" w:color="000000" w:sz="0" w:space="0"/>
+          <w:right w:val="none" w:color="000000" w:sz="0" w:space="0"/>
+        </w:pBdr>
+        <w:spacing w:line="240" w:lineRule="auto"/>
+        <w:ind w:left="0" w:right="0" w:firstLine="708" w:firstLineChars="0"/>
+        <w:rPr>
+          <w:rFonts w:hint="default" w:ascii="Times New Roman" w:hAnsi="Times New Roman" w:eastAsia="Times New Roman" w:cs="Times New Roman"/>
+          <w:b w:val="0"/>
+          <w:bCs w:val="0"/>
+          <w:i w:val="0"/>
+          <w:iCs w:val="0"/>
+          <w:sz w:val="22"/>
+          <w:szCs w:val="22"/>
+        </w:rPr>
+      </w:pPr>
+      <w:r>
+        <w:rPr>
+          <w:rFonts w:hint="default" w:ascii="Times New Roman" w:hAnsi="Times New Roman" w:eastAsia="Times New Roman" w:cs="Times New Roman"/>
+          <w:b w:val="0"/>
+          <w:bCs w:val="0"/>
+          <w:i w:val="0"/>
+          <w:iCs w:val="0"/>
+          <w:sz w:val="22"/>
+          <w:szCs w:val="22"/>
+        </w:rPr>
+        <w:t>2.1 Semantic Search Systems ....................................................................................................... 06</w:t>
+      </w:r>
+    </w:p>
+    <w:p>
+      <w:pPr>
+        <w:pBdr>
+          <w:top w:val="none" w:color="000000" w:sz="0" w:space="0"/>
+          <w:left w:val="none" w:color="000000" w:sz="0" w:space="0"/>
+          <w:bottom w:val="none" w:color="000000" w:sz="0" w:space="0"/>
+          <w:right w:val="none" w:color="000000" w:sz="0" w:space="0"/>
+        </w:pBdr>
+        <w:spacing w:line="240" w:lineRule="auto"/>
+        <w:ind w:left="0" w:right="0" w:firstLine="708" w:firstLineChars="0"/>
+        <w:rPr>
+          <w:rFonts w:hint="default" w:ascii="Times New Roman" w:hAnsi="Times New Roman" w:eastAsia="Times New Roman" w:cs="Times New Roman"/>
+          <w:b w:val="0"/>
+          <w:bCs w:val="0"/>
+          <w:i w:val="0"/>
+          <w:iCs w:val="0"/>
+          <w:sz w:val="22"/>
+          <w:szCs w:val="22"/>
+        </w:rPr>
+      </w:pPr>
+      <w:r>
+        <w:rPr>
+          <w:rFonts w:hint="default" w:ascii="Times New Roman" w:hAnsi="Times New Roman" w:eastAsia="Times New Roman" w:cs="Times New Roman"/>
+          <w:b w:val="0"/>
+          <w:bCs w:val="0"/>
+          <w:i w:val="0"/>
+          <w:iCs w:val="0"/>
+          <w:sz w:val="22"/>
+          <w:szCs w:val="22"/>
+        </w:rPr>
+        <w:t>2.2 Transformer Architectures ...................................................................................................... 06</w:t>
+      </w:r>
+    </w:p>
+    <w:p>
+      <w:pPr>
+        <w:pBdr>
+          <w:top w:val="none" w:color="000000" w:sz="0" w:space="0"/>
+          <w:left w:val="none" w:color="000000" w:sz="0" w:space="0"/>
+          <w:bottom w:val="none" w:color="000000" w:sz="0" w:space="0"/>
+          <w:right w:val="none" w:color="000000" w:sz="0" w:space="0"/>
+        </w:pBdr>
+        <w:spacing w:line="240" w:lineRule="auto"/>
+        <w:ind w:left="0" w:right="0" w:firstLine="708" w:firstLineChars="0"/>
+        <w:rPr>
+          <w:rFonts w:hint="default" w:ascii="Times New Roman" w:hAnsi="Times New Roman" w:eastAsia="Times New Roman" w:cs="Times New Roman"/>
+          <w:b w:val="0"/>
+          <w:bCs w:val="0"/>
+          <w:i w:val="0"/>
+          <w:iCs w:val="0"/>
+          <w:sz w:val="22"/>
+          <w:szCs w:val="22"/>
+        </w:rPr>
+      </w:pPr>
+      <w:r>
+        <w:rPr>
+          <w:rFonts w:hint="default" w:ascii="Times New Roman" w:hAnsi="Times New Roman" w:eastAsia="Times New Roman" w:cs="Times New Roman"/>
+          <w:b w:val="0"/>
+          <w:bCs w:val="0"/>
+          <w:i w:val="0"/>
+          <w:iCs w:val="0"/>
+          <w:sz w:val="22"/>
+          <w:szCs w:val="22"/>
+        </w:rPr>
+        <w:t>2.3 Vector Databases .................................................................................................................... 06</w:t>
+      </w:r>
+    </w:p>
+    <w:p>
+      <w:pPr>
+        <w:pBdr>
+          <w:top w:val="none" w:color="000000" w:sz="0" w:space="0"/>
+          <w:left w:val="none" w:color="000000" w:sz="0" w:space="0"/>
+          <w:bottom w:val="none" w:color="000000" w:sz="0" w:space="0"/>
+          <w:right w:val="none" w:color="000000" w:sz="0" w:space="0"/>
+        </w:pBdr>
+        <w:spacing w:line="240" w:lineRule="auto"/>
+        <w:ind w:left="0" w:right="0" w:firstLine="708" w:firstLineChars="0"/>
+        <w:rPr>
+          <w:rFonts w:hint="default" w:ascii="Times New Roman" w:hAnsi="Times New Roman" w:eastAsia="Times New Roman" w:cs="Times New Roman"/>
+          <w:b w:val="0"/>
+          <w:bCs w:val="0"/>
+          <w:i w:val="0"/>
+          <w:iCs w:val="0"/>
+          <w:sz w:val="22"/>
+          <w:szCs w:val="22"/>
+        </w:rPr>
+      </w:pPr>
+      <w:r>
+        <w:rPr>
+          <w:rFonts w:hint="default" w:ascii="Times New Roman" w:hAnsi="Times New Roman" w:eastAsia="Times New Roman" w:cs="Times New Roman"/>
+          <w:b w:val="0"/>
+          <w:bCs w:val="0"/>
+          <w:i w:val="0"/>
+          <w:iCs w:val="0"/>
+          <w:sz w:val="22"/>
+          <w:szCs w:val="22"/>
+        </w:rPr>
+        <w:t>2.4 LLM Frameworks ................................................................................................................... 07</w:t>
+      </w:r>
+    </w:p>
+    <w:p>
+      <w:pPr>
+        <w:pBdr>
+          <w:top w:val="none" w:color="000000" w:sz="0" w:space="0"/>
+          <w:left w:val="none" w:color="000000" w:sz="0" w:space="0"/>
+          <w:bottom w:val="none" w:color="000000" w:sz="0" w:space="0"/>
+          <w:right w:val="none" w:color="000000" w:sz="0" w:space="0"/>
+        </w:pBdr>
+        <w:spacing w:line="240" w:lineRule="auto"/>
+        <w:ind w:left="0" w:right="0" w:firstLine="0"/>
+        <w:rPr>
+          <w:rFonts w:hint="default" w:ascii="Times New Roman" w:hAnsi="Times New Roman" w:eastAsia="Times New Roman" w:cs="Times New Roman"/>
+          <w:b w:val="0"/>
+          <w:bCs w:val="0"/>
+          <w:i w:val="0"/>
+          <w:iCs w:val="0"/>
+          <w:sz w:val="22"/>
+          <w:szCs w:val="22"/>
+        </w:rPr>
+      </w:pPr>
+      <w:r>
+        <w:rPr>
+          <w:rFonts w:hint="default" w:ascii="Times New Roman" w:hAnsi="Times New Roman" w:eastAsia="Times New Roman" w:cs="Times New Roman"/>
+          <w:b/>
+          <w:bCs/>
+          <w:i w:val="0"/>
+          <w:iCs w:val="0"/>
+          <w:sz w:val="22"/>
+          <w:szCs w:val="22"/>
+        </w:rPr>
+        <w:t>3. System Design</w:t>
+      </w:r>
+      <w:r>
+        <w:rPr>
+          <w:rFonts w:hint="default" w:ascii="Times New Roman" w:hAnsi="Times New Roman" w:eastAsia="Times New Roman" w:cs="Times New Roman"/>
+          <w:b w:val="0"/>
+          <w:bCs w:val="0"/>
+          <w:i w:val="0"/>
+          <w:iCs w:val="0"/>
+          <w:sz w:val="22"/>
+          <w:szCs w:val="22"/>
+        </w:rPr>
+        <w:t xml:space="preserve"> ...................................................................................................................................... 07</w:t>
+      </w:r>
+    </w:p>
+    <w:p>
+      <w:pPr>
+        <w:pBdr>
+          <w:top w:val="none" w:color="000000" w:sz="0" w:space="0"/>
+          <w:left w:val="none" w:color="000000" w:sz="0" w:space="0"/>
+          <w:bottom w:val="none" w:color="000000" w:sz="0" w:space="0"/>
+          <w:right w:val="none" w:color="000000" w:sz="0" w:space="0"/>
+        </w:pBdr>
+        <w:spacing w:line="240" w:lineRule="auto"/>
+        <w:ind w:left="0" w:right="0" w:firstLine="708" w:firstLineChars="0"/>
+        <w:rPr>
+          <w:rFonts w:hint="default" w:ascii="Times New Roman" w:hAnsi="Times New Roman" w:eastAsia="Times New Roman" w:cs="Times New Roman"/>
+          <w:b w:val="0"/>
+          <w:bCs w:val="0"/>
+          <w:i w:val="0"/>
+          <w:iCs w:val="0"/>
+          <w:sz w:val="22"/>
+          <w:szCs w:val="22"/>
+        </w:rPr>
+      </w:pPr>
+      <w:r>
+        <w:rPr>
+          <w:rFonts w:hint="default" w:ascii="Times New Roman" w:hAnsi="Times New Roman" w:eastAsia="Times New Roman" w:cs="Times New Roman"/>
+          <w:b w:val="0"/>
+          <w:bCs w:val="0"/>
+          <w:i w:val="0"/>
+          <w:iCs w:val="0"/>
+          <w:sz w:val="22"/>
+          <w:szCs w:val="22"/>
+        </w:rPr>
+        <w:t>3.1 ML Pipeline Diagram ............................................................................................................. 07</w:t>
+      </w:r>
+    </w:p>
+    <w:p>
+      <w:pPr>
+        <w:pBdr>
+          <w:top w:val="none" w:color="000000" w:sz="0" w:space="0"/>
+          <w:left w:val="none" w:color="000000" w:sz="0" w:space="0"/>
+          <w:bottom w:val="none" w:color="000000" w:sz="0" w:space="0"/>
+          <w:right w:val="none" w:color="000000" w:sz="0" w:space="0"/>
+        </w:pBdr>
+        <w:spacing w:line="240" w:lineRule="auto"/>
+        <w:ind w:left="0" w:right="0" w:firstLine="708" w:firstLineChars="0"/>
+        <w:rPr>
+          <w:rFonts w:hint="default" w:ascii="Times New Roman" w:hAnsi="Times New Roman" w:eastAsia="Times New Roman" w:cs="Times New Roman"/>
+          <w:b w:val="0"/>
+          <w:bCs w:val="0"/>
+          <w:i w:val="0"/>
+          <w:iCs w:val="0"/>
+          <w:sz w:val="22"/>
+          <w:szCs w:val="22"/>
+        </w:rPr>
+      </w:pPr>
+      <w:r>
+        <w:rPr>
+          <w:rFonts w:hint="default" w:ascii="Times New Roman" w:hAnsi="Times New Roman" w:eastAsia="Times New Roman" w:cs="Times New Roman"/>
+          <w:b w:val="0"/>
+          <w:bCs w:val="0"/>
+          <w:i w:val="0"/>
+          <w:iCs w:val="0"/>
+          <w:sz w:val="22"/>
+          <w:szCs w:val="22"/>
+        </w:rPr>
+        <w:t>3.2 Data Preprocessing Workflow ................................................................................................ 07</w:t>
+      </w:r>
+    </w:p>
+    <w:p>
+      <w:pPr>
+        <w:pBdr>
+          <w:top w:val="none" w:color="000000" w:sz="0" w:space="0"/>
+          <w:left w:val="none" w:color="000000" w:sz="0" w:space="0"/>
+          <w:bottom w:val="none" w:color="000000" w:sz="0" w:space="0"/>
+          <w:right w:val="none" w:color="000000" w:sz="0" w:space="0"/>
+        </w:pBdr>
+        <w:spacing w:line="240" w:lineRule="auto"/>
+        <w:ind w:left="0" w:right="0" w:firstLine="708" w:firstLineChars="0"/>
+        <w:rPr>
+          <w:rFonts w:hint="default" w:ascii="Times New Roman" w:hAnsi="Times New Roman" w:eastAsia="Times New Roman" w:cs="Times New Roman"/>
+          <w:b w:val="0"/>
+          <w:bCs w:val="0"/>
+          <w:i w:val="0"/>
+          <w:iCs w:val="0"/>
+          <w:sz w:val="22"/>
+          <w:szCs w:val="22"/>
+        </w:rPr>
+      </w:pPr>
+      <w:r>
+        <w:rPr>
+          <w:rFonts w:hint="default" w:ascii="Times New Roman" w:hAnsi="Times New Roman" w:eastAsia="Times New Roman" w:cs="Times New Roman"/>
+          <w:b w:val="0"/>
+          <w:bCs w:val="0"/>
+          <w:i w:val="0"/>
+          <w:iCs w:val="0"/>
+          <w:sz w:val="22"/>
+          <w:szCs w:val="22"/>
+        </w:rPr>
+        <w:t>3.3 Embedding Generation Diagram ............................................................................................ 08</w:t>
+      </w:r>
+    </w:p>
+    <w:p>
+      <w:pPr>
+        <w:pBdr>
+          <w:top w:val="none" w:color="000000" w:sz="0" w:space="0"/>
+          <w:left w:val="none" w:color="000000" w:sz="0" w:space="0"/>
+          <w:bottom w:val="none" w:color="000000" w:sz="0" w:space="0"/>
+          <w:right w:val="none" w:color="000000" w:sz="0" w:space="0"/>
+        </w:pBdr>
+        <w:spacing w:line="240" w:lineRule="auto"/>
+        <w:ind w:left="0" w:right="0" w:firstLine="708" w:firstLineChars="0"/>
+        <w:rPr>
+          <w:rFonts w:hint="default" w:ascii="Times New Roman" w:hAnsi="Times New Roman" w:eastAsia="Times New Roman" w:cs="Times New Roman"/>
+          <w:b w:val="0"/>
+          <w:bCs w:val="0"/>
+          <w:i w:val="0"/>
+          <w:iCs w:val="0"/>
+          <w:sz w:val="22"/>
+          <w:szCs w:val="22"/>
+        </w:rPr>
+      </w:pPr>
+      <w:r>
+        <w:rPr>
+          <w:rFonts w:hint="default" w:ascii="Times New Roman" w:hAnsi="Times New Roman" w:eastAsia="Times New Roman" w:cs="Times New Roman"/>
+          <w:b w:val="0"/>
+          <w:bCs w:val="0"/>
+          <w:i w:val="0"/>
+          <w:iCs w:val="0"/>
+          <w:sz w:val="22"/>
+          <w:szCs w:val="22"/>
+        </w:rPr>
+        <w:t>3.4 Vector Database Architecture ................................................................................................. 08</w:t>
+      </w:r>
+    </w:p>
+    <w:p>
+      <w:pPr>
+        <w:pBdr>
+          <w:top w:val="none" w:color="000000" w:sz="0" w:space="0"/>
+          <w:left w:val="none" w:color="000000" w:sz="0" w:space="0"/>
+          <w:bottom w:val="none" w:color="000000" w:sz="0" w:space="0"/>
+          <w:right w:val="none" w:color="000000" w:sz="0" w:space="0"/>
+        </w:pBdr>
+        <w:spacing w:line="240" w:lineRule="auto"/>
+        <w:ind w:left="0" w:right="0" w:firstLine="708" w:firstLineChars="0"/>
+        <w:rPr>
+          <w:rFonts w:hint="default" w:ascii="Times New Roman" w:hAnsi="Times New Roman" w:eastAsia="Times New Roman" w:cs="Times New Roman"/>
+          <w:b w:val="0"/>
+          <w:bCs w:val="0"/>
+          <w:i w:val="0"/>
+          <w:iCs w:val="0"/>
+          <w:sz w:val="22"/>
+          <w:szCs w:val="22"/>
+        </w:rPr>
+      </w:pPr>
+      <w:r>
+        <w:rPr>
+          <w:rFonts w:hint="default" w:ascii="Times New Roman" w:hAnsi="Times New Roman" w:eastAsia="Times New Roman" w:cs="Times New Roman"/>
+          <w:b w:val="0"/>
+          <w:bCs w:val="0"/>
+          <w:i w:val="0"/>
+          <w:iCs w:val="0"/>
+          <w:sz w:val="22"/>
+          <w:szCs w:val="22"/>
+        </w:rPr>
+        <w:t>3.5 Docker Container Architecture ............................................................................................... 09</w:t>
+      </w:r>
+    </w:p>
+    <w:p>
+      <w:pPr>
+        <w:pBdr>
+          <w:top w:val="none" w:color="000000" w:sz="0" w:space="0"/>
+          <w:left w:val="none" w:color="000000" w:sz="0" w:space="0"/>
+          <w:bottom w:val="none" w:color="000000" w:sz="0" w:space="0"/>
+          <w:right w:val="none" w:color="000000" w:sz="0" w:space="0"/>
+        </w:pBdr>
+        <w:spacing w:line="240" w:lineRule="auto"/>
+        <w:ind w:left="0" w:right="0" w:firstLine="708" w:firstLineChars="0"/>
+        <w:rPr>
+          <w:rFonts w:hint="default" w:ascii="Times New Roman" w:hAnsi="Times New Roman" w:eastAsia="Times New Roman" w:cs="Times New Roman"/>
+          <w:b w:val="0"/>
+          <w:bCs w:val="0"/>
+          <w:i w:val="0"/>
+          <w:iCs w:val="0"/>
+          <w:sz w:val="22"/>
+          <w:szCs w:val="22"/>
+        </w:rPr>
+      </w:pPr>
+      <w:r>
+        <w:rPr>
+          <w:rFonts w:hint="default" w:ascii="Times New Roman" w:hAnsi="Times New Roman" w:eastAsia="Times New Roman" w:cs="Times New Roman"/>
+          <w:b w:val="0"/>
+          <w:bCs w:val="0"/>
+          <w:i w:val="0"/>
+          <w:iCs w:val="0"/>
+          <w:sz w:val="22"/>
+          <w:szCs w:val="22"/>
+        </w:rPr>
+        <w:t>3.6 Full System Architecture with Multi-Modal NLP Services ................................................... 09</w:t>
+      </w:r>
+    </w:p>
+    <w:p>
+      <w:pPr>
+        <w:pBdr>
+          <w:top w:val="none" w:color="000000" w:sz="0" w:space="0"/>
+          <w:left w:val="none" w:color="000000" w:sz="0" w:space="0"/>
+          <w:bottom w:val="none" w:color="000000" w:sz="0" w:space="0"/>
+          <w:right w:val="none" w:color="000000" w:sz="0" w:space="0"/>
+        </w:pBdr>
+        <w:spacing w:line="240" w:lineRule="auto"/>
+        <w:ind w:left="0" w:right="0" w:firstLine="708" w:firstLineChars="0"/>
+        <w:rPr>
+          <w:rFonts w:hint="default" w:ascii="Times New Roman" w:hAnsi="Times New Roman" w:eastAsia="Times New Roman" w:cs="Times New Roman"/>
+          <w:b w:val="0"/>
+          <w:bCs w:val="0"/>
+          <w:i w:val="0"/>
+          <w:iCs w:val="0"/>
+          <w:sz w:val="22"/>
+          <w:szCs w:val="22"/>
+        </w:rPr>
+      </w:pPr>
+      <w:r>
+        <w:rPr>
+          <w:rFonts w:hint="default" w:ascii="Times New Roman" w:hAnsi="Times New Roman" w:eastAsia="Times New Roman" w:cs="Times New Roman"/>
+          <w:b w:val="0"/>
+          <w:bCs w:val="0"/>
+          <w:i w:val="0"/>
+          <w:iCs w:val="0"/>
+          <w:sz w:val="22"/>
+          <w:szCs w:val="22"/>
+        </w:rPr>
+        <w:t>3.7 Summary of System Design ................................................................................................... 11</w:t>
+      </w:r>
+    </w:p>
+    <w:p>
+      <w:pPr>
+        <w:pBdr>
+          <w:top w:val="none" w:color="000000" w:sz="0" w:space="0"/>
+          <w:left w:val="none" w:color="000000" w:sz="0" w:space="0"/>
+          <w:bottom w:val="none" w:color="000000" w:sz="0" w:space="0"/>
+          <w:right w:val="none" w:color="000000" w:sz="0" w:space="0"/>
+        </w:pBdr>
+        <w:spacing w:line="240" w:lineRule="auto"/>
+        <w:ind w:left="0" w:right="0" w:firstLine="0"/>
+        <w:rPr>
+          <w:rFonts w:hint="default" w:ascii="Times New Roman" w:hAnsi="Times New Roman" w:eastAsia="Times New Roman" w:cs="Times New Roman"/>
+          <w:b w:val="0"/>
+          <w:bCs w:val="0"/>
+          <w:i w:val="0"/>
+          <w:iCs w:val="0"/>
+          <w:sz w:val="22"/>
+          <w:szCs w:val="22"/>
+        </w:rPr>
+      </w:pPr>
+      <w:r>
+        <w:rPr>
+          <w:rFonts w:hint="default" w:ascii="Times New Roman" w:hAnsi="Times New Roman" w:eastAsia="Times New Roman" w:cs="Times New Roman"/>
+          <w:b/>
+          <w:bCs/>
+          <w:i w:val="0"/>
+          <w:iCs w:val="0"/>
+          <w:sz w:val="22"/>
+          <w:szCs w:val="22"/>
+        </w:rPr>
+        <w:t>4. Implementation</w:t>
+      </w:r>
+      <w:r>
+        <w:rPr>
+          <w:rFonts w:hint="default" w:ascii="Times New Roman" w:hAnsi="Times New Roman" w:eastAsia="Times New Roman" w:cs="Times New Roman"/>
+          <w:b w:val="0"/>
+          <w:bCs w:val="0"/>
+          <w:i w:val="0"/>
+          <w:iCs w:val="0"/>
+          <w:sz w:val="22"/>
+          <w:szCs w:val="22"/>
+        </w:rPr>
+        <w:t xml:space="preserve"> .................................................................................................................................... 11</w:t>
+      </w:r>
+    </w:p>
+    <w:p>
+      <w:pPr>
+        <w:pBdr>
+          <w:top w:val="none" w:color="000000" w:sz="0" w:space="0"/>
+          <w:left w:val="none" w:color="000000" w:sz="0" w:space="0"/>
+          <w:bottom w:val="none" w:color="000000" w:sz="0" w:space="0"/>
+          <w:right w:val="none" w:color="000000" w:sz="0" w:space="0"/>
+        </w:pBdr>
+        <w:spacing w:line="240" w:lineRule="auto"/>
+        <w:ind w:left="0" w:right="0" w:firstLine="708" w:firstLineChars="0"/>
+        <w:rPr>
+          <w:rFonts w:hint="default" w:ascii="Times New Roman" w:hAnsi="Times New Roman" w:eastAsia="Times New Roman" w:cs="Times New Roman"/>
+          <w:b w:val="0"/>
+          <w:bCs w:val="0"/>
+          <w:i w:val="0"/>
+          <w:iCs w:val="0"/>
+          <w:sz w:val="22"/>
+          <w:szCs w:val="22"/>
+        </w:rPr>
+      </w:pPr>
+      <w:r>
+        <w:rPr>
+          <w:rFonts w:hint="default" w:ascii="Times New Roman" w:hAnsi="Times New Roman" w:eastAsia="Times New Roman" w:cs="Times New Roman"/>
+          <w:b w:val="0"/>
+          <w:bCs w:val="0"/>
+          <w:i w:val="0"/>
+          <w:iCs w:val="0"/>
+          <w:sz w:val="22"/>
+          <w:szCs w:val="22"/>
+        </w:rPr>
+        <w:t>4.1 Dataset Processing .................................................................................................................. 11</w:t>
+      </w:r>
+    </w:p>
+    <w:p>
+      <w:pPr>
+        <w:pBdr>
+          <w:top w:val="none" w:color="000000" w:sz="0" w:space="0"/>
+          <w:left w:val="none" w:color="000000" w:sz="0" w:space="0"/>
+          <w:bottom w:val="none" w:color="000000" w:sz="0" w:space="0"/>
+          <w:right w:val="none" w:color="000000" w:sz="0" w:space="0"/>
+        </w:pBdr>
+        <w:spacing w:line="240" w:lineRule="auto"/>
+        <w:ind w:left="708" w:leftChars="0" w:right="0" w:firstLine="708" w:firstLineChars="0"/>
+        <w:rPr>
+          <w:rFonts w:hint="default" w:ascii="Times New Roman" w:hAnsi="Times New Roman" w:eastAsia="Times New Roman" w:cs="Times New Roman"/>
+          <w:b w:val="0"/>
+          <w:bCs w:val="0"/>
+          <w:i w:val="0"/>
+          <w:iCs w:val="0"/>
+          <w:sz w:val="22"/>
+          <w:szCs w:val="22"/>
+        </w:rPr>
+      </w:pPr>
+      <w:r>
+        <w:rPr>
+          <w:rFonts w:hint="default" w:ascii="Times New Roman" w:hAnsi="Times New Roman" w:eastAsia="Times New Roman" w:cs="Times New Roman"/>
+          <w:b w:val="0"/>
+          <w:bCs w:val="0"/>
+          <w:i w:val="0"/>
+          <w:iCs w:val="0"/>
+          <w:sz w:val="22"/>
+          <w:szCs w:val="22"/>
+        </w:rPr>
+        <w:t>4.1.1 Text Cleaning Pipeline ........................................................................................... 11</w:t>
+      </w:r>
+    </w:p>
+    <w:p>
+      <w:pPr>
+        <w:pBdr>
+          <w:top w:val="none" w:color="000000" w:sz="0" w:space="0"/>
+          <w:left w:val="none" w:color="000000" w:sz="0" w:space="0"/>
+          <w:bottom w:val="none" w:color="000000" w:sz="0" w:space="0"/>
+          <w:right w:val="none" w:color="000000" w:sz="0" w:space="0"/>
+        </w:pBdr>
+        <w:spacing w:line="240" w:lineRule="auto"/>
+        <w:ind w:left="0" w:right="0" w:firstLine="708" w:firstLineChars="0"/>
+        <w:rPr>
+          <w:rFonts w:hint="default" w:ascii="Times New Roman" w:hAnsi="Times New Roman" w:eastAsia="Times New Roman" w:cs="Times New Roman"/>
+          <w:b w:val="0"/>
+          <w:bCs w:val="0"/>
+          <w:i w:val="0"/>
+          <w:iCs w:val="0"/>
+          <w:sz w:val="22"/>
+          <w:szCs w:val="22"/>
+        </w:rPr>
+      </w:pPr>
+      <w:r>
+        <w:rPr>
+          <w:rFonts w:hint="default" w:ascii="Times New Roman" w:hAnsi="Times New Roman" w:eastAsia="Times New Roman" w:cs="Times New Roman"/>
+          <w:b w:val="0"/>
+          <w:bCs w:val="0"/>
+          <w:i w:val="0"/>
+          <w:iCs w:val="0"/>
+          <w:sz w:val="22"/>
+          <w:szCs w:val="22"/>
+        </w:rPr>
+        <w:t>4.2 Transformer &amp; LLM Model Usage ....................................................................................... 12</w:t>
+      </w:r>
+    </w:p>
+    <w:p>
+      <w:pPr>
+        <w:pBdr>
+          <w:top w:val="none" w:color="000000" w:sz="0" w:space="0"/>
+          <w:left w:val="none" w:color="000000" w:sz="0" w:space="0"/>
+          <w:bottom w:val="none" w:color="000000" w:sz="0" w:space="0"/>
+          <w:right w:val="none" w:color="000000" w:sz="0" w:space="0"/>
+        </w:pBdr>
+        <w:spacing w:line="240" w:lineRule="auto"/>
+        <w:ind w:left="0" w:right="0" w:firstLine="708" w:firstLineChars="0"/>
+        <w:rPr>
+          <w:rFonts w:hint="default" w:ascii="Times New Roman" w:hAnsi="Times New Roman" w:eastAsia="Times New Roman" w:cs="Times New Roman"/>
+          <w:b w:val="0"/>
+          <w:bCs w:val="0"/>
+          <w:i w:val="0"/>
+          <w:iCs w:val="0"/>
+          <w:sz w:val="22"/>
+          <w:szCs w:val="22"/>
+        </w:rPr>
+      </w:pPr>
+      <w:r>
+        <w:rPr>
+          <w:rFonts w:hint="default" w:ascii="Times New Roman" w:hAnsi="Times New Roman" w:eastAsia="Times New Roman" w:cs="Times New Roman"/>
+          <w:b w:val="0"/>
+          <w:bCs w:val="0"/>
+          <w:i w:val="0"/>
+          <w:iCs w:val="0"/>
+          <w:sz w:val="22"/>
+          <w:szCs w:val="22"/>
+        </w:rPr>
+        <w:t>4.3 Vector Database (ChromaDB) Configuration ....................................................................... 13</w:t>
+      </w:r>
+    </w:p>
+    <w:p>
+      <w:pPr>
+        <w:pBdr>
+          <w:top w:val="none" w:color="000000" w:sz="0" w:space="0"/>
+          <w:left w:val="none" w:color="000000" w:sz="0" w:space="0"/>
+          <w:bottom w:val="none" w:color="000000" w:sz="0" w:space="0"/>
+          <w:right w:val="none" w:color="000000" w:sz="0" w:space="0"/>
+        </w:pBdr>
+        <w:spacing w:line="240" w:lineRule="auto"/>
+        <w:ind w:left="708" w:leftChars="0" w:right="0" w:firstLine="708" w:firstLineChars="0"/>
+        <w:rPr>
+          <w:rFonts w:hint="default" w:ascii="Times New Roman" w:hAnsi="Times New Roman" w:eastAsia="Times New Roman" w:cs="Times New Roman"/>
+          <w:b w:val="0"/>
+          <w:bCs w:val="0"/>
+          <w:i w:val="0"/>
+          <w:iCs w:val="0"/>
+          <w:sz w:val="22"/>
+          <w:szCs w:val="22"/>
+        </w:rPr>
+      </w:pPr>
+      <w:r>
+        <w:rPr>
+          <w:rFonts w:hint="default" w:ascii="Times New Roman" w:hAnsi="Times New Roman" w:eastAsia="Times New Roman" w:cs="Times New Roman"/>
+          <w:b w:val="0"/>
+          <w:bCs w:val="0"/>
+          <w:i w:val="0"/>
+          <w:iCs w:val="0"/>
+          <w:sz w:val="22"/>
+          <w:szCs w:val="22"/>
+        </w:rPr>
+        <w:t>4.3.1 ChromaDB Client Setup ........................................................................................ 13</w:t>
+      </w:r>
+    </w:p>
+    <w:p>
+      <w:pPr>
+        <w:pBdr>
+          <w:top w:val="none" w:color="000000" w:sz="0" w:space="0"/>
+          <w:left w:val="none" w:color="000000" w:sz="0" w:space="0"/>
+          <w:bottom w:val="none" w:color="000000" w:sz="0" w:space="0"/>
+          <w:right w:val="none" w:color="000000" w:sz="0" w:space="0"/>
+        </w:pBdr>
+        <w:spacing w:line="240" w:lineRule="auto"/>
+        <w:ind w:left="708" w:leftChars="0" w:right="0" w:firstLine="708" w:firstLineChars="0"/>
+        <w:rPr>
+          <w:rFonts w:hint="default" w:ascii="Times New Roman" w:hAnsi="Times New Roman" w:eastAsia="Times New Roman" w:cs="Times New Roman"/>
+          <w:b w:val="0"/>
+          <w:bCs w:val="0"/>
+          <w:i w:val="0"/>
+          <w:iCs w:val="0"/>
+          <w:sz w:val="22"/>
+          <w:szCs w:val="22"/>
+        </w:rPr>
+      </w:pPr>
+      <w:r>
+        <w:rPr>
+          <w:rFonts w:hint="default" w:ascii="Times New Roman" w:hAnsi="Times New Roman" w:eastAsia="Times New Roman" w:cs="Times New Roman"/>
+          <w:b w:val="0"/>
+          <w:bCs w:val="0"/>
+          <w:i w:val="0"/>
+          <w:iCs w:val="0"/>
+          <w:sz w:val="22"/>
+          <w:szCs w:val="22"/>
+        </w:rPr>
+        <w:t>4.3.2 Document Logging ................................................................................................ 13</w:t>
+      </w:r>
+    </w:p>
+    <w:p>
+      <w:pPr>
+        <w:pBdr>
+          <w:top w:val="none" w:color="000000" w:sz="0" w:space="0"/>
+          <w:left w:val="none" w:color="000000" w:sz="0" w:space="0"/>
+          <w:bottom w:val="none" w:color="000000" w:sz="0" w:space="0"/>
+          <w:right w:val="none" w:color="000000" w:sz="0" w:space="0"/>
+        </w:pBdr>
+        <w:spacing w:line="240" w:lineRule="auto"/>
+        <w:ind w:left="708" w:leftChars="0" w:right="0" w:firstLine="708" w:firstLineChars="0"/>
+        <w:rPr>
+          <w:rFonts w:hint="default" w:ascii="Times New Roman" w:hAnsi="Times New Roman" w:eastAsia="Times New Roman" w:cs="Times New Roman"/>
+          <w:b w:val="0"/>
+          <w:bCs w:val="0"/>
+          <w:i w:val="0"/>
+          <w:iCs w:val="0"/>
+          <w:sz w:val="22"/>
+          <w:szCs w:val="22"/>
+        </w:rPr>
+      </w:pPr>
+      <w:r>
+        <w:rPr>
+          <w:rFonts w:hint="default" w:ascii="Times New Roman" w:hAnsi="Times New Roman" w:eastAsia="Times New Roman" w:cs="Times New Roman"/>
+          <w:b w:val="0"/>
+          <w:bCs w:val="0"/>
+          <w:i w:val="0"/>
+          <w:iCs w:val="0"/>
+          <w:sz w:val="22"/>
+          <w:szCs w:val="22"/>
+        </w:rPr>
+        <w:t>4.3.3 Semantic Search .................................................................................................... 13</w:t>
+      </w:r>
+    </w:p>
+    <w:p>
+      <w:pPr>
+        <w:pBdr>
+          <w:top w:val="none" w:color="000000" w:sz="0" w:space="0"/>
+          <w:left w:val="none" w:color="000000" w:sz="0" w:space="0"/>
+          <w:bottom w:val="none" w:color="000000" w:sz="0" w:space="0"/>
+          <w:right w:val="none" w:color="000000" w:sz="0" w:space="0"/>
+        </w:pBdr>
+        <w:spacing w:line="240" w:lineRule="auto"/>
+        <w:ind w:left="0" w:right="0" w:firstLine="708" w:firstLineChars="0"/>
+        <w:rPr>
+          <w:rFonts w:hint="default" w:ascii="Times New Roman" w:hAnsi="Times New Roman" w:eastAsia="Times New Roman" w:cs="Times New Roman"/>
+          <w:b w:val="0"/>
+          <w:bCs w:val="0"/>
+          <w:i w:val="0"/>
+          <w:iCs w:val="0"/>
+          <w:sz w:val="22"/>
+          <w:szCs w:val="22"/>
+        </w:rPr>
+      </w:pPr>
+      <w:r>
+        <w:rPr>
+          <w:rFonts w:hint="default" w:ascii="Times New Roman" w:hAnsi="Times New Roman" w:eastAsia="Times New Roman" w:cs="Times New Roman"/>
+          <w:b w:val="0"/>
+          <w:bCs w:val="0"/>
+          <w:i w:val="0"/>
+          <w:iCs w:val="0"/>
+          <w:sz w:val="22"/>
+          <w:szCs w:val="22"/>
+        </w:rPr>
+        <w:t>4.4 Embedding Generation Workflow ........................................................................................ 13</w:t>
+      </w:r>
+    </w:p>
+    <w:p>
+      <w:pPr>
+        <w:pBdr>
+          <w:top w:val="none" w:color="000000" w:sz="0" w:space="0"/>
+          <w:left w:val="none" w:color="000000" w:sz="0" w:space="0"/>
+          <w:bottom w:val="none" w:color="000000" w:sz="0" w:space="0"/>
+          <w:right w:val="none" w:color="000000" w:sz="0" w:space="0"/>
+        </w:pBdr>
+        <w:spacing w:line="240" w:lineRule="auto"/>
+        <w:ind w:left="0" w:right="0" w:firstLine="708" w:firstLineChars="0"/>
+        <w:rPr>
+          <w:rFonts w:hint="default" w:ascii="Times New Roman" w:hAnsi="Times New Roman" w:eastAsia="Times New Roman" w:cs="Times New Roman"/>
+          <w:b w:val="0"/>
+          <w:bCs w:val="0"/>
+          <w:i w:val="0"/>
+          <w:iCs w:val="0"/>
+          <w:sz w:val="22"/>
+          <w:szCs w:val="22"/>
+        </w:rPr>
+      </w:pPr>
+      <w:r>
+        <w:rPr>
+          <w:rFonts w:hint="default" w:ascii="Times New Roman" w:hAnsi="Times New Roman" w:eastAsia="Times New Roman" w:cs="Times New Roman"/>
+          <w:b w:val="0"/>
+          <w:bCs w:val="0"/>
+          <w:i w:val="0"/>
+          <w:iCs w:val="0"/>
+          <w:sz w:val="22"/>
+          <w:szCs w:val="22"/>
+        </w:rPr>
+        <w:t>4.5 Docker Deployment .............................................................................................................. 14</w:t>
+      </w:r>
+    </w:p>
+    <w:p>
+      <w:pPr>
+        <w:pBdr>
+          <w:top w:val="none" w:color="000000" w:sz="0" w:space="0"/>
+          <w:left w:val="none" w:color="000000" w:sz="0" w:space="0"/>
+          <w:bottom w:val="none" w:color="000000" w:sz="0" w:space="0"/>
+          <w:right w:val="none" w:color="000000" w:sz="0" w:space="0"/>
+        </w:pBdr>
+        <w:spacing w:line="240" w:lineRule="auto"/>
+        <w:ind w:left="0" w:right="0" w:firstLine="708" w:firstLineChars="0"/>
+        <w:rPr>
+          <w:rFonts w:hint="default" w:ascii="Times New Roman" w:hAnsi="Times New Roman" w:eastAsia="Times New Roman" w:cs="Times New Roman"/>
+          <w:b w:val="0"/>
+          <w:bCs w:val="0"/>
+          <w:i w:val="0"/>
+          <w:iCs w:val="0"/>
+          <w:sz w:val="22"/>
+          <w:szCs w:val="22"/>
+        </w:rPr>
+      </w:pPr>
+      <w:r>
+        <w:rPr>
+          <w:rFonts w:hint="default" w:ascii="Times New Roman" w:hAnsi="Times New Roman" w:eastAsia="Times New Roman" w:cs="Times New Roman"/>
+          <w:b w:val="0"/>
+          <w:bCs w:val="0"/>
+          <w:i w:val="0"/>
+          <w:iCs w:val="0"/>
+          <w:sz w:val="22"/>
+          <w:szCs w:val="22"/>
+        </w:rPr>
+        <w:t>4.6 Screenshots of Running System ............................................................................................ 14</w:t>
+      </w:r>
+    </w:p>
+    <w:p>
+      <w:pPr>
+        <w:pBdr>
+          <w:top w:val="none" w:color="000000" w:sz="0" w:space="0"/>
+          <w:left w:val="none" w:color="000000" w:sz="0" w:space="0"/>
+          <w:bottom w:val="none" w:color="000000" w:sz="0" w:space="0"/>
+          <w:right w:val="none" w:color="000000" w:sz="0" w:space="0"/>
+        </w:pBdr>
+        <w:spacing w:line="240" w:lineRule="auto"/>
+        <w:ind w:left="708" w:leftChars="0" w:right="0" w:firstLine="708" w:firstLineChars="0"/>
+        <w:rPr>
+          <w:rFonts w:hint="default" w:ascii="Times New Roman" w:hAnsi="Times New Roman" w:eastAsia="Times New Roman" w:cs="Times New Roman"/>
+          <w:b w:val="0"/>
+          <w:bCs w:val="0"/>
+          <w:i w:val="0"/>
+          <w:iCs w:val="0"/>
+          <w:sz w:val="22"/>
+          <w:szCs w:val="22"/>
+        </w:rPr>
+      </w:pPr>
+      <w:r>
+        <w:rPr>
+          <w:rFonts w:hint="default" w:ascii="Times New Roman" w:hAnsi="Times New Roman" w:eastAsia="Times New Roman" w:cs="Times New Roman"/>
+          <w:b w:val="0"/>
+          <w:bCs w:val="0"/>
+          <w:i w:val="0"/>
+          <w:iCs w:val="0"/>
+          <w:sz w:val="22"/>
+          <w:szCs w:val="22"/>
+        </w:rPr>
+        <w:t>4.6.1 Running Docker Containers .................................................................................. 14</w:t>
+      </w:r>
+    </w:p>
+    <w:p>
+      <w:pPr>
+        <w:pBdr>
+          <w:top w:val="none" w:color="000000" w:sz="0" w:space="0"/>
+          <w:left w:val="none" w:color="000000" w:sz="0" w:space="0"/>
+          <w:bottom w:val="none" w:color="000000" w:sz="0" w:space="0"/>
+          <w:right w:val="none" w:color="000000" w:sz="0" w:space="0"/>
+        </w:pBdr>
+        <w:spacing w:line="240" w:lineRule="auto"/>
+        <w:ind w:left="708" w:leftChars="0" w:right="0" w:firstLine="708" w:firstLineChars="0"/>
+        <w:rPr>
+          <w:rFonts w:hint="default" w:ascii="Times New Roman" w:hAnsi="Times New Roman" w:eastAsia="Times New Roman" w:cs="Times New Roman"/>
+          <w:b w:val="0"/>
+          <w:bCs w:val="0"/>
+          <w:i w:val="0"/>
+          <w:iCs w:val="0"/>
+          <w:sz w:val="22"/>
+          <w:szCs w:val="22"/>
+        </w:rPr>
+      </w:pPr>
+      <w:r>
+        <w:rPr>
+          <w:rFonts w:hint="default" w:ascii="Times New Roman" w:hAnsi="Times New Roman" w:eastAsia="Times New Roman" w:cs="Times New Roman"/>
+          <w:b w:val="0"/>
+          <w:bCs w:val="0"/>
+          <w:i w:val="0"/>
+          <w:iCs w:val="0"/>
+          <w:sz w:val="22"/>
+          <w:szCs w:val="22"/>
+        </w:rPr>
+        <w:t>4.6.2 Backend FastAPI Docs .......................................................................................... 14</w:t>
+      </w:r>
+    </w:p>
+    <w:p>
+      <w:pPr>
+        <w:pBdr>
+          <w:top w:val="none" w:color="000000" w:sz="0" w:space="0"/>
+          <w:left w:val="none" w:color="000000" w:sz="0" w:space="0"/>
+          <w:bottom w:val="none" w:color="000000" w:sz="0" w:space="0"/>
+          <w:right w:val="none" w:color="000000" w:sz="0" w:space="0"/>
+        </w:pBdr>
+        <w:spacing w:line="240" w:lineRule="auto"/>
+        <w:ind w:left="708" w:leftChars="0" w:right="0" w:firstLine="708" w:firstLineChars="0"/>
+        <w:rPr>
+          <w:rFonts w:hint="default" w:ascii="Times New Roman" w:hAnsi="Times New Roman" w:eastAsia="Times New Roman" w:cs="Times New Roman"/>
+          <w:b w:val="0"/>
+          <w:bCs w:val="0"/>
+          <w:i w:val="0"/>
+          <w:iCs w:val="0"/>
+          <w:sz w:val="22"/>
+          <w:szCs w:val="22"/>
+        </w:rPr>
+      </w:pPr>
+      <w:r>
+        <w:rPr>
+          <w:rFonts w:hint="default" w:ascii="Times New Roman" w:hAnsi="Times New Roman" w:eastAsia="Times New Roman" w:cs="Times New Roman"/>
+          <w:b w:val="0"/>
+          <w:bCs w:val="0"/>
+          <w:i w:val="0"/>
+          <w:iCs w:val="0"/>
+          <w:sz w:val="22"/>
+          <w:szCs w:val="22"/>
+        </w:rPr>
+        <w:t>4.6.3 Streamlit Interface .......................................................................................... 15 - 16</w:t>
+      </w:r>
+    </w:p>
+    <w:p>
+      <w:pPr>
+        <w:pBdr>
+          <w:top w:val="none" w:color="000000" w:sz="0" w:space="0"/>
+          <w:left w:val="none" w:color="000000" w:sz="0" w:space="0"/>
+          <w:bottom w:val="none" w:color="000000" w:sz="0" w:space="0"/>
+          <w:right w:val="none" w:color="000000" w:sz="0" w:space="0"/>
+        </w:pBdr>
+        <w:spacing w:line="240" w:lineRule="auto"/>
+        <w:ind w:left="0" w:right="0" w:firstLine="0"/>
+        <w:rPr>
+          <w:rFonts w:hint="default" w:ascii="Times New Roman" w:hAnsi="Times New Roman" w:eastAsia="Times New Roman" w:cs="Times New Roman"/>
+          <w:b w:val="0"/>
+          <w:bCs w:val="0"/>
+          <w:i w:val="0"/>
+          <w:iCs w:val="0"/>
+          <w:sz w:val="22"/>
+          <w:szCs w:val="22"/>
+        </w:rPr>
+      </w:pPr>
+      <w:r>
+        <w:rPr>
+          <w:rFonts w:hint="default" w:ascii="Times New Roman" w:hAnsi="Times New Roman" w:eastAsia="Times New Roman" w:cs="Times New Roman"/>
+          <w:b/>
+          <w:bCs/>
+          <w:i w:val="0"/>
+          <w:iCs w:val="0"/>
+          <w:sz w:val="22"/>
+          <w:szCs w:val="22"/>
+        </w:rPr>
+        <w:t>5. Results and Evaluation</w:t>
+      </w:r>
+      <w:r>
+        <w:rPr>
+          <w:rFonts w:hint="default" w:ascii="Times New Roman" w:hAnsi="Times New Roman" w:eastAsia="Times New Roman" w:cs="Times New Roman"/>
+          <w:b w:val="0"/>
+          <w:bCs w:val="0"/>
+          <w:i w:val="0"/>
+          <w:iCs w:val="0"/>
+          <w:sz w:val="22"/>
+          <w:szCs w:val="22"/>
+        </w:rPr>
+        <w:t xml:space="preserve"> ...................................................................................................................... 17</w:t>
+      </w:r>
+    </w:p>
+    <w:p>
+      <w:pPr>
+        <w:pBdr>
+          <w:top w:val="none" w:color="000000" w:sz="0" w:space="0"/>
+          <w:left w:val="none" w:color="000000" w:sz="0" w:space="0"/>
+          <w:bottom w:val="none" w:color="000000" w:sz="0" w:space="0"/>
+          <w:right w:val="none" w:color="000000" w:sz="0" w:space="0"/>
+        </w:pBdr>
+        <w:spacing w:line="240" w:lineRule="auto"/>
+        <w:ind w:left="0" w:right="0" w:firstLine="708" w:firstLineChars="0"/>
+        <w:rPr>
+          <w:rFonts w:hint="default" w:ascii="Times New Roman" w:hAnsi="Times New Roman" w:eastAsia="Times New Roman" w:cs="Times New Roman"/>
+          <w:b w:val="0"/>
+          <w:bCs w:val="0"/>
+          <w:i w:val="0"/>
+          <w:iCs w:val="0"/>
+          <w:sz w:val="22"/>
+          <w:szCs w:val="22"/>
+        </w:rPr>
+      </w:pPr>
+      <w:r>
+        <w:rPr>
+          <w:rFonts w:hint="default" w:ascii="Times New Roman" w:hAnsi="Times New Roman" w:eastAsia="Times New Roman" w:cs="Times New Roman"/>
+          <w:b w:val="0"/>
+          <w:bCs w:val="0"/>
+          <w:i w:val="0"/>
+          <w:iCs w:val="0"/>
+          <w:sz w:val="22"/>
+          <w:szCs w:val="22"/>
+        </w:rPr>
+        <w:t>5.1 Sentiment Analysis Results ................................................................................................... 17</w:t>
+      </w:r>
+    </w:p>
+    <w:p>
+      <w:pPr>
+        <w:pBdr>
+          <w:top w:val="none" w:color="000000" w:sz="0" w:space="0"/>
+          <w:left w:val="none" w:color="000000" w:sz="0" w:space="0"/>
+          <w:bottom w:val="none" w:color="000000" w:sz="0" w:space="0"/>
+          <w:right w:val="none" w:color="000000" w:sz="0" w:space="0"/>
+        </w:pBdr>
+        <w:spacing w:line="240" w:lineRule="auto"/>
+        <w:ind w:left="708" w:leftChars="0" w:right="0" w:firstLine="708" w:firstLineChars="0"/>
+        <w:rPr>
+          <w:rFonts w:hint="default" w:ascii="Times New Roman" w:hAnsi="Times New Roman" w:eastAsia="Times New Roman" w:cs="Times New Roman"/>
+          <w:b w:val="0"/>
+          <w:bCs w:val="0"/>
+          <w:i w:val="0"/>
+          <w:iCs w:val="0"/>
+          <w:sz w:val="22"/>
+          <w:szCs w:val="22"/>
+        </w:rPr>
+      </w:pPr>
+      <w:r>
+        <w:rPr>
+          <w:rFonts w:hint="default" w:ascii="Times New Roman" w:hAnsi="Times New Roman" w:eastAsia="Times New Roman" w:cs="Times New Roman"/>
+          <w:b w:val="0"/>
+          <w:bCs w:val="0"/>
+          <w:i w:val="0"/>
+          <w:iCs w:val="0"/>
+          <w:sz w:val="22"/>
+          <w:szCs w:val="22"/>
+        </w:rPr>
+        <w:t>5.1.1 Output Quality ....................................................................................................... 17</w:t>
+      </w:r>
+    </w:p>
+    <w:p>
+      <w:pPr>
+        <w:pBdr>
+          <w:top w:val="none" w:color="000000" w:sz="0" w:space="0"/>
+          <w:left w:val="none" w:color="000000" w:sz="0" w:space="0"/>
+          <w:bottom w:val="none" w:color="000000" w:sz="0" w:space="0"/>
+          <w:right w:val="none" w:color="000000" w:sz="0" w:space="0"/>
+        </w:pBdr>
+        <w:spacing w:line="240" w:lineRule="auto"/>
+        <w:ind w:left="708" w:leftChars="0" w:right="0" w:firstLine="708" w:firstLineChars="0"/>
+        <w:rPr>
+          <w:rFonts w:hint="default" w:ascii="Times New Roman" w:hAnsi="Times New Roman" w:eastAsia="Times New Roman" w:cs="Times New Roman"/>
+          <w:b w:val="0"/>
+          <w:bCs w:val="0"/>
+          <w:i w:val="0"/>
+          <w:iCs w:val="0"/>
+          <w:sz w:val="22"/>
+          <w:szCs w:val="22"/>
+        </w:rPr>
+      </w:pPr>
+      <w:r>
+        <w:rPr>
+          <w:rFonts w:hint="default" w:ascii="Times New Roman" w:hAnsi="Times New Roman" w:eastAsia="Times New Roman" w:cs="Times New Roman"/>
+          <w:b w:val="0"/>
+          <w:bCs w:val="0"/>
+          <w:i w:val="0"/>
+          <w:iCs w:val="0"/>
+          <w:sz w:val="22"/>
+          <w:szCs w:val="22"/>
+        </w:rPr>
+        <w:t>5.1.2 Evaluation .............................................................................................................. 17</w:t>
+      </w:r>
+    </w:p>
+    <w:p>
+      <w:pPr>
+        <w:pBdr>
+          <w:top w:val="none" w:color="000000" w:sz="0" w:space="0"/>
+          <w:left w:val="none" w:color="000000" w:sz="0" w:space="0"/>
+          <w:bottom w:val="none" w:color="000000" w:sz="0" w:space="0"/>
+          <w:right w:val="none" w:color="000000" w:sz="0" w:space="0"/>
+        </w:pBdr>
+        <w:spacing w:line="240" w:lineRule="auto"/>
+        <w:ind w:left="0" w:right="0" w:firstLine="708" w:firstLineChars="0"/>
+        <w:rPr>
+          <w:rFonts w:hint="default" w:ascii="Times New Roman" w:hAnsi="Times New Roman" w:eastAsia="Times New Roman" w:cs="Times New Roman"/>
+          <w:b w:val="0"/>
+          <w:bCs w:val="0"/>
+          <w:i w:val="0"/>
+          <w:iCs w:val="0"/>
+          <w:sz w:val="22"/>
+          <w:szCs w:val="22"/>
+        </w:rPr>
+      </w:pPr>
+      <w:r>
+        <w:rPr>
+          <w:rFonts w:hint="default" w:ascii="Times New Roman" w:hAnsi="Times New Roman" w:eastAsia="Times New Roman" w:cs="Times New Roman"/>
+          <w:b w:val="0"/>
+          <w:bCs w:val="0"/>
+          <w:i w:val="0"/>
+          <w:iCs w:val="0"/>
+          <w:sz w:val="22"/>
+          <w:szCs w:val="22"/>
+        </w:rPr>
+        <w:t>5.2 Summarization Results .......................................................................................................... 18</w:t>
+      </w:r>
+    </w:p>
+    <w:p>
+      <w:pPr>
+        <w:pBdr>
+          <w:top w:val="none" w:color="000000" w:sz="0" w:space="0"/>
+          <w:left w:val="none" w:color="000000" w:sz="0" w:space="0"/>
+          <w:bottom w:val="none" w:color="000000" w:sz="0" w:space="0"/>
+          <w:right w:val="none" w:color="000000" w:sz="0" w:space="0"/>
+        </w:pBdr>
+        <w:spacing w:line="240" w:lineRule="auto"/>
+        <w:ind w:left="0" w:right="0" w:firstLine="708" w:firstLineChars="0"/>
+        <w:rPr>
+          <w:rFonts w:hint="default" w:ascii="Times New Roman" w:hAnsi="Times New Roman" w:eastAsia="Times New Roman" w:cs="Times New Roman"/>
+          <w:b w:val="0"/>
+          <w:bCs w:val="0"/>
+          <w:i w:val="0"/>
+          <w:iCs w:val="0"/>
+          <w:sz w:val="22"/>
+          <w:szCs w:val="22"/>
+        </w:rPr>
+      </w:pPr>
+      <w:r>
+        <w:rPr>
+          <w:rFonts w:hint="default" w:ascii="Times New Roman" w:hAnsi="Times New Roman" w:eastAsia="Times New Roman" w:cs="Times New Roman"/>
+          <w:b w:val="0"/>
+          <w:bCs w:val="0"/>
+          <w:i w:val="0"/>
+          <w:iCs w:val="0"/>
+          <w:sz w:val="22"/>
+          <w:szCs w:val="22"/>
+        </w:rPr>
+        <w:t>5.3 Semantic Search Evaluation (Sentence-BERT + ChromaDB) .............................................. 18</w:t>
+      </w:r>
+    </w:p>
+    <w:p>
+      <w:pPr>
+        <w:pBdr>
+          <w:top w:val="none" w:color="000000" w:sz="0" w:space="0"/>
+          <w:left w:val="none" w:color="000000" w:sz="0" w:space="0"/>
+          <w:bottom w:val="none" w:color="000000" w:sz="0" w:space="0"/>
+          <w:right w:val="none" w:color="000000" w:sz="0" w:space="0"/>
+        </w:pBdr>
+        <w:spacing w:line="240" w:lineRule="auto"/>
+        <w:ind w:left="0" w:right="0" w:firstLine="708" w:firstLineChars="0"/>
+        <w:rPr>
+          <w:rFonts w:hint="default" w:ascii="Times New Roman" w:hAnsi="Times New Roman" w:eastAsia="Times New Roman" w:cs="Times New Roman"/>
+          <w:b w:val="0"/>
+          <w:bCs w:val="0"/>
+          <w:i w:val="0"/>
+          <w:iCs w:val="0"/>
+          <w:sz w:val="22"/>
+          <w:szCs w:val="22"/>
+        </w:rPr>
+      </w:pPr>
+      <w:r>
+        <w:rPr>
+          <w:rFonts w:hint="default" w:ascii="Times New Roman" w:hAnsi="Times New Roman" w:eastAsia="Times New Roman" w:cs="Times New Roman"/>
+          <w:b w:val="0"/>
+          <w:bCs w:val="0"/>
+          <w:i w:val="0"/>
+          <w:iCs w:val="0"/>
+          <w:sz w:val="22"/>
+          <w:szCs w:val="22"/>
+        </w:rPr>
+        <w:t>5.4 Image Captioning Results (BLIP Model) .............................................................................. 19</w:t>
+      </w:r>
+    </w:p>
+    <w:p>
+      <w:pPr>
+        <w:pBdr>
+          <w:top w:val="none" w:color="000000" w:sz="0" w:space="0"/>
+          <w:left w:val="none" w:color="000000" w:sz="0" w:space="0"/>
+          <w:bottom w:val="none" w:color="000000" w:sz="0" w:space="0"/>
+          <w:right w:val="none" w:color="000000" w:sz="0" w:space="0"/>
+        </w:pBdr>
+        <w:spacing w:line="240" w:lineRule="auto"/>
+        <w:ind w:left="0" w:right="0" w:firstLine="708" w:firstLineChars="0"/>
+        <w:rPr>
+          <w:rFonts w:hint="default" w:ascii="Times New Roman" w:hAnsi="Times New Roman" w:eastAsia="Times New Roman" w:cs="Times New Roman"/>
+          <w:b w:val="0"/>
+          <w:bCs w:val="0"/>
+          <w:i w:val="0"/>
+          <w:iCs w:val="0"/>
+          <w:sz w:val="22"/>
+          <w:szCs w:val="22"/>
+        </w:rPr>
+      </w:pPr>
+      <w:r>
+        <w:rPr>
+          <w:rFonts w:hint="default" w:ascii="Times New Roman" w:hAnsi="Times New Roman" w:eastAsia="Times New Roman" w:cs="Times New Roman"/>
+          <w:b w:val="0"/>
+          <w:bCs w:val="0"/>
+          <w:i w:val="0"/>
+          <w:iCs w:val="0"/>
+          <w:sz w:val="22"/>
+          <w:szCs w:val="22"/>
+        </w:rPr>
+        <w:t>5.5 Vector Similarity Analysis .................................................................................................... 19</w:t>
+      </w:r>
+    </w:p>
+    <w:p>
+      <w:pPr>
+        <w:pBdr>
+          <w:top w:val="none" w:color="000000" w:sz="0" w:space="0"/>
+          <w:left w:val="none" w:color="000000" w:sz="0" w:space="0"/>
+          <w:bottom w:val="none" w:color="000000" w:sz="0" w:space="0"/>
+          <w:right w:val="none" w:color="000000" w:sz="0" w:space="0"/>
+        </w:pBdr>
+        <w:spacing w:line="240" w:lineRule="auto"/>
+        <w:ind w:left="0" w:right="0" w:firstLine="708" w:firstLineChars="0"/>
+        <w:rPr>
+          <w:rFonts w:hint="default" w:ascii="Times New Roman" w:hAnsi="Times New Roman" w:eastAsia="Times New Roman" w:cs="Times New Roman"/>
+          <w:b w:val="0"/>
+          <w:bCs w:val="0"/>
+          <w:i w:val="0"/>
+          <w:iCs w:val="0"/>
+          <w:sz w:val="22"/>
+          <w:szCs w:val="22"/>
+        </w:rPr>
+      </w:pPr>
+      <w:r>
+        <w:rPr>
+          <w:rFonts w:hint="default" w:ascii="Times New Roman" w:hAnsi="Times New Roman" w:eastAsia="Times New Roman" w:cs="Times New Roman"/>
+          <w:b w:val="0"/>
+          <w:bCs w:val="0"/>
+          <w:i w:val="0"/>
+          <w:iCs w:val="0"/>
+          <w:sz w:val="22"/>
+          <w:szCs w:val="22"/>
+        </w:rPr>
+        <w:t>5.6 Summary of Evaluation ........................................................................................................ 20</w:t>
+      </w:r>
+    </w:p>
+    <w:p>
+      <w:pPr>
+        <w:pBdr>
+          <w:top w:val="none" w:color="000000" w:sz="0" w:space="0"/>
+          <w:left w:val="none" w:color="000000" w:sz="0" w:space="0"/>
+          <w:bottom w:val="none" w:color="000000" w:sz="0" w:space="0"/>
+          <w:right w:val="none" w:color="000000" w:sz="0" w:space="0"/>
+        </w:pBdr>
+        <w:spacing w:line="240" w:lineRule="auto"/>
+        <w:ind w:left="0" w:right="0" w:firstLine="0"/>
+        <w:rPr>
+          <w:rFonts w:hint="default" w:ascii="Times New Roman" w:hAnsi="Times New Roman" w:eastAsia="Times New Roman" w:cs="Times New Roman"/>
+          <w:b w:val="0"/>
+          <w:bCs w:val="0"/>
+          <w:i w:val="0"/>
+          <w:iCs w:val="0"/>
+          <w:sz w:val="22"/>
+          <w:szCs w:val="22"/>
+        </w:rPr>
+      </w:pPr>
+      <w:r>
+        <w:rPr>
+          <w:rFonts w:hint="default" w:ascii="Times New Roman" w:hAnsi="Times New Roman" w:eastAsia="Times New Roman" w:cs="Times New Roman"/>
+          <w:b/>
+          <w:bCs/>
+          <w:i w:val="0"/>
+          <w:iCs w:val="0"/>
+          <w:sz w:val="22"/>
+          <w:szCs w:val="22"/>
+        </w:rPr>
+        <w:t>6. Discussion</w:t>
+      </w:r>
+      <w:r>
+        <w:rPr>
+          <w:rFonts w:hint="default" w:ascii="Times New Roman" w:hAnsi="Times New Roman" w:eastAsia="Times New Roman" w:cs="Times New Roman"/>
+          <w:b w:val="0"/>
+          <w:bCs w:val="0"/>
+          <w:i w:val="0"/>
+          <w:iCs w:val="0"/>
+          <w:sz w:val="22"/>
+          <w:szCs w:val="22"/>
+        </w:rPr>
+        <w:t xml:space="preserve"> ........................................................................................................................................... 20</w:t>
+      </w:r>
+    </w:p>
+    <w:p>
+      <w:pPr>
+        <w:pBdr>
+          <w:top w:val="none" w:color="000000" w:sz="0" w:space="0"/>
+          <w:left w:val="none" w:color="000000" w:sz="0" w:space="0"/>
+          <w:bottom w:val="none" w:color="000000" w:sz="0" w:space="0"/>
+          <w:right w:val="none" w:color="000000" w:sz="0" w:space="0"/>
+        </w:pBdr>
+        <w:spacing w:line="240" w:lineRule="auto"/>
+        <w:ind w:left="0" w:right="0" w:firstLine="708" w:firstLineChars="0"/>
+        <w:rPr>
+          <w:rFonts w:hint="default" w:ascii="Times New Roman" w:hAnsi="Times New Roman" w:eastAsia="Times New Roman" w:cs="Times New Roman"/>
+          <w:b w:val="0"/>
+          <w:bCs w:val="0"/>
+          <w:i w:val="0"/>
+          <w:iCs w:val="0"/>
+          <w:sz w:val="22"/>
+          <w:szCs w:val="22"/>
+        </w:rPr>
+      </w:pPr>
+      <w:r>
+        <w:rPr>
+          <w:rFonts w:hint="default" w:ascii="Times New Roman" w:hAnsi="Times New Roman" w:eastAsia="Times New Roman" w:cs="Times New Roman"/>
+          <w:b w:val="0"/>
+          <w:bCs w:val="0"/>
+          <w:i w:val="0"/>
+          <w:iCs w:val="0"/>
+          <w:sz w:val="22"/>
+          <w:szCs w:val="22"/>
+        </w:rPr>
+        <w:t>6.1 Challenges ............................................................................................................................ 20</w:t>
+      </w:r>
+    </w:p>
+    <w:p>
+      <w:pPr>
+        <w:pBdr>
+          <w:top w:val="none" w:color="000000" w:sz="0" w:space="0"/>
+          <w:left w:val="none" w:color="000000" w:sz="0" w:space="0"/>
+          <w:bottom w:val="none" w:color="000000" w:sz="0" w:space="0"/>
+          <w:right w:val="none" w:color="000000" w:sz="0" w:space="0"/>
+        </w:pBdr>
+        <w:spacing w:line="240" w:lineRule="auto"/>
+        <w:ind w:left="0" w:right="0" w:firstLine="708" w:firstLineChars="0"/>
+        <w:rPr>
+          <w:rFonts w:hint="default" w:ascii="Times New Roman" w:hAnsi="Times New Roman" w:eastAsia="Times New Roman" w:cs="Times New Roman"/>
+          <w:b w:val="0"/>
+          <w:bCs w:val="0"/>
+          <w:i w:val="0"/>
+          <w:iCs w:val="0"/>
+          <w:sz w:val="22"/>
+          <w:szCs w:val="22"/>
+        </w:rPr>
+      </w:pPr>
+      <w:r>
+        <w:rPr>
+          <w:rFonts w:hint="default" w:ascii="Times New Roman" w:hAnsi="Times New Roman" w:eastAsia="Times New Roman" w:cs="Times New Roman"/>
+          <w:b w:val="0"/>
+          <w:bCs w:val="0"/>
+          <w:i w:val="0"/>
+          <w:iCs w:val="0"/>
+          <w:sz w:val="22"/>
+          <w:szCs w:val="22"/>
+        </w:rPr>
+        <w:t>6.2 How Docker Helped ............................................................................................................ 20</w:t>
+      </w:r>
+    </w:p>
+    <w:p>
+      <w:pPr>
+        <w:pBdr>
+          <w:top w:val="none" w:color="000000" w:sz="0" w:space="0"/>
+          <w:left w:val="none" w:color="000000" w:sz="0" w:space="0"/>
+          <w:bottom w:val="none" w:color="000000" w:sz="0" w:space="0"/>
+          <w:right w:val="none" w:color="000000" w:sz="0" w:space="0"/>
+        </w:pBdr>
+        <w:spacing w:line="240" w:lineRule="auto"/>
+        <w:ind w:left="0" w:right="0" w:firstLine="708" w:firstLineChars="0"/>
+        <w:rPr>
+          <w:rFonts w:hint="default" w:ascii="Times New Roman" w:hAnsi="Times New Roman" w:eastAsia="Times New Roman" w:cs="Times New Roman"/>
+          <w:b w:val="0"/>
+          <w:bCs w:val="0"/>
+          <w:i w:val="0"/>
+          <w:iCs w:val="0"/>
+          <w:sz w:val="22"/>
+          <w:szCs w:val="22"/>
+        </w:rPr>
+      </w:pPr>
+      <w:r>
+        <w:rPr>
+          <w:rFonts w:hint="default" w:ascii="Times New Roman" w:hAnsi="Times New Roman" w:eastAsia="Times New Roman" w:cs="Times New Roman"/>
+          <w:b w:val="0"/>
+          <w:bCs w:val="0"/>
+          <w:i w:val="0"/>
+          <w:iCs w:val="0"/>
+          <w:sz w:val="22"/>
+          <w:szCs w:val="22"/>
+        </w:rPr>
+        <w:t>6.3 Issues &amp; Solutions ............................................................................................................... 21</w:t>
+      </w:r>
+    </w:p>
+    <w:p>
+      <w:pPr>
+        <w:pBdr>
+          <w:top w:val="none" w:color="000000" w:sz="0" w:space="0"/>
+          <w:left w:val="none" w:color="000000" w:sz="0" w:space="0"/>
+          <w:bottom w:val="none" w:color="000000" w:sz="0" w:space="0"/>
+          <w:right w:val="none" w:color="000000" w:sz="0" w:space="0"/>
+        </w:pBdr>
+        <w:spacing w:line="240" w:lineRule="auto"/>
+        <w:ind w:left="0" w:right="0" w:firstLine="0"/>
+        <w:rPr>
+          <w:rFonts w:hint="default" w:ascii="Times New Roman" w:hAnsi="Times New Roman" w:eastAsia="Times New Roman" w:cs="Times New Roman"/>
+          <w:b w:val="0"/>
+          <w:bCs w:val="0"/>
+          <w:i w:val="0"/>
+          <w:iCs w:val="0"/>
+          <w:sz w:val="22"/>
+          <w:szCs w:val="22"/>
+        </w:rPr>
+      </w:pPr>
+      <w:r>
+        <w:rPr>
+          <w:rFonts w:hint="default" w:ascii="Times New Roman" w:hAnsi="Times New Roman" w:eastAsia="Times New Roman" w:cs="Times New Roman"/>
+          <w:b/>
+          <w:bCs/>
+          <w:i w:val="0"/>
+          <w:iCs w:val="0"/>
+          <w:sz w:val="22"/>
+          <w:szCs w:val="22"/>
+        </w:rPr>
+        <w:t>7. Conclusion &amp; Future Work</w:t>
+      </w:r>
+      <w:r>
+        <w:rPr>
+          <w:rFonts w:hint="default" w:ascii="Times New Roman" w:hAnsi="Times New Roman" w:eastAsia="Times New Roman" w:cs="Times New Roman"/>
+          <w:b w:val="0"/>
+          <w:bCs w:val="0"/>
+          <w:i w:val="0"/>
+          <w:iCs w:val="0"/>
+          <w:sz w:val="22"/>
+          <w:szCs w:val="22"/>
+        </w:rPr>
+        <w:t xml:space="preserve"> ............................................................................................................ 21</w:t>
+      </w:r>
+    </w:p>
+    <w:p>
+      <w:pPr>
+        <w:pBdr>
+          <w:top w:val="none" w:color="000000" w:sz="0" w:space="0"/>
+          <w:left w:val="none" w:color="000000" w:sz="0" w:space="0"/>
+          <w:bottom w:val="none" w:color="000000" w:sz="0" w:space="0"/>
+          <w:right w:val="none" w:color="000000" w:sz="0" w:space="0"/>
+        </w:pBdr>
+        <w:spacing w:line="240" w:lineRule="auto"/>
+        <w:ind w:left="0" w:right="0" w:firstLine="708" w:firstLineChars="0"/>
+        <w:rPr>
+          <w:rFonts w:hint="default" w:ascii="Times New Roman" w:hAnsi="Times New Roman" w:eastAsia="Times New Roman" w:cs="Times New Roman"/>
+          <w:b w:val="0"/>
+          <w:bCs w:val="0"/>
+          <w:i w:val="0"/>
+          <w:iCs w:val="0"/>
+          <w:sz w:val="22"/>
+          <w:szCs w:val="22"/>
+        </w:rPr>
+      </w:pPr>
+      <w:r>
+        <w:rPr>
+          <w:rFonts w:hint="default" w:ascii="Times New Roman" w:hAnsi="Times New Roman" w:eastAsia="Times New Roman" w:cs="Times New Roman"/>
+          <w:b w:val="0"/>
+          <w:bCs w:val="0"/>
+          <w:i w:val="0"/>
+          <w:iCs w:val="0"/>
+          <w:sz w:val="22"/>
+          <w:szCs w:val="22"/>
+        </w:rPr>
+        <w:t>7.1 Conclusion .......................................................................................................................... 21</w:t>
+      </w:r>
+    </w:p>
+    <w:p>
+      <w:pPr>
+        <w:pBdr>
+          <w:top w:val="none" w:color="000000" w:sz="0" w:space="0"/>
+          <w:left w:val="none" w:color="000000" w:sz="0" w:space="0"/>
+          <w:bottom w:val="none" w:color="000000" w:sz="0" w:space="0"/>
+          <w:right w:val="none" w:color="000000" w:sz="0" w:space="0"/>
+        </w:pBdr>
+        <w:spacing w:line="240" w:lineRule="auto"/>
+        <w:ind w:left="0" w:right="0" w:firstLine="708" w:firstLineChars="0"/>
+        <w:rPr>
+          <w:rFonts w:hint="default" w:ascii="Times New Roman" w:hAnsi="Times New Roman" w:eastAsia="Times New Roman" w:cs="Times New Roman"/>
+          <w:b w:val="0"/>
+          <w:bCs w:val="0"/>
+          <w:i w:val="0"/>
+          <w:iCs w:val="0"/>
+          <w:sz w:val="22"/>
+          <w:szCs w:val="22"/>
+        </w:rPr>
+      </w:pPr>
+      <w:r>
+        <w:rPr>
+          <w:rFonts w:hint="default" w:ascii="Times New Roman" w:hAnsi="Times New Roman" w:eastAsia="Times New Roman" w:cs="Times New Roman"/>
+          <w:b w:val="0"/>
+          <w:bCs w:val="0"/>
+          <w:i w:val="0"/>
+          <w:iCs w:val="0"/>
+          <w:sz w:val="22"/>
+          <w:szCs w:val="22"/>
+        </w:rPr>
+        <w:t>7.2 Future Work ....................................................................................................................... 22</w:t>
+      </w:r>
+    </w:p>
+    <w:p>
+      <w:pPr>
+        <w:pBdr>
+          <w:top w:val="none" w:color="000000" w:sz="0" w:space="0"/>
+          <w:left w:val="none" w:color="000000" w:sz="0" w:space="0"/>
+          <w:bottom w:val="none" w:color="000000" w:sz="0" w:space="0"/>
+          <w:right w:val="none" w:color="000000" w:sz="0" w:space="0"/>
+        </w:pBdr>
+        <w:spacing w:line="240" w:lineRule="auto"/>
+        <w:ind w:left="0" w:right="0" w:firstLine="0"/>
+        <w:rPr>
+          <w:rFonts w:hint="default" w:ascii="Times New Roman" w:hAnsi="Times New Roman" w:eastAsia="Times New Roman" w:cs="Times New Roman"/>
+          <w:b w:val="0"/>
+          <w:bCs w:val="0"/>
+          <w:i w:val="0"/>
+          <w:iCs w:val="0"/>
+          <w:sz w:val="22"/>
+          <w:szCs w:val="22"/>
+        </w:rPr>
+      </w:pPr>
+      <w:r>
+        <w:rPr>
+          <w:rFonts w:hint="default" w:ascii="Times New Roman" w:hAnsi="Times New Roman" w:eastAsia="Times New Roman" w:cs="Times New Roman"/>
+          <w:b/>
+          <w:bCs/>
+          <w:i w:val="0"/>
+          <w:iCs w:val="0"/>
+          <w:sz w:val="22"/>
+          <w:szCs w:val="22"/>
+        </w:rPr>
+        <w:t>References</w:t>
+      </w:r>
+      <w:r>
+        <w:rPr>
+          <w:rFonts w:hint="default" w:ascii="Times New Roman" w:hAnsi="Times New Roman" w:eastAsia="Times New Roman" w:cs="Times New Roman"/>
+          <w:b w:val="0"/>
+          <w:bCs w:val="0"/>
+          <w:i w:val="0"/>
+          <w:iCs w:val="0"/>
+          <w:sz w:val="22"/>
+          <w:szCs w:val="22"/>
+        </w:rPr>
+        <w:t xml:space="preserve"> ..................................................................................................................................... 22 - 23</w:t>
+      </w:r>
+    </w:p>
+    <w:p>
+      <w:pPr>
+        <w:pBdr>
+          <w:top w:val="none" w:color="000000" w:sz="0" w:space="0"/>
+          <w:left w:val="none" w:color="000000" w:sz="0" w:space="0"/>
+          <w:bottom w:val="none" w:color="000000" w:sz="0" w:space="0"/>
+          <w:right w:val="none" w:color="000000" w:sz="0" w:space="0"/>
+        </w:pBdr>
+        <w:ind w:left="0" w:right="0" w:firstLine="0"/>
+        <w:rPr>
+          <w:rFonts w:ascii="Times New Roman" w:hAnsi="Times New Roman" w:eastAsia="Times New Roman" w:cs="Times New Roman"/>
+          <w:b/>
+          <w:bCs/>
+          <w:i/>
+          <w:iCs/>
+          <w:sz w:val="32"/>
+          <w:szCs w:val="32"/>
+        </w:rPr>
+      </w:pPr>
+    </w:p>
+    <w:p>
+      <w:pPr>
+        <w:pBdr>
+          <w:top w:val="none" w:color="000000" w:sz="0" w:space="0"/>
+          <w:left w:val="none" w:color="000000" w:sz="0" w:space="0"/>
+          <w:bottom w:val="none" w:color="000000" w:sz="0" w:space="0"/>
+          <w:right w:val="none" w:color="000000" w:sz="0" w:space="0"/>
+        </w:pBdr>
+        <w:ind w:left="0" w:right="0" w:firstLine="0"/>
+        <w:rPr>
+          <w:rFonts w:ascii="Times New Roman" w:hAnsi="Times New Roman" w:eastAsia="Times New Roman" w:cs="Times New Roman"/>
+          <w:b/>
+          <w:bCs/>
+          <w:i/>
+          <w:iCs/>
+          <w:sz w:val="32"/>
+          <w:szCs w:val="32"/>
+        </w:rPr>
+      </w:pPr>
+    </w:p>
+    <w:p>
+      <w:pPr>
+        <w:pBdr>
+          <w:top w:val="none" w:color="000000" w:sz="0" w:space="0"/>
+          <w:left w:val="none" w:color="000000" w:sz="0" w:space="0"/>
+          <w:bottom w:val="none" w:color="000000" w:sz="0" w:space="0"/>
+          <w:right w:val="none" w:color="000000" w:sz="0" w:space="0"/>
+        </w:pBdr>
+        <w:ind w:left="0" w:right="0" w:firstLine="0"/>
+        <w:rPr>
+          <w:rFonts w:hint="default" w:ascii="Times New Roman" w:hAnsi="Times New Roman" w:eastAsia="Times New Roman" w:cs="Times New Roman"/>
+          <w:b/>
+          <w:bCs/>
+          <w:i/>
+          <w:iCs/>
+          <w:sz w:val="32"/>
+          <w:szCs w:val="32"/>
+          <w:lang w:val="en-US"/>
+        </w:rPr>
+      </w:pPr>
+    </w:p>
+    <w:p>
+      <w:pPr>
+        <w:pBdr>
+          <w:top w:val="none" w:color="000000" w:sz="0" w:space="0"/>
+          <w:left w:val="none" w:color="000000" w:sz="0" w:space="0"/>
+          <w:bottom w:val="none" w:color="000000" w:sz="0" w:space="0"/>
+          <w:right w:val="none" w:color="000000" w:sz="0" w:space="0"/>
+        </w:pBdr>
+        <w:ind w:left="0" w:right="0" w:firstLine="0"/>
+        <w:rPr>
+          <w:rFonts w:hint="default" w:ascii="Times New Roman" w:hAnsi="Times New Roman" w:eastAsia="Times New Roman" w:cs="Times New Roman"/>
+          <w:b/>
+          <w:bCs/>
+          <w:i/>
+          <w:iCs/>
+          <w:sz w:val="32"/>
+          <w:szCs w:val="32"/>
+          <w:lang w:val="en-US"/>
+        </w:rPr>
+      </w:pPr>
+    </w:p>
+    <w:p>
+      <w:pPr>
+        <w:pBdr>
+          <w:top w:val="none" w:color="000000" w:sz="0" w:space="0"/>
+          <w:left w:val="none" w:color="000000" w:sz="0" w:space="0"/>
+          <w:bottom w:val="none" w:color="000000" w:sz="0" w:space="0"/>
+          <w:right w:val="none" w:color="000000" w:sz="0" w:space="0"/>
+        </w:pBdr>
         <w:ind w:left="0" w:right="0" w:firstLine="0"/>
         <w:rPr>
           <w:rFonts w:ascii="Times New Roman" w:hAnsi="Times New Roman" w:eastAsia="Times New Roman" w:cs="Times New Roman"/>
@@ -980,8 +2859,6 @@
           <w:highlight w:val="none"/>
         </w:rPr>
       </w:pPr>
-      <w:bookmarkStart w:id="2" w:name="_GoBack"/>
-      <w:bookmarkEnd w:id="2"/>
       <w:r>
         <w:rPr>
           <w:rFonts w:ascii="Times New Roman" w:hAnsi="Times New Roman" w:eastAsia="Times New Roman" w:cs="Times New Roman"/>
@@ -1032,7 +2909,17 @@
           <w:color w:val="000000"/>
           <w:sz w:val="24"/>
         </w:rPr>
-        <w:t xml:space="preserve">, a fully containerized, multi-model Natural Language Processing (NLP) application that integrates deep learning models, vector search, and a modern web interface. The system supports </w:t>
+        <w:t xml:space="preserve">, a fully containerized, </w:t>
+      </w:r>
+      <w:bookmarkStart w:id="2" w:name="_GoBack"/>
+      <w:bookmarkEnd w:id="2"/>
+      <w:r>
+        <w:rPr>
+          <w:rFonts w:ascii="Times New Roman" w:hAnsi="Times New Roman" w:eastAsia="Times New Roman" w:cs="Times New Roman"/>
+          <w:color w:val="000000"/>
+          <w:sz w:val="24"/>
+        </w:rPr>
+        <w:t xml:space="preserve">multi-model Natural Language Processing (NLP) application that integrates deep learning models, vector search, and a modern web interface. The system supports </w:t>
       </w:r>
       <w:r>
         <w:rPr>
@@ -2138,12 +4025,6 @@
             <w:insideV w:val="none" w:color="000000" w:sz="4" w:space="0"/>
           </w:tblBorders>
           <w:shd w:val="clear" w:color="FFFFFF" w:fill="FFFFFF"/>
-          <w:tblCellMar>
-            <w:top w:w="0" w:type="dxa"/>
-            <w:left w:w="108" w:type="dxa"/>
-            <w:bottom w:w="0" w:type="dxa"/>
-            <w:right w:w="108" w:type="dxa"/>
-          </w:tblCellMar>
         </w:tblPrEx>
         <w:tc>
           <w:tcPr>
@@ -11708,6 +13589,7 @@
             <w:insideH w:val="none" w:color="auto" w:sz="0" w:space="0"/>
             <w:insideV w:val="none" w:color="auto" w:sz="0" w:space="0"/>
           </w:tblBorders>
+          <w:shd w:val="clear" w:color="auto" w:fill="auto"/>
           <w:tblCellMar>
             <w:top w:w="0" w:type="dxa"/>
             <w:left w:w="108" w:type="dxa"/>
@@ -11877,7 +13759,6 @@
             <w:insideH w:val="none" w:color="auto" w:sz="0" w:space="0"/>
             <w:insideV w:val="none" w:color="auto" w:sz="0" w:space="0"/>
           </w:tblBorders>
-          <w:shd w:val="clear" w:color="auto" w:fill="auto"/>
           <w:tblCellMar>
             <w:top w:w="0" w:type="dxa"/>
             <w:left w:w="108" w:type="dxa"/>
@@ -12041,7 +13922,6 @@
             <w:insideH w:val="none" w:color="auto" w:sz="0" w:space="0"/>
             <w:insideV w:val="none" w:color="auto" w:sz="0" w:space="0"/>
           </w:tblBorders>
-          <w:shd w:val="clear" w:color="auto" w:fill="auto"/>
           <w:tblCellMar>
             <w:top w:w="0" w:type="dxa"/>
             <w:left w:w="108" w:type="dxa"/>
@@ -18666,22 +20546,6 @@
                       <a:ln w="6350">
                         <a:noFill/>
                       </a:ln>
-                      <a:extLst>
-                        <a:ext uri="{909E8E84-426E-40DD-AFC4-6F175D3DCCD1}">
-                          <a14:hiddenFill xmlns:a14="http://schemas.microsoft.com/office/drawing/2010/main">
-                            <a:solidFill>
-                              <a:schemeClr val="lt1"/>
-                            </a:solidFill>
-                          </a14:hiddenFill>
-                        </a:ext>
-                        <a:ext uri="{91240B29-F687-4F45-9708-019B960494DF}">
-                          <a14:hiddenLine xmlns:a14="http://schemas.microsoft.com/office/drawing/2010/main" w="6350">
-                            <a:solidFill>
-                              <a:prstClr val="black"/>
-                            </a:solidFill>
-                          </a14:hiddenLine>
-                        </a:ext>
-                      </a:extLst>
                     </wps:spPr>
                     <wps:style>
                       <a:lnRef idx="0">
@@ -18732,7 +20596,7 @@
         </mc:Choice>
         <mc:Fallback>
           <w:pict>
-            <v:shape id="_x0000_s1026" o:spid="_x0000_s1026" o:spt="202" type="#_x0000_t202" style="position:absolute;left:0pt;margin-top:0pt;height:144pt;width:144pt;mso-position-horizontal:center;mso-position-horizontal-relative:margin;mso-wrap-style:none;z-index:251659264;mso-width-relative:page;mso-height-relative:page;" filled="f" stroked="f" coordsize="21600,21600" o:gfxdata="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">
+            <v:shape id="_x0000_s1026" o:spid="_x0000_s1026" o:spt="202" type="#_x0000_t202" style="position:absolute;left:0pt;margin-top:0pt;height:144pt;width:144pt;mso-position-horizontal:center;mso-position-horizontal-relative:margin;mso-wrap-style:none;z-index:251659264;mso-width-relative:page;mso-height-relative:page;" filled="f" stroked="f" coordsize="21600,21600" o:gfxdata="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">
               <v:fill on="f" focussize="0,0"/>
               <v:stroke on="f" weight="0.5pt"/>
               <v:imagedata o:title=""/>

</xml_diff>